<commit_message>
Update laravel nova to 3.32.0
</commit_message>
<xml_diff>
--- a/storage/app/template/Template_pengadaan.docx
+++ b/storage/app/template/Template_pengadaan.docx
@@ -35,14 +35,12 @@
                 <w:rFonts w:asciiTheme="minorHAnsi" w:hAnsiTheme="minorHAnsi" w:cstheme="minorHAnsi"/>
               </w:rPr>
             </w:pPr>
-            <w:proofErr w:type="spellStart"/>
             <w:r>
               <w:rPr>
                 <w:rFonts w:asciiTheme="minorHAnsi" w:hAnsiTheme="minorHAnsi" w:cstheme="minorHAnsi"/>
               </w:rPr>
               <w:t>Nomor</w:t>
             </w:r>
-            <w:proofErr w:type="spellEnd"/>
           </w:p>
         </w:tc>
         <w:tc>
@@ -79,21 +77,7 @@
               <w:rPr>
                 <w:rFonts w:asciiTheme="minorHAnsi" w:hAnsiTheme="minorHAnsi" w:cstheme="minorHAnsi"/>
               </w:rPr>
-              <w:t>${</w:t>
-            </w:r>
-            <w:proofErr w:type="spellStart"/>
-            <w:r>
-              <w:rPr>
-                <w:rFonts w:asciiTheme="minorHAnsi" w:hAnsiTheme="minorHAnsi" w:cstheme="minorHAnsi"/>
-              </w:rPr>
-              <w:t>no_permintaan</w:t>
-            </w:r>
-            <w:proofErr w:type="spellEnd"/>
-            <w:r>
-              <w:rPr>
-                <w:rFonts w:asciiTheme="minorHAnsi" w:hAnsiTheme="minorHAnsi" w:cstheme="minorHAnsi"/>
-              </w:rPr>
-              <w:t>}</w:t>
+              <w:t>${no_permintaan}</w:t>
             </w:r>
           </w:p>
         </w:tc>
@@ -114,39 +98,17 @@
               </w:rPr>
               <w:t xml:space="preserve">   </w:t>
             </w:r>
-            <w:proofErr w:type="spellStart"/>
-            <w:r>
-              <w:rPr>
-                <w:rFonts w:asciiTheme="minorHAnsi" w:hAnsiTheme="minorHAnsi" w:cstheme="minorHAnsi"/>
-              </w:rPr>
-              <w:t>Barabai</w:t>
-            </w:r>
-            <w:proofErr w:type="spellEnd"/>
-            <w:r>
-              <w:rPr>
-                <w:rFonts w:asciiTheme="minorHAnsi" w:hAnsiTheme="minorHAnsi" w:cstheme="minorHAnsi"/>
-              </w:rPr>
-              <w:t xml:space="preserve">, </w:t>
-            </w:r>
-            <w:r>
-              <w:rPr>
-                <w:rFonts w:asciiTheme="minorHAnsi" w:hAnsiTheme="minorHAnsi" w:cstheme="minorHAnsi"/>
-              </w:rPr>
-              <w:t>${</w:t>
-            </w:r>
-            <w:proofErr w:type="spellStart"/>
-            <w:r>
-              <w:rPr>
-                <w:rFonts w:asciiTheme="minorHAnsi" w:hAnsiTheme="minorHAnsi" w:cstheme="minorHAnsi"/>
-              </w:rPr>
-              <w:t>tgl_proses</w:t>
-            </w:r>
-            <w:proofErr w:type="spellEnd"/>
-            <w:r>
-              <w:rPr>
-                <w:rFonts w:asciiTheme="minorHAnsi" w:hAnsiTheme="minorHAnsi" w:cstheme="minorHAnsi"/>
-              </w:rPr>
-              <w:t>}</w:t>
+            <w:r>
+              <w:rPr>
+                <w:rFonts w:asciiTheme="minorHAnsi" w:hAnsiTheme="minorHAnsi" w:cstheme="minorHAnsi"/>
+              </w:rPr>
+              <w:t xml:space="preserve">Barabai, </w:t>
+            </w:r>
+            <w:r>
+              <w:rPr>
+                <w:rFonts w:asciiTheme="minorHAnsi" w:hAnsiTheme="minorHAnsi" w:cstheme="minorHAnsi"/>
+              </w:rPr>
+              <w:t>${tgl_proses}</w:t>
             </w:r>
           </w:p>
         </w:tc>
@@ -205,21 +167,7 @@
               <w:rPr>
                 <w:rFonts w:asciiTheme="minorHAnsi" w:hAnsiTheme="minorHAnsi" w:cstheme="minorHAnsi"/>
               </w:rPr>
-              <w:t>1 (</w:t>
-            </w:r>
-            <w:proofErr w:type="spellStart"/>
-            <w:r>
-              <w:rPr>
-                <w:rFonts w:asciiTheme="minorHAnsi" w:hAnsiTheme="minorHAnsi" w:cstheme="minorHAnsi"/>
-              </w:rPr>
-              <w:t>satu</w:t>
-            </w:r>
-            <w:proofErr w:type="spellEnd"/>
-            <w:r>
-              <w:rPr>
-                <w:rFonts w:asciiTheme="minorHAnsi" w:hAnsiTheme="minorHAnsi" w:cstheme="minorHAnsi"/>
-              </w:rPr>
-              <w:t>) set</w:t>
+              <w:t>1 (satu) set</w:t>
             </w:r>
           </w:p>
         </w:tc>
@@ -249,14 +197,12 @@
                 <w:rFonts w:asciiTheme="minorHAnsi" w:hAnsiTheme="minorHAnsi" w:cstheme="minorHAnsi"/>
               </w:rPr>
             </w:pPr>
-            <w:proofErr w:type="spellStart"/>
             <w:r>
               <w:rPr>
                 <w:rFonts w:asciiTheme="minorHAnsi" w:hAnsiTheme="minorHAnsi" w:cstheme="minorHAnsi"/>
               </w:rPr>
               <w:t>Perihal</w:t>
             </w:r>
-            <w:proofErr w:type="spellEnd"/>
           </w:p>
         </w:tc>
         <w:tc>
@@ -294,21 +240,7 @@
               <w:rPr>
                 <w:rFonts w:asciiTheme="minorHAnsi" w:hAnsiTheme="minorHAnsi" w:cstheme="minorHAnsi"/>
               </w:rPr>
-              <w:t>${</w:t>
-            </w:r>
-            <w:proofErr w:type="spellStart"/>
-            <w:r>
-              <w:rPr>
-                <w:rFonts w:asciiTheme="minorHAnsi" w:hAnsiTheme="minorHAnsi" w:cstheme="minorHAnsi"/>
-              </w:rPr>
-              <w:t>rincian</w:t>
-            </w:r>
-            <w:proofErr w:type="spellEnd"/>
-            <w:r>
-              <w:rPr>
-                <w:rFonts w:asciiTheme="minorHAnsi" w:hAnsiTheme="minorHAnsi" w:cstheme="minorHAnsi"/>
-              </w:rPr>
-              <w:t>}</w:t>
+              <w:t>${rincian}</w:t>
             </w:r>
           </w:p>
         </w:tc>
@@ -354,36 +286,12 @@
           <w:rFonts w:asciiTheme="minorHAnsi" w:hAnsiTheme="minorHAnsi" w:cstheme="minorHAnsi"/>
         </w:rPr>
       </w:pPr>
-      <w:proofErr w:type="spellStart"/>
       <w:r>
         <w:rPr>
           <w:rFonts w:asciiTheme="minorHAnsi" w:hAnsiTheme="minorHAnsi" w:cstheme="minorHAnsi"/>
         </w:rPr>
-        <w:t>Kepada</w:t>
+        <w:t>Kepada Yang Terhormat :</w:t>
       </w:r>
-      <w:proofErr w:type="spellEnd"/>
-      <w:r>
-        <w:rPr>
-          <w:rFonts w:asciiTheme="minorHAnsi" w:hAnsiTheme="minorHAnsi" w:cstheme="minorHAnsi"/>
-        </w:rPr>
-        <w:t xml:space="preserve"> Yang </w:t>
-      </w:r>
-      <w:proofErr w:type="spellStart"/>
-      <w:proofErr w:type="gramStart"/>
-      <w:r>
-        <w:rPr>
-          <w:rFonts w:asciiTheme="minorHAnsi" w:hAnsiTheme="minorHAnsi" w:cstheme="minorHAnsi"/>
-        </w:rPr>
-        <w:t>Terhormat</w:t>
-      </w:r>
-      <w:proofErr w:type="spellEnd"/>
-      <w:r>
-        <w:rPr>
-          <w:rFonts w:asciiTheme="minorHAnsi" w:hAnsiTheme="minorHAnsi" w:cstheme="minorHAnsi"/>
-        </w:rPr>
-        <w:t xml:space="preserve"> :</w:t>
-      </w:r>
-      <w:proofErr w:type="gramEnd"/>
     </w:p>
     <w:p>
       <w:pPr>
@@ -393,28 +301,12 @@
           <w:rFonts w:asciiTheme="minorHAnsi" w:hAnsiTheme="minorHAnsi" w:cstheme="minorHAnsi"/>
         </w:rPr>
       </w:pPr>
-      <w:proofErr w:type="spellStart"/>
       <w:r>
         <w:rPr>
           <w:rFonts w:asciiTheme="minorHAnsi" w:hAnsiTheme="minorHAnsi" w:cstheme="minorHAnsi"/>
         </w:rPr>
-        <w:t>Pejabat</w:t>
+        <w:t>Pejabat Pengadaan</w:t>
       </w:r>
-      <w:proofErr w:type="spellEnd"/>
-      <w:r>
-        <w:rPr>
-          <w:rFonts w:asciiTheme="minorHAnsi" w:hAnsiTheme="minorHAnsi" w:cstheme="minorHAnsi"/>
-        </w:rPr>
-        <w:t xml:space="preserve"> </w:t>
-      </w:r>
-      <w:proofErr w:type="spellStart"/>
-      <w:r>
-        <w:rPr>
-          <w:rFonts w:asciiTheme="minorHAnsi" w:hAnsiTheme="minorHAnsi" w:cstheme="minorHAnsi"/>
-        </w:rPr>
-        <w:t>Pengadaan</w:t>
-      </w:r>
-      <w:proofErr w:type="spellEnd"/>
     </w:p>
     <w:p>
       <w:pPr>
@@ -430,19 +322,11 @@
         </w:rPr>
         <w:t xml:space="preserve">BPS </w:t>
       </w:r>
-      <w:proofErr w:type="spellStart"/>
       <w:r>
         <w:rPr>
           <w:rFonts w:asciiTheme="minorHAnsi" w:hAnsiTheme="minorHAnsi" w:cstheme="minorHAnsi"/>
         </w:rPr>
-        <w:t>Kabupaten</w:t>
-      </w:r>
-      <w:proofErr w:type="spellEnd"/>
-      <w:r>
-        <w:rPr>
-          <w:rFonts w:asciiTheme="minorHAnsi" w:hAnsiTheme="minorHAnsi" w:cstheme="minorHAnsi"/>
-        </w:rPr>
-        <w:t xml:space="preserve"> Hulu Sungai Tengah</w:t>
+        <w:t>Kabupaten Hulu Sungai Tengah</w:t>
       </w:r>
     </w:p>
     <w:p>
@@ -469,14 +353,12 @@
           <w:rFonts w:asciiTheme="minorHAnsi" w:hAnsiTheme="minorHAnsi" w:cstheme="minorHAnsi"/>
         </w:rPr>
       </w:pPr>
-      <w:proofErr w:type="spellStart"/>
       <w:r>
         <w:rPr>
           <w:rFonts w:asciiTheme="minorHAnsi" w:hAnsiTheme="minorHAnsi" w:cstheme="minorHAnsi"/>
         </w:rPr>
         <w:t>Barabai</w:t>
       </w:r>
-      <w:proofErr w:type="spellEnd"/>
     </w:p>
     <w:p>
       <w:pPr>
@@ -504,7 +386,6 @@
           <w:rFonts w:asciiTheme="minorHAnsi" w:hAnsiTheme="minorHAnsi" w:cstheme="minorHAnsi"/>
         </w:rPr>
       </w:pPr>
-      <w:proofErr w:type="spellStart"/>
       <w:r>
         <w:rPr>
           <w:rFonts w:asciiTheme="minorHAnsi" w:hAnsiTheme="minorHAnsi" w:cstheme="minorHAnsi"/>
@@ -521,38 +402,8 @@
         <w:rPr>
           <w:rFonts w:asciiTheme="minorHAnsi" w:hAnsiTheme="minorHAnsi" w:cstheme="minorHAnsi"/>
         </w:rPr>
-        <w:t>juti</w:t>
+        <w:t>juti Form Permintaan Nomor</w:t>
       </w:r>
-      <w:proofErr w:type="spellEnd"/>
-      <w:r>
-        <w:rPr>
-          <w:rFonts w:asciiTheme="minorHAnsi" w:hAnsiTheme="minorHAnsi" w:cstheme="minorHAnsi"/>
-        </w:rPr>
-        <w:t xml:space="preserve"> Form </w:t>
-      </w:r>
-      <w:proofErr w:type="spellStart"/>
-      <w:r>
-        <w:rPr>
-          <w:rFonts w:asciiTheme="minorHAnsi" w:hAnsiTheme="minorHAnsi" w:cstheme="minorHAnsi"/>
-        </w:rPr>
-        <w:t>Permintaan</w:t>
-      </w:r>
-      <w:proofErr w:type="spellEnd"/>
-      <w:r>
-        <w:rPr>
-          <w:rFonts w:asciiTheme="minorHAnsi" w:hAnsiTheme="minorHAnsi" w:cstheme="minorHAnsi"/>
-        </w:rPr>
-        <w:t xml:space="preserve"> </w:t>
-      </w:r>
-      <w:proofErr w:type="spellStart"/>
-      <w:proofErr w:type="gramStart"/>
-      <w:r>
-        <w:rPr>
-          <w:rFonts w:asciiTheme="minorHAnsi" w:hAnsiTheme="minorHAnsi" w:cstheme="minorHAnsi"/>
-        </w:rPr>
-        <w:t>Nomor</w:t>
-      </w:r>
-      <w:proofErr w:type="spellEnd"/>
       <w:r>
         <w:rPr>
           <w:rFonts w:asciiTheme="minorHAnsi" w:hAnsiTheme="minorHAnsi" w:cstheme="minorHAnsi"/>
@@ -565,7 +416,6 @@
         </w:rPr>
         <w:t>:</w:t>
       </w:r>
-      <w:proofErr w:type="gramEnd"/>
       <w:r>
         <w:rPr>
           <w:rFonts w:asciiTheme="minorHAnsi" w:hAnsiTheme="minorHAnsi" w:cstheme="minorHAnsi"/>
@@ -586,14 +436,12 @@
         </w:rPr>
         <w:t xml:space="preserve"> </w:t>
       </w:r>
-      <w:proofErr w:type="spellStart"/>
       <w:r>
         <w:rPr>
           <w:rFonts w:asciiTheme="minorHAnsi" w:hAnsiTheme="minorHAnsi" w:cstheme="minorHAnsi"/>
         </w:rPr>
         <w:t>Tanggal</w:t>
       </w:r>
-      <w:proofErr w:type="spellEnd"/>
       <w:r>
         <w:rPr>
           <w:rFonts w:asciiTheme="minorHAnsi" w:hAnsiTheme="minorHAnsi" w:cstheme="minorHAnsi"/>
@@ -614,70 +462,12 @@
         </w:rPr>
         <w:t xml:space="preserve"> </w:t>
       </w:r>
-      <w:proofErr w:type="spellStart"/>
       <w:r>
         <w:rPr>
           <w:rFonts w:asciiTheme="minorHAnsi" w:hAnsiTheme="minorHAnsi" w:cstheme="minorHAnsi"/>
         </w:rPr>
-        <w:t>tentang</w:t>
+        <w:t>tentang  yang rincian POK nya terdiri dari</w:t>
       </w:r>
-      <w:proofErr w:type="spellEnd"/>
-      <w:r>
-        <w:rPr>
-          <w:rFonts w:asciiTheme="minorHAnsi" w:hAnsiTheme="minorHAnsi" w:cstheme="minorHAnsi"/>
-        </w:rPr>
-        <w:t xml:space="preserve">  yang </w:t>
-      </w:r>
-      <w:proofErr w:type="spellStart"/>
-      <w:r>
-        <w:rPr>
-          <w:rFonts w:asciiTheme="minorHAnsi" w:hAnsiTheme="minorHAnsi" w:cstheme="minorHAnsi"/>
-        </w:rPr>
-        <w:t>rincian</w:t>
-      </w:r>
-      <w:proofErr w:type="spellEnd"/>
-      <w:r>
-        <w:rPr>
-          <w:rFonts w:asciiTheme="minorHAnsi" w:hAnsiTheme="minorHAnsi" w:cstheme="minorHAnsi"/>
-        </w:rPr>
-        <w:t xml:space="preserve"> POK </w:t>
-      </w:r>
-      <w:proofErr w:type="spellStart"/>
-      <w:r>
-        <w:rPr>
-          <w:rFonts w:asciiTheme="minorHAnsi" w:hAnsiTheme="minorHAnsi" w:cstheme="minorHAnsi"/>
-        </w:rPr>
-        <w:t>nya</w:t>
-      </w:r>
-      <w:proofErr w:type="spellEnd"/>
-      <w:r>
-        <w:rPr>
-          <w:rFonts w:asciiTheme="minorHAnsi" w:hAnsiTheme="minorHAnsi" w:cstheme="minorHAnsi"/>
-        </w:rPr>
-        <w:t xml:space="preserve"> </w:t>
-      </w:r>
-      <w:proofErr w:type="spellStart"/>
-      <w:r>
-        <w:rPr>
-          <w:rFonts w:asciiTheme="minorHAnsi" w:hAnsiTheme="minorHAnsi" w:cstheme="minorHAnsi"/>
-        </w:rPr>
-        <w:t>terdiri</w:t>
-      </w:r>
-      <w:proofErr w:type="spellEnd"/>
-      <w:r>
-        <w:rPr>
-          <w:rFonts w:asciiTheme="minorHAnsi" w:hAnsiTheme="minorHAnsi" w:cstheme="minorHAnsi"/>
-        </w:rPr>
-        <w:t xml:space="preserve"> </w:t>
-      </w:r>
-      <w:proofErr w:type="spellStart"/>
-      <w:r>
-        <w:rPr>
-          <w:rFonts w:asciiTheme="minorHAnsi" w:hAnsiTheme="minorHAnsi" w:cstheme="minorHAnsi"/>
-        </w:rPr>
-        <w:t>dari</w:t>
-      </w:r>
-      <w:proofErr w:type="spellEnd"/>
       <w:r>
         <w:rPr>
           <w:rFonts w:asciiTheme="minorHAnsi" w:hAnsiTheme="minorHAnsi" w:cstheme="minorHAnsi"/>
@@ -734,30 +524,8 @@
               <w:rPr>
                 <w:rFonts w:asciiTheme="minorHAnsi" w:hAnsiTheme="minorHAnsi" w:cstheme="minorHAnsi"/>
               </w:rPr>
-              <w:t xml:space="preserve">Mata </w:t>
-            </w:r>
-            <w:proofErr w:type="spellStart"/>
-            <w:r>
-              <w:rPr>
-                <w:rFonts w:asciiTheme="minorHAnsi" w:hAnsiTheme="minorHAnsi" w:cstheme="minorHAnsi"/>
-              </w:rPr>
-              <w:t>Akun</w:t>
-            </w:r>
-            <w:proofErr w:type="spellEnd"/>
-            <w:r>
-              <w:rPr>
-                <w:rFonts w:asciiTheme="minorHAnsi" w:hAnsiTheme="minorHAnsi" w:cstheme="minorHAnsi"/>
-              </w:rPr>
-              <w:t xml:space="preserve">/ Item </w:t>
-            </w:r>
-            <w:proofErr w:type="spellStart"/>
-            <w:r>
-              <w:rPr>
-                <w:rFonts w:asciiTheme="minorHAnsi" w:hAnsiTheme="minorHAnsi" w:cstheme="minorHAnsi"/>
-              </w:rPr>
-              <w:t>Kegiatan</w:t>
-            </w:r>
-            <w:proofErr w:type="spellEnd"/>
+              <w:t>Mata Akun/ Item Kegiatan</w:t>
+            </w:r>
           </w:p>
         </w:tc>
         <w:tc>
@@ -772,28 +540,12 @@
                 <w:rFonts w:asciiTheme="minorHAnsi" w:hAnsiTheme="minorHAnsi" w:cstheme="minorHAnsi"/>
               </w:rPr>
             </w:pPr>
-            <w:proofErr w:type="spellStart"/>
-            <w:r>
-              <w:rPr>
-                <w:rFonts w:asciiTheme="minorHAnsi" w:hAnsiTheme="minorHAnsi" w:cstheme="minorHAnsi"/>
-              </w:rPr>
-              <w:t>Jenis</w:t>
-            </w:r>
-            <w:proofErr w:type="spellEnd"/>
-            <w:r>
-              <w:rPr>
-                <w:rFonts w:asciiTheme="minorHAnsi" w:hAnsiTheme="minorHAnsi" w:cstheme="minorHAnsi"/>
-              </w:rPr>
-              <w:t xml:space="preserve"> </w:t>
-            </w:r>
-            <w:proofErr w:type="spellStart"/>
-            <w:r>
-              <w:rPr>
-                <w:rFonts w:asciiTheme="minorHAnsi" w:hAnsiTheme="minorHAnsi" w:cstheme="minorHAnsi"/>
-              </w:rPr>
-              <w:t>Pengadaan</w:t>
-            </w:r>
-            <w:proofErr w:type="spellEnd"/>
+            <w:r>
+              <w:rPr>
+                <w:rFonts w:asciiTheme="minorHAnsi" w:hAnsiTheme="minorHAnsi" w:cstheme="minorHAnsi"/>
+              </w:rPr>
+              <w:t>Jenis Pengadaan</w:t>
+            </w:r>
           </w:p>
         </w:tc>
         <w:tc>
@@ -808,34 +560,18 @@
                 <w:rFonts w:asciiTheme="minorHAnsi" w:hAnsiTheme="minorHAnsi" w:cstheme="minorHAnsi"/>
               </w:rPr>
             </w:pPr>
-            <w:proofErr w:type="spellStart"/>
-            <w:r>
-              <w:rPr>
-                <w:rFonts w:asciiTheme="minorHAnsi" w:hAnsiTheme="minorHAnsi" w:cstheme="minorHAnsi"/>
-              </w:rPr>
-              <w:t>Pagu</w:t>
-            </w:r>
-            <w:proofErr w:type="spellEnd"/>
-            <w:r>
-              <w:rPr>
-                <w:rFonts w:asciiTheme="minorHAnsi" w:hAnsiTheme="minorHAnsi" w:cstheme="minorHAnsi"/>
-              </w:rPr>
-              <w:t xml:space="preserve"> POK</w:t>
-            </w:r>
-            <w:r>
-              <w:rPr>
-                <w:rFonts w:asciiTheme="minorHAnsi" w:hAnsiTheme="minorHAnsi" w:cstheme="minorHAnsi"/>
-              </w:rPr>
-              <w:t xml:space="preserve"> Yang Akan </w:t>
-            </w:r>
-            <w:proofErr w:type="spellStart"/>
-            <w:r>
-              <w:rPr>
-                <w:rFonts w:asciiTheme="minorHAnsi" w:hAnsiTheme="minorHAnsi" w:cstheme="minorHAnsi"/>
-              </w:rPr>
-              <w:t>Digunakan</w:t>
-            </w:r>
-            <w:proofErr w:type="spellEnd"/>
+            <w:r>
+              <w:rPr>
+                <w:rFonts w:asciiTheme="minorHAnsi" w:hAnsiTheme="minorHAnsi" w:cstheme="minorHAnsi"/>
+              </w:rPr>
+              <w:t>Pagu POK</w:t>
+            </w:r>
+            <w:r>
+              <w:rPr>
+                <w:rFonts w:asciiTheme="minorHAnsi" w:hAnsiTheme="minorHAnsi" w:cstheme="minorHAnsi"/>
+              </w:rPr>
+              <w:t xml:space="preserve"> Yang Akan Digunakan</w:t>
+            </w:r>
           </w:p>
         </w:tc>
       </w:tr>
@@ -927,21 +663,7 @@
               <w:rPr>
                 <w:rFonts w:asciiTheme="minorHAnsi" w:hAnsiTheme="minorHAnsi" w:cstheme="minorHAnsi"/>
               </w:rPr>
-              <w:t>${</w:t>
-            </w:r>
-            <w:proofErr w:type="spellStart"/>
-            <w:r>
-              <w:rPr>
-                <w:rFonts w:asciiTheme="minorHAnsi" w:hAnsiTheme="minorHAnsi" w:cstheme="minorHAnsi"/>
-              </w:rPr>
-              <w:t>akun</w:t>
-            </w:r>
-            <w:proofErr w:type="spellEnd"/>
-            <w:r>
-              <w:rPr>
-                <w:rFonts w:asciiTheme="minorHAnsi" w:hAnsiTheme="minorHAnsi" w:cstheme="minorHAnsi"/>
-              </w:rPr>
-              <w:t>}</w:t>
+              <w:t>${akun}</w:t>
             </w:r>
           </w:p>
         </w:tc>
@@ -1004,21 +726,7 @@
               <w:rPr>
                 <w:rFonts w:asciiTheme="minorHAnsi" w:hAnsiTheme="minorHAnsi" w:cstheme="minorHAnsi"/>
               </w:rPr>
-              <w:t>${</w:t>
-            </w:r>
-            <w:proofErr w:type="spellStart"/>
-            <w:r>
-              <w:rPr>
-                <w:rFonts w:asciiTheme="minorHAnsi" w:hAnsiTheme="minorHAnsi" w:cstheme="minorHAnsi"/>
-              </w:rPr>
-              <w:t>rincian</w:t>
-            </w:r>
-            <w:proofErr w:type="spellEnd"/>
-            <w:r>
-              <w:rPr>
-                <w:rFonts w:asciiTheme="minorHAnsi" w:hAnsiTheme="minorHAnsi" w:cstheme="minorHAnsi"/>
-              </w:rPr>
-              <w:t>}</w:t>
+              <w:t>${rincian}</w:t>
             </w:r>
           </w:p>
         </w:tc>
@@ -1037,21 +745,7 @@
               <w:rPr>
                 <w:rFonts w:asciiTheme="minorHAnsi" w:hAnsiTheme="minorHAnsi" w:cstheme="minorHAnsi"/>
               </w:rPr>
-              <w:t>${</w:t>
-            </w:r>
-            <w:proofErr w:type="spellStart"/>
-            <w:r>
-              <w:rPr>
-                <w:rFonts w:asciiTheme="minorHAnsi" w:hAnsiTheme="minorHAnsi" w:cstheme="minorHAnsi"/>
-              </w:rPr>
-              <w:t>jenis</w:t>
-            </w:r>
-            <w:proofErr w:type="spellEnd"/>
-            <w:r>
-              <w:rPr>
-                <w:rFonts w:asciiTheme="minorHAnsi" w:hAnsiTheme="minorHAnsi" w:cstheme="minorHAnsi"/>
-              </w:rPr>
-              <w:t>}</w:t>
+              <w:t>${jenis}</w:t>
             </w:r>
           </w:p>
         </w:tc>
@@ -1070,21 +764,7 @@
               <w:rPr>
                 <w:rFonts w:asciiTheme="minorHAnsi" w:hAnsiTheme="minorHAnsi" w:cstheme="minorHAnsi"/>
               </w:rPr>
-              <w:t>${</w:t>
-            </w:r>
-            <w:proofErr w:type="spellStart"/>
-            <w:r>
-              <w:rPr>
-                <w:rFonts w:asciiTheme="minorHAnsi" w:hAnsiTheme="minorHAnsi" w:cstheme="minorHAnsi"/>
-              </w:rPr>
-              <w:t>perkiraan</w:t>
-            </w:r>
-            <w:proofErr w:type="spellEnd"/>
-            <w:r>
-              <w:rPr>
-                <w:rFonts w:asciiTheme="minorHAnsi" w:hAnsiTheme="minorHAnsi" w:cstheme="minorHAnsi"/>
-              </w:rPr>
-              <w:t>}</w:t>
+              <w:t>${perkiraan}</w:t>
             </w:r>
           </w:p>
         </w:tc>
@@ -1187,21 +867,7 @@
               <w:rPr>
                 <w:rFonts w:asciiTheme="minorHAnsi" w:hAnsiTheme="minorHAnsi" w:cstheme="minorHAnsi"/>
               </w:rPr>
-              <w:t>${</w:t>
-            </w:r>
-            <w:proofErr w:type="spellStart"/>
-            <w:r>
-              <w:rPr>
-                <w:rFonts w:asciiTheme="minorHAnsi" w:hAnsiTheme="minorHAnsi" w:cstheme="minorHAnsi"/>
-              </w:rPr>
-              <w:t>perkiraan</w:t>
-            </w:r>
-            <w:proofErr w:type="spellEnd"/>
-            <w:r>
-              <w:rPr>
-                <w:rFonts w:asciiTheme="minorHAnsi" w:hAnsiTheme="minorHAnsi" w:cstheme="minorHAnsi"/>
-              </w:rPr>
-              <w:t>}</w:t>
+              <w:t>${perkiraan}</w:t>
             </w:r>
           </w:p>
         </w:tc>
@@ -1228,217 +894,7 @@
         <w:rPr>
           <w:rFonts w:asciiTheme="minorHAnsi" w:hAnsiTheme="minorHAnsi" w:cstheme="minorHAnsi"/>
         </w:rPr>
-        <w:t xml:space="preserve">Bersama </w:t>
-      </w:r>
-      <w:proofErr w:type="spellStart"/>
-      <w:r>
-        <w:rPr>
-          <w:rFonts w:asciiTheme="minorHAnsi" w:hAnsiTheme="minorHAnsi" w:cstheme="minorHAnsi"/>
-        </w:rPr>
-        <w:t>ini</w:t>
-      </w:r>
-      <w:proofErr w:type="spellEnd"/>
-      <w:r>
-        <w:rPr>
-          <w:rFonts w:asciiTheme="minorHAnsi" w:hAnsiTheme="minorHAnsi" w:cstheme="minorHAnsi"/>
-        </w:rPr>
-        <w:t xml:space="preserve"> kami </w:t>
-      </w:r>
-      <w:proofErr w:type="spellStart"/>
-      <w:r>
-        <w:rPr>
-          <w:rFonts w:asciiTheme="minorHAnsi" w:hAnsiTheme="minorHAnsi" w:cstheme="minorHAnsi"/>
-        </w:rPr>
-        <w:t>minta</w:t>
-      </w:r>
-      <w:proofErr w:type="spellEnd"/>
-      <w:r>
-        <w:rPr>
-          <w:rFonts w:asciiTheme="minorHAnsi" w:hAnsiTheme="minorHAnsi" w:cstheme="minorHAnsi"/>
-        </w:rPr>
-        <w:t xml:space="preserve"> </w:t>
-      </w:r>
-      <w:proofErr w:type="spellStart"/>
-      <w:r>
-        <w:rPr>
-          <w:rFonts w:asciiTheme="minorHAnsi" w:hAnsiTheme="minorHAnsi" w:cstheme="minorHAnsi"/>
-        </w:rPr>
-        <w:t>untuk</w:t>
-      </w:r>
-      <w:proofErr w:type="spellEnd"/>
-      <w:r>
-        <w:rPr>
-          <w:rFonts w:asciiTheme="minorHAnsi" w:hAnsiTheme="minorHAnsi" w:cstheme="minorHAnsi"/>
-        </w:rPr>
-        <w:t xml:space="preserve"> </w:t>
-      </w:r>
-      <w:proofErr w:type="spellStart"/>
-      <w:r>
-        <w:rPr>
-          <w:rFonts w:asciiTheme="minorHAnsi" w:hAnsiTheme="minorHAnsi" w:cstheme="minorHAnsi"/>
-        </w:rPr>
-        <w:t>dapat</w:t>
-      </w:r>
-      <w:proofErr w:type="spellEnd"/>
-      <w:r>
-        <w:rPr>
-          <w:rFonts w:asciiTheme="minorHAnsi" w:hAnsiTheme="minorHAnsi" w:cstheme="minorHAnsi"/>
-        </w:rPr>
-        <w:t xml:space="preserve"> </w:t>
-      </w:r>
-      <w:proofErr w:type="spellStart"/>
-      <w:r>
-        <w:rPr>
-          <w:rFonts w:asciiTheme="minorHAnsi" w:hAnsiTheme="minorHAnsi" w:cstheme="minorHAnsi"/>
-        </w:rPr>
-        <w:t>dilaksanakan</w:t>
-      </w:r>
-      <w:proofErr w:type="spellEnd"/>
-      <w:r>
-        <w:rPr>
-          <w:rFonts w:asciiTheme="minorHAnsi" w:hAnsiTheme="minorHAnsi" w:cstheme="minorHAnsi"/>
-        </w:rPr>
-        <w:t xml:space="preserve"> proses </w:t>
-      </w:r>
-      <w:proofErr w:type="spellStart"/>
-      <w:r>
-        <w:rPr>
-          <w:rFonts w:asciiTheme="minorHAnsi" w:hAnsiTheme="minorHAnsi" w:cstheme="minorHAnsi"/>
-        </w:rPr>
-        <w:t>pengadaannya</w:t>
-      </w:r>
-      <w:proofErr w:type="spellEnd"/>
-      <w:r>
-        <w:rPr>
-          <w:rFonts w:asciiTheme="minorHAnsi" w:hAnsiTheme="minorHAnsi" w:cstheme="minorHAnsi"/>
-        </w:rPr>
-        <w:t xml:space="preserve"> dan </w:t>
-      </w:r>
-      <w:proofErr w:type="spellStart"/>
-      <w:r>
-        <w:rPr>
-          <w:rFonts w:asciiTheme="minorHAnsi" w:hAnsiTheme="minorHAnsi" w:cstheme="minorHAnsi"/>
-        </w:rPr>
-        <w:t>sebagai</w:t>
-      </w:r>
-      <w:proofErr w:type="spellEnd"/>
-      <w:r>
-        <w:rPr>
-          <w:rFonts w:asciiTheme="minorHAnsi" w:hAnsiTheme="minorHAnsi" w:cstheme="minorHAnsi"/>
-        </w:rPr>
-        <w:t xml:space="preserve"> </w:t>
-      </w:r>
-      <w:proofErr w:type="spellStart"/>
-      <w:r>
-        <w:rPr>
-          <w:rFonts w:asciiTheme="minorHAnsi" w:hAnsiTheme="minorHAnsi" w:cstheme="minorHAnsi"/>
-        </w:rPr>
-        <w:t>bahan</w:t>
-      </w:r>
-      <w:proofErr w:type="spellEnd"/>
-      <w:r>
-        <w:rPr>
-          <w:rFonts w:asciiTheme="minorHAnsi" w:hAnsiTheme="minorHAnsi" w:cstheme="minorHAnsi"/>
-        </w:rPr>
-        <w:t xml:space="preserve"> proses </w:t>
-      </w:r>
-      <w:proofErr w:type="spellStart"/>
-      <w:r>
-        <w:rPr>
-          <w:rFonts w:asciiTheme="minorHAnsi" w:hAnsiTheme="minorHAnsi" w:cstheme="minorHAnsi"/>
-        </w:rPr>
-        <w:t>pengadaan</w:t>
-      </w:r>
-      <w:proofErr w:type="spellEnd"/>
-      <w:r>
-        <w:rPr>
-          <w:rFonts w:asciiTheme="minorHAnsi" w:hAnsiTheme="minorHAnsi" w:cstheme="minorHAnsi"/>
-        </w:rPr>
-        <w:t xml:space="preserve">, kami </w:t>
-      </w:r>
-      <w:proofErr w:type="spellStart"/>
-      <w:r>
-        <w:rPr>
-          <w:rFonts w:asciiTheme="minorHAnsi" w:hAnsiTheme="minorHAnsi" w:cstheme="minorHAnsi"/>
-        </w:rPr>
-        <w:t>lampirkan</w:t>
-      </w:r>
-      <w:proofErr w:type="spellEnd"/>
-      <w:r>
-        <w:rPr>
-          <w:rFonts w:asciiTheme="minorHAnsi" w:hAnsiTheme="minorHAnsi" w:cstheme="minorHAnsi"/>
-        </w:rPr>
-        <w:t xml:space="preserve"> </w:t>
-      </w:r>
-      <w:proofErr w:type="spellStart"/>
-      <w:r>
-        <w:rPr>
-          <w:rFonts w:asciiTheme="minorHAnsi" w:hAnsiTheme="minorHAnsi" w:cstheme="minorHAnsi"/>
-        </w:rPr>
-        <w:t>Kerangka</w:t>
-      </w:r>
-      <w:proofErr w:type="spellEnd"/>
-      <w:r>
-        <w:rPr>
-          <w:rFonts w:asciiTheme="minorHAnsi" w:hAnsiTheme="minorHAnsi" w:cstheme="minorHAnsi"/>
-        </w:rPr>
-        <w:t xml:space="preserve"> </w:t>
-      </w:r>
-      <w:proofErr w:type="spellStart"/>
-      <w:r>
-        <w:rPr>
-          <w:rFonts w:asciiTheme="minorHAnsi" w:hAnsiTheme="minorHAnsi" w:cstheme="minorHAnsi"/>
-        </w:rPr>
-        <w:t>Acuan</w:t>
-      </w:r>
-      <w:proofErr w:type="spellEnd"/>
-      <w:r>
-        <w:rPr>
-          <w:rFonts w:asciiTheme="minorHAnsi" w:hAnsiTheme="minorHAnsi" w:cstheme="minorHAnsi"/>
-        </w:rPr>
-        <w:t xml:space="preserve"> </w:t>
-      </w:r>
-      <w:proofErr w:type="spellStart"/>
-      <w:r>
-        <w:rPr>
-          <w:rFonts w:asciiTheme="minorHAnsi" w:hAnsiTheme="minorHAnsi" w:cstheme="minorHAnsi"/>
-        </w:rPr>
-        <w:t>Kerja</w:t>
-      </w:r>
-      <w:proofErr w:type="spellEnd"/>
-      <w:r>
-        <w:rPr>
-          <w:rFonts w:asciiTheme="minorHAnsi" w:hAnsiTheme="minorHAnsi" w:cstheme="minorHAnsi"/>
-        </w:rPr>
-        <w:t xml:space="preserve"> (KAK) dan </w:t>
-      </w:r>
-      <w:proofErr w:type="spellStart"/>
-      <w:r>
-        <w:rPr>
-          <w:rFonts w:asciiTheme="minorHAnsi" w:hAnsiTheme="minorHAnsi" w:cstheme="minorHAnsi"/>
-        </w:rPr>
-        <w:t>spesifikasi</w:t>
-      </w:r>
-      <w:proofErr w:type="spellEnd"/>
-      <w:r>
-        <w:rPr>
-          <w:rFonts w:asciiTheme="minorHAnsi" w:hAnsiTheme="minorHAnsi" w:cstheme="minorHAnsi"/>
-        </w:rPr>
-        <w:t xml:space="preserve"> </w:t>
-      </w:r>
-      <w:proofErr w:type="spellStart"/>
-      <w:r>
-        <w:rPr>
-          <w:rFonts w:asciiTheme="minorHAnsi" w:hAnsiTheme="minorHAnsi" w:cstheme="minorHAnsi"/>
-        </w:rPr>
-        <w:t>teknis</w:t>
-      </w:r>
-      <w:proofErr w:type="spellEnd"/>
-      <w:r>
-        <w:rPr>
-          <w:rFonts w:asciiTheme="minorHAnsi" w:hAnsiTheme="minorHAnsi" w:cstheme="minorHAnsi"/>
-        </w:rPr>
-        <w:t>.</w:t>
+        <w:t>Bersama ini kami minta untuk dapat dilaksanakan proses pengadaannya dan sebagai bahan proses pengadaan, kami lampirkan Kerangka Acuan Kerja (KAK) dan spesifikasi teknis.</w:t>
       </w:r>
     </w:p>
     <w:p>
@@ -1458,103 +914,11 @@
           <w:rFonts w:asciiTheme="minorHAnsi" w:hAnsiTheme="minorHAnsi" w:cstheme="minorHAnsi"/>
         </w:rPr>
       </w:pPr>
-      <w:proofErr w:type="spellStart"/>
       <w:r>
         <w:rPr>
           <w:rFonts w:asciiTheme="minorHAnsi" w:hAnsiTheme="minorHAnsi" w:cstheme="minorHAnsi"/>
         </w:rPr>
-        <w:t>Demikian</w:t>
-      </w:r>
-      <w:proofErr w:type="spellEnd"/>
-      <w:r>
-        <w:rPr>
-          <w:rFonts w:asciiTheme="minorHAnsi" w:hAnsiTheme="minorHAnsi" w:cstheme="minorHAnsi"/>
-        </w:rPr>
-        <w:t xml:space="preserve">, </w:t>
-      </w:r>
-      <w:proofErr w:type="spellStart"/>
-      <w:r>
-        <w:rPr>
-          <w:rFonts w:asciiTheme="minorHAnsi" w:hAnsiTheme="minorHAnsi" w:cstheme="minorHAnsi"/>
-        </w:rPr>
-        <w:t>atas</w:t>
-      </w:r>
-      <w:proofErr w:type="spellEnd"/>
-      <w:r>
-        <w:rPr>
-          <w:rFonts w:asciiTheme="minorHAnsi" w:hAnsiTheme="minorHAnsi" w:cstheme="minorHAnsi"/>
-        </w:rPr>
-        <w:t xml:space="preserve"> </w:t>
-      </w:r>
-      <w:proofErr w:type="spellStart"/>
-      <w:r>
-        <w:rPr>
-          <w:rFonts w:asciiTheme="minorHAnsi" w:hAnsiTheme="minorHAnsi" w:cstheme="minorHAnsi"/>
-        </w:rPr>
-        <w:t>perhatian</w:t>
-      </w:r>
-      <w:proofErr w:type="spellEnd"/>
-      <w:r>
-        <w:rPr>
-          <w:rFonts w:asciiTheme="minorHAnsi" w:hAnsiTheme="minorHAnsi" w:cstheme="minorHAnsi"/>
-        </w:rPr>
-        <w:t xml:space="preserve"> dan </w:t>
-      </w:r>
-      <w:proofErr w:type="spellStart"/>
-      <w:r>
-        <w:rPr>
-          <w:rFonts w:asciiTheme="minorHAnsi" w:hAnsiTheme="minorHAnsi" w:cstheme="minorHAnsi"/>
-        </w:rPr>
-        <w:t>kerjasamanya</w:t>
-      </w:r>
-      <w:proofErr w:type="spellEnd"/>
-      <w:r>
-        <w:rPr>
-          <w:rFonts w:asciiTheme="minorHAnsi" w:hAnsiTheme="minorHAnsi" w:cstheme="minorHAnsi"/>
-        </w:rPr>
-        <w:t xml:space="preserve">, </w:t>
-      </w:r>
-      <w:proofErr w:type="spellStart"/>
-      <w:r>
-        <w:rPr>
-          <w:rFonts w:asciiTheme="minorHAnsi" w:hAnsiTheme="minorHAnsi" w:cstheme="minorHAnsi"/>
-        </w:rPr>
-        <w:t>diucapkan</w:t>
-      </w:r>
-      <w:proofErr w:type="spellEnd"/>
-      <w:r>
-        <w:rPr>
-          <w:rFonts w:asciiTheme="minorHAnsi" w:hAnsiTheme="minorHAnsi" w:cstheme="minorHAnsi"/>
-        </w:rPr>
-        <w:t xml:space="preserve"> </w:t>
-      </w:r>
-      <w:proofErr w:type="spellStart"/>
-      <w:r>
-        <w:rPr>
-          <w:rFonts w:asciiTheme="minorHAnsi" w:hAnsiTheme="minorHAnsi" w:cstheme="minorHAnsi"/>
-        </w:rPr>
-        <w:t>terima</w:t>
-      </w:r>
-      <w:proofErr w:type="spellEnd"/>
-      <w:r>
-        <w:rPr>
-          <w:rFonts w:asciiTheme="minorHAnsi" w:hAnsiTheme="minorHAnsi" w:cstheme="minorHAnsi"/>
-        </w:rPr>
-        <w:t xml:space="preserve"> </w:t>
-      </w:r>
-      <w:proofErr w:type="spellStart"/>
-      <w:r>
-        <w:rPr>
-          <w:rFonts w:asciiTheme="minorHAnsi" w:hAnsiTheme="minorHAnsi" w:cstheme="minorHAnsi"/>
-        </w:rPr>
-        <w:t>kasih</w:t>
-      </w:r>
-      <w:proofErr w:type="spellEnd"/>
-      <w:r>
-        <w:rPr>
-          <w:rFonts w:asciiTheme="minorHAnsi" w:hAnsiTheme="minorHAnsi" w:cstheme="minorHAnsi"/>
-        </w:rPr>
-        <w:t>.</w:t>
+        <w:t>Demikian, atas perhatian dan kerjasamanya, diucapkan terima kasih.</w:t>
       </w:r>
     </w:p>
     <w:p>
@@ -1690,23 +1054,7 @@
                 <w:rFonts w:asciiTheme="minorHAnsi" w:hAnsiTheme="minorHAnsi" w:cstheme="minorHAnsi"/>
                 <w:u w:val="single"/>
               </w:rPr>
-              <w:t>${</w:t>
-            </w:r>
-            <w:proofErr w:type="spellStart"/>
-            <w:r>
-              <w:rPr>
-                <w:rFonts w:asciiTheme="minorHAnsi" w:hAnsiTheme="minorHAnsi" w:cstheme="minorHAnsi"/>
-                <w:u w:val="single"/>
-              </w:rPr>
-              <w:t>ppk</w:t>
-            </w:r>
-            <w:proofErr w:type="spellEnd"/>
-            <w:r>
-              <w:rPr>
-                <w:rFonts w:asciiTheme="minorHAnsi" w:hAnsiTheme="minorHAnsi" w:cstheme="minorHAnsi"/>
-                <w:u w:val="single"/>
-              </w:rPr>
-              <w:t>}</w:t>
+              <w:t>${ppk}</w:t>
             </w:r>
           </w:p>
         </w:tc>
@@ -1733,21 +1081,7 @@
               <w:rPr>
                 <w:rFonts w:asciiTheme="minorHAnsi" w:hAnsiTheme="minorHAnsi" w:cstheme="minorHAnsi"/>
               </w:rPr>
-              <w:t>${</w:t>
-            </w:r>
-            <w:proofErr w:type="spellStart"/>
-            <w:r>
-              <w:rPr>
-                <w:rFonts w:asciiTheme="minorHAnsi" w:hAnsiTheme="minorHAnsi" w:cstheme="minorHAnsi"/>
-              </w:rPr>
-              <w:t>nipppk</w:t>
-            </w:r>
-            <w:proofErr w:type="spellEnd"/>
-            <w:r>
-              <w:rPr>
-                <w:rFonts w:asciiTheme="minorHAnsi" w:hAnsiTheme="minorHAnsi" w:cstheme="minorHAnsi"/>
-              </w:rPr>
-              <w:t>}</w:t>
+              <w:t>${nipppk}</w:t>
             </w:r>
           </w:p>
         </w:tc>
@@ -1830,30 +1164,14 @@
         <w:rPr>
           <w:rFonts w:asciiTheme="minorHAnsi" w:hAnsiTheme="minorHAnsi" w:cstheme="minorHAnsi"/>
         </w:rPr>
-        <w:t xml:space="preserve">Lampiran Surat </w:t>
+        <w:t xml:space="preserve">Lampiran Surat Permintaan Proses </w:t>
       </w:r>
-      <w:proofErr w:type="spellStart"/>
-      <w:r>
-        <w:rPr>
-          <w:rFonts w:asciiTheme="minorHAnsi" w:hAnsiTheme="minorHAnsi" w:cstheme="minorHAnsi"/>
-        </w:rPr>
-        <w:t>Permintaan</w:t>
-      </w:r>
-      <w:proofErr w:type="spellEnd"/>
-      <w:r>
-        <w:rPr>
-          <w:rFonts w:asciiTheme="minorHAnsi" w:hAnsiTheme="minorHAnsi" w:cstheme="minorHAnsi"/>
-        </w:rPr>
-        <w:t xml:space="preserve"> Proses </w:t>
-      </w:r>
-      <w:proofErr w:type="spellStart"/>
       <w:r>
         <w:rPr>
           <w:rFonts w:asciiTheme="minorHAnsi" w:hAnsiTheme="minorHAnsi" w:cstheme="minorHAnsi"/>
         </w:rPr>
         <w:t>Pengadaan</w:t>
       </w:r>
-      <w:proofErr w:type="spellEnd"/>
     </w:p>
     <w:p>
       <w:pPr>
@@ -1863,14 +1181,12 @@
           <w:rFonts w:asciiTheme="minorHAnsi" w:hAnsiTheme="minorHAnsi" w:cstheme="minorHAnsi"/>
         </w:rPr>
       </w:pPr>
-      <w:proofErr w:type="spellStart"/>
       <w:r>
         <w:rPr>
           <w:rFonts w:asciiTheme="minorHAnsi" w:hAnsiTheme="minorHAnsi" w:cstheme="minorHAnsi"/>
         </w:rPr>
         <w:t>Nomor</w:t>
       </w:r>
-      <w:proofErr w:type="spellEnd"/>
       <w:r>
         <w:rPr>
           <w:rFonts w:asciiTheme="minorHAnsi" w:hAnsiTheme="minorHAnsi" w:cstheme="minorHAnsi"/>
@@ -1893,21 +1209,7 @@
         <w:rPr>
           <w:rFonts w:asciiTheme="minorHAnsi" w:hAnsiTheme="minorHAnsi" w:cstheme="minorHAnsi"/>
         </w:rPr>
-        <w:t>${</w:t>
-      </w:r>
-      <w:proofErr w:type="spellStart"/>
-      <w:r>
-        <w:rPr>
-          <w:rFonts w:asciiTheme="minorHAnsi" w:hAnsiTheme="minorHAnsi" w:cstheme="minorHAnsi"/>
-        </w:rPr>
-        <w:t>no_permintaan</w:t>
-      </w:r>
-      <w:proofErr w:type="spellEnd"/>
-      <w:r>
-        <w:rPr>
-          <w:rFonts w:asciiTheme="minorHAnsi" w:hAnsiTheme="minorHAnsi" w:cstheme="minorHAnsi"/>
-        </w:rPr>
-        <w:t>}</w:t>
+        <w:t>${no_permintaan}</w:t>
       </w:r>
     </w:p>
     <w:p>
@@ -1918,14 +1220,12 @@
           <w:rFonts w:asciiTheme="minorHAnsi" w:hAnsiTheme="minorHAnsi" w:cstheme="minorHAnsi"/>
         </w:rPr>
       </w:pPr>
-      <w:proofErr w:type="spellStart"/>
       <w:r>
         <w:rPr>
           <w:rFonts w:asciiTheme="minorHAnsi" w:hAnsiTheme="minorHAnsi" w:cstheme="minorHAnsi"/>
         </w:rPr>
         <w:t>Tanggal</w:t>
       </w:r>
-      <w:proofErr w:type="spellEnd"/>
       <w:r>
         <w:rPr>
           <w:rFonts w:asciiTheme="minorHAnsi" w:hAnsiTheme="minorHAnsi" w:cstheme="minorHAnsi"/>
@@ -1948,21 +1248,7 @@
         <w:rPr>
           <w:rFonts w:asciiTheme="minorHAnsi" w:hAnsiTheme="minorHAnsi" w:cstheme="minorHAnsi"/>
         </w:rPr>
-        <w:t>${</w:t>
-      </w:r>
-      <w:proofErr w:type="spellStart"/>
-      <w:r>
-        <w:rPr>
-          <w:rFonts w:asciiTheme="minorHAnsi" w:hAnsiTheme="minorHAnsi" w:cstheme="minorHAnsi"/>
-        </w:rPr>
-        <w:t>tgl_proses</w:t>
-      </w:r>
-      <w:proofErr w:type="spellEnd"/>
-      <w:r>
-        <w:rPr>
-          <w:rFonts w:asciiTheme="minorHAnsi" w:hAnsiTheme="minorHAnsi" w:cstheme="minorHAnsi"/>
-        </w:rPr>
-        <w:t>}</w:t>
+        <w:t>${tgl_proses}</w:t>
       </w:r>
     </w:p>
     <w:p>
@@ -2468,23 +1754,7 @@
                 <w:rFonts w:asciiTheme="minorHAnsi" w:hAnsiTheme="minorHAnsi" w:cstheme="minorHAnsi"/>
                 <w:u w:val="single"/>
               </w:rPr>
-              <w:t>${</w:t>
-            </w:r>
-            <w:proofErr w:type="spellStart"/>
-            <w:r>
-              <w:rPr>
-                <w:rFonts w:asciiTheme="minorHAnsi" w:hAnsiTheme="minorHAnsi" w:cstheme="minorHAnsi"/>
-                <w:u w:val="single"/>
-              </w:rPr>
-              <w:t>ppk</w:t>
-            </w:r>
-            <w:proofErr w:type="spellEnd"/>
-            <w:r>
-              <w:rPr>
-                <w:rFonts w:asciiTheme="minorHAnsi" w:hAnsiTheme="minorHAnsi" w:cstheme="minorHAnsi"/>
-                <w:u w:val="single"/>
-              </w:rPr>
-              <w:t>}</w:t>
+              <w:t>${ppk}</w:t>
             </w:r>
           </w:p>
         </w:tc>
@@ -2505,21 +1775,7 @@
               <w:rPr>
                 <w:rFonts w:asciiTheme="minorHAnsi" w:hAnsiTheme="minorHAnsi" w:cstheme="minorHAnsi"/>
               </w:rPr>
-              <w:t>NIP. ${</w:t>
-            </w:r>
-            <w:proofErr w:type="spellStart"/>
-            <w:r>
-              <w:rPr>
-                <w:rFonts w:asciiTheme="minorHAnsi" w:hAnsiTheme="minorHAnsi" w:cstheme="minorHAnsi"/>
-              </w:rPr>
-              <w:t>nipppk</w:t>
-            </w:r>
-            <w:proofErr w:type="spellEnd"/>
-            <w:r>
-              <w:rPr>
-                <w:rFonts w:asciiTheme="minorHAnsi" w:hAnsiTheme="minorHAnsi" w:cstheme="minorHAnsi"/>
-              </w:rPr>
-              <w:t>}</w:t>
+              <w:t>NIP. ${nipppk}</w:t>
             </w:r>
           </w:p>
         </w:tc>
@@ -2773,74 +2029,8 @@
           <w:rFonts w:asciiTheme="minorHAnsi" w:hAnsiTheme="minorHAnsi" w:cstheme="minorHAnsi"/>
           <w:color w:val="000000"/>
         </w:rPr>
-        <w:t xml:space="preserve">Yang </w:t>
+        <w:t>Yang bertanda tangan di bawah ini :</w:t>
       </w:r>
-      <w:proofErr w:type="spellStart"/>
-      <w:r>
-        <w:rPr>
-          <w:rFonts w:asciiTheme="minorHAnsi" w:hAnsiTheme="minorHAnsi" w:cstheme="minorHAnsi"/>
-          <w:color w:val="000000"/>
-        </w:rPr>
-        <w:t>bertanda</w:t>
-      </w:r>
-      <w:proofErr w:type="spellEnd"/>
-      <w:r>
-        <w:rPr>
-          <w:rFonts w:asciiTheme="minorHAnsi" w:hAnsiTheme="minorHAnsi" w:cstheme="minorHAnsi"/>
-          <w:color w:val="000000"/>
-        </w:rPr>
-        <w:t xml:space="preserve"> </w:t>
-      </w:r>
-      <w:proofErr w:type="spellStart"/>
-      <w:r>
-        <w:rPr>
-          <w:rFonts w:asciiTheme="minorHAnsi" w:hAnsiTheme="minorHAnsi" w:cstheme="minorHAnsi"/>
-          <w:color w:val="000000"/>
-        </w:rPr>
-        <w:t>tangan</w:t>
-      </w:r>
-      <w:proofErr w:type="spellEnd"/>
-      <w:r>
-        <w:rPr>
-          <w:rFonts w:asciiTheme="minorHAnsi" w:hAnsiTheme="minorHAnsi" w:cstheme="minorHAnsi"/>
-          <w:color w:val="000000"/>
-        </w:rPr>
-        <w:t xml:space="preserve"> di </w:t>
-      </w:r>
-      <w:proofErr w:type="spellStart"/>
-      <w:r>
-        <w:rPr>
-          <w:rFonts w:asciiTheme="minorHAnsi" w:hAnsiTheme="minorHAnsi" w:cstheme="minorHAnsi"/>
-          <w:color w:val="000000"/>
-        </w:rPr>
-        <w:t>bawah</w:t>
-      </w:r>
-      <w:proofErr w:type="spellEnd"/>
-      <w:r>
-        <w:rPr>
-          <w:rFonts w:asciiTheme="minorHAnsi" w:hAnsiTheme="minorHAnsi" w:cstheme="minorHAnsi"/>
-          <w:color w:val="000000"/>
-        </w:rPr>
-        <w:t xml:space="preserve"> </w:t>
-      </w:r>
-      <w:proofErr w:type="spellStart"/>
-      <w:proofErr w:type="gramStart"/>
-      <w:r>
-        <w:rPr>
-          <w:rFonts w:asciiTheme="minorHAnsi" w:hAnsiTheme="minorHAnsi" w:cstheme="minorHAnsi"/>
-          <w:color w:val="000000"/>
-        </w:rPr>
-        <w:t>ini</w:t>
-      </w:r>
-      <w:proofErr w:type="spellEnd"/>
-      <w:r>
-        <w:rPr>
-          <w:rFonts w:asciiTheme="minorHAnsi" w:hAnsiTheme="minorHAnsi" w:cstheme="minorHAnsi"/>
-          <w:color w:val="000000"/>
-        </w:rPr>
-        <w:t xml:space="preserve"> :</w:t>
-      </w:r>
-      <w:proofErr w:type="gramEnd"/>
     </w:p>
     <w:tbl>
       <w:tblPr>
@@ -2949,23 +2139,7 @@
                 <w:rFonts w:asciiTheme="minorHAnsi" w:hAnsiTheme="minorHAnsi" w:cstheme="minorHAnsi"/>
                 <w:color w:val="000000"/>
               </w:rPr>
-              <w:t>${</w:t>
-            </w:r>
-            <w:proofErr w:type="spellStart"/>
-            <w:r>
-              <w:rPr>
-                <w:rFonts w:asciiTheme="minorHAnsi" w:hAnsiTheme="minorHAnsi" w:cstheme="minorHAnsi"/>
-                <w:color w:val="000000"/>
-              </w:rPr>
-              <w:t>pbj</w:t>
-            </w:r>
-            <w:proofErr w:type="spellEnd"/>
-            <w:r>
-              <w:rPr>
-                <w:rFonts w:asciiTheme="minorHAnsi" w:hAnsiTheme="minorHAnsi" w:cstheme="minorHAnsi"/>
-                <w:color w:val="000000"/>
-              </w:rPr>
-              <w:t>}</w:t>
+              <w:t>${pbj}</w:t>
             </w:r>
           </w:p>
         </w:tc>
@@ -2997,7 +2171,6 @@
                 <w:lang w:val="nl-NL"/>
               </w:rPr>
             </w:pPr>
-            <w:proofErr w:type="spellStart"/>
             <w:r>
               <w:rPr>
                 <w:rFonts w:asciiTheme="minorHAnsi" w:hAnsiTheme="minorHAnsi" w:cstheme="minorHAnsi"/>
@@ -3005,7 +2178,6 @@
               </w:rPr>
               <w:t>Jabatan</w:t>
             </w:r>
-            <w:proofErr w:type="spellEnd"/>
           </w:p>
         </w:tc>
         <w:tc>
@@ -3184,39 +2356,7 @@
                 <w:rFonts w:asciiTheme="minorHAnsi" w:hAnsiTheme="minorHAnsi" w:cstheme="minorHAnsi"/>
                 <w:color w:val="000000"/>
               </w:rPr>
-              <w:t xml:space="preserve">Badan Pusat </w:t>
-            </w:r>
-            <w:proofErr w:type="spellStart"/>
-            <w:r>
-              <w:rPr>
-                <w:rFonts w:asciiTheme="minorHAnsi" w:hAnsiTheme="minorHAnsi" w:cstheme="minorHAnsi"/>
-                <w:color w:val="000000"/>
-              </w:rPr>
-              <w:t>Statistik</w:t>
-            </w:r>
-            <w:proofErr w:type="spellEnd"/>
-            <w:r>
-              <w:rPr>
-                <w:rFonts w:asciiTheme="minorHAnsi" w:hAnsiTheme="minorHAnsi" w:cstheme="minorHAnsi"/>
-                <w:color w:val="000000"/>
-              </w:rPr>
-              <w:t xml:space="preserve"> </w:t>
-            </w:r>
-            <w:proofErr w:type="spellStart"/>
-            <w:r>
-              <w:rPr>
-                <w:rFonts w:asciiTheme="minorHAnsi" w:hAnsiTheme="minorHAnsi" w:cstheme="minorHAnsi"/>
-                <w:color w:val="000000"/>
-              </w:rPr>
-              <w:t>Kabupaten</w:t>
-            </w:r>
-            <w:proofErr w:type="spellEnd"/>
-            <w:r>
-              <w:rPr>
-                <w:rFonts w:asciiTheme="minorHAnsi" w:hAnsiTheme="minorHAnsi" w:cstheme="minorHAnsi"/>
-                <w:color w:val="000000"/>
-              </w:rPr>
-              <w:t xml:space="preserve"> Hulu Sungai Tengah, </w:t>
+              <w:t xml:space="preserve">Badan Pusat Statistik Kabupaten Hulu Sungai Tengah, </w:t>
             </w:r>
           </w:p>
           <w:p>
@@ -3239,55 +2379,7 @@
                 <w:rFonts w:asciiTheme="minorHAnsi" w:hAnsiTheme="minorHAnsi" w:cstheme="minorHAnsi"/>
                 <w:color w:val="000000"/>
               </w:rPr>
-              <w:t xml:space="preserve">Jl. </w:t>
-            </w:r>
-            <w:proofErr w:type="spellStart"/>
-            <w:r>
-              <w:rPr>
-                <w:rFonts w:asciiTheme="minorHAnsi" w:hAnsiTheme="minorHAnsi" w:cstheme="minorHAnsi"/>
-                <w:color w:val="000000"/>
-              </w:rPr>
-              <w:t>Keramat</w:t>
-            </w:r>
-            <w:proofErr w:type="spellEnd"/>
-            <w:r>
-              <w:rPr>
-                <w:rFonts w:asciiTheme="minorHAnsi" w:hAnsiTheme="minorHAnsi" w:cstheme="minorHAnsi"/>
-                <w:color w:val="000000"/>
-              </w:rPr>
-              <w:t xml:space="preserve"> </w:t>
-            </w:r>
-            <w:proofErr w:type="spellStart"/>
-            <w:r>
-              <w:rPr>
-                <w:rFonts w:asciiTheme="minorHAnsi" w:hAnsiTheme="minorHAnsi" w:cstheme="minorHAnsi"/>
-                <w:color w:val="000000"/>
-              </w:rPr>
-              <w:t>Manjang</w:t>
-            </w:r>
-            <w:proofErr w:type="spellEnd"/>
-            <w:r>
-              <w:rPr>
-                <w:rFonts w:asciiTheme="minorHAnsi" w:hAnsiTheme="minorHAnsi" w:cstheme="minorHAnsi"/>
-                <w:color w:val="000000"/>
-              </w:rPr>
-              <w:t xml:space="preserve"> No. 10 </w:t>
-            </w:r>
-            <w:proofErr w:type="spellStart"/>
-            <w:r>
-              <w:rPr>
-                <w:rFonts w:asciiTheme="minorHAnsi" w:hAnsiTheme="minorHAnsi" w:cstheme="minorHAnsi"/>
-                <w:color w:val="000000"/>
-              </w:rPr>
-              <w:t>Barabai</w:t>
-            </w:r>
-            <w:proofErr w:type="spellEnd"/>
-            <w:r>
-              <w:rPr>
-                <w:rFonts w:asciiTheme="minorHAnsi" w:hAnsiTheme="minorHAnsi" w:cstheme="minorHAnsi"/>
-                <w:color w:val="000000"/>
-              </w:rPr>
-              <w:t>.</w:t>
+              <w:t>Jl. Keramat Manjang No. 10 Barabai.</w:t>
             </w:r>
           </w:p>
         </w:tc>
@@ -3425,23 +2517,7 @@
                 <w:rFonts w:asciiTheme="minorHAnsi" w:hAnsiTheme="minorHAnsi" w:cstheme="minorHAnsi"/>
                 <w:color w:val="000000"/>
               </w:rPr>
-              <w:t>${</w:t>
-            </w:r>
-            <w:proofErr w:type="spellStart"/>
-            <w:r>
-              <w:rPr>
-                <w:rFonts w:asciiTheme="minorHAnsi" w:hAnsiTheme="minorHAnsi" w:cstheme="minorHAnsi"/>
-                <w:color w:val="000000"/>
-              </w:rPr>
-              <w:t>penyedia</w:t>
-            </w:r>
-            <w:proofErr w:type="spellEnd"/>
-            <w:r>
-              <w:rPr>
-                <w:rFonts w:asciiTheme="minorHAnsi" w:hAnsiTheme="minorHAnsi" w:cstheme="minorHAnsi"/>
-                <w:color w:val="000000"/>
-              </w:rPr>
-              <w:t>}</w:t>
+              <w:t>${penyedia}</w:t>
             </w:r>
           </w:p>
         </w:tc>
@@ -3540,23 +2616,7 @@
                 <w:rFonts w:asciiTheme="minorHAnsi" w:hAnsiTheme="minorHAnsi" w:cstheme="minorHAnsi"/>
                 <w:color w:val="000000"/>
               </w:rPr>
-              <w:t>${</w:t>
-            </w:r>
-            <w:proofErr w:type="spellStart"/>
-            <w:r>
-              <w:rPr>
-                <w:rFonts w:asciiTheme="minorHAnsi" w:hAnsiTheme="minorHAnsi" w:cstheme="minorHAnsi"/>
-                <w:color w:val="000000"/>
-              </w:rPr>
-              <w:t>alamat</w:t>
-            </w:r>
-            <w:proofErr w:type="spellEnd"/>
-            <w:r>
-              <w:rPr>
-                <w:rFonts w:asciiTheme="minorHAnsi" w:hAnsiTheme="minorHAnsi" w:cstheme="minorHAnsi"/>
-                <w:color w:val="000000"/>
-              </w:rPr>
-              <w:t>}</w:t>
+              <w:t>${alamat}</w:t>
             </w:r>
           </w:p>
         </w:tc>
@@ -3653,53 +2713,12 @@
         </w:rPr>
         <w:t xml:space="preserve">) dan </w:t>
       </w:r>
-      <w:proofErr w:type="spellStart"/>
       <w:r>
         <w:rPr>
           <w:rFonts w:asciiTheme="minorHAnsi" w:hAnsiTheme="minorHAnsi" w:cstheme="minorHAnsi"/>
           <w:color w:val="000000"/>
         </w:rPr>
-        <w:t>menyerahkan</w:t>
-      </w:r>
-      <w:proofErr w:type="spellEnd"/>
-      <w:r>
-        <w:rPr>
-          <w:rFonts w:asciiTheme="minorHAnsi" w:hAnsiTheme="minorHAnsi" w:cstheme="minorHAnsi"/>
-          <w:color w:val="000000"/>
-        </w:rPr>
-        <w:t xml:space="preserve"> </w:t>
-      </w:r>
-      <w:proofErr w:type="spellStart"/>
-      <w:r>
-        <w:rPr>
-          <w:rFonts w:asciiTheme="minorHAnsi" w:hAnsiTheme="minorHAnsi" w:cstheme="minorHAnsi"/>
-          <w:color w:val="000000"/>
-        </w:rPr>
-        <w:t>hasil</w:t>
-      </w:r>
-      <w:proofErr w:type="spellEnd"/>
-      <w:r>
-        <w:rPr>
-          <w:rFonts w:asciiTheme="minorHAnsi" w:hAnsiTheme="minorHAnsi" w:cstheme="minorHAnsi"/>
-          <w:color w:val="000000"/>
-        </w:rPr>
-        <w:t xml:space="preserve"> </w:t>
-      </w:r>
-      <w:proofErr w:type="spellStart"/>
-      <w:r>
-        <w:rPr>
-          <w:rFonts w:asciiTheme="minorHAnsi" w:hAnsiTheme="minorHAnsi" w:cstheme="minorHAnsi"/>
-          <w:color w:val="000000"/>
-        </w:rPr>
-        <w:t>pekerjaannya</w:t>
-      </w:r>
-      <w:proofErr w:type="spellEnd"/>
-      <w:r>
-        <w:rPr>
-          <w:rFonts w:asciiTheme="minorHAnsi" w:hAnsiTheme="minorHAnsi" w:cstheme="minorHAnsi"/>
-          <w:color w:val="000000"/>
-        </w:rPr>
-        <w:t xml:space="preserve"> </w:t>
+        <w:t xml:space="preserve">menyerahkan hasil pekerjaannya </w:t>
       </w:r>
       <w:r>
         <w:rPr>
@@ -3747,7 +2766,6 @@
           <w:lang w:val="nl-NL"/>
         </w:rPr>
       </w:pPr>
-      <w:proofErr w:type="spellStart"/>
       <w:r>
         <w:rPr>
           <w:rFonts w:asciiTheme="minorHAnsi" w:hAnsiTheme="minorHAnsi" w:cstheme="minorHAnsi"/>
@@ -3755,49 +2773,8 @@
           <w:color w:val="000000"/>
           <w:u w:val="single"/>
         </w:rPr>
-        <w:t>Rincian</w:t>
+        <w:t>Rincian Spesifikasi dan Pembiayaan</w:t>
       </w:r>
-      <w:proofErr w:type="spellEnd"/>
-      <w:r>
-        <w:rPr>
-          <w:rFonts w:asciiTheme="minorHAnsi" w:hAnsiTheme="minorHAnsi" w:cstheme="minorHAnsi"/>
-          <w:b/>
-          <w:color w:val="000000"/>
-          <w:u w:val="single"/>
-        </w:rPr>
-        <w:t xml:space="preserve"> </w:t>
-      </w:r>
-      <w:proofErr w:type="spellStart"/>
-      <w:r>
-        <w:rPr>
-          <w:rFonts w:asciiTheme="minorHAnsi" w:hAnsiTheme="minorHAnsi" w:cstheme="minorHAnsi"/>
-          <w:b/>
-          <w:color w:val="000000"/>
-          <w:u w:val="single"/>
-        </w:rPr>
-        <w:t>Spesifikasi</w:t>
-      </w:r>
-      <w:proofErr w:type="spellEnd"/>
-      <w:r>
-        <w:rPr>
-          <w:rFonts w:asciiTheme="minorHAnsi" w:hAnsiTheme="minorHAnsi" w:cstheme="minorHAnsi"/>
-          <w:b/>
-          <w:color w:val="000000"/>
-          <w:u w:val="single"/>
-        </w:rPr>
-        <w:t xml:space="preserve"> dan </w:t>
-      </w:r>
-      <w:proofErr w:type="spellStart"/>
-      <w:r>
-        <w:rPr>
-          <w:rFonts w:asciiTheme="minorHAnsi" w:hAnsiTheme="minorHAnsi" w:cstheme="minorHAnsi"/>
-          <w:b/>
-          <w:color w:val="000000"/>
-          <w:u w:val="single"/>
-        </w:rPr>
-        <w:t>Pembiayaan</w:t>
-      </w:r>
-      <w:proofErr w:type="spellEnd"/>
       <w:r>
         <w:rPr>
           <w:rFonts w:asciiTheme="minorHAnsi" w:hAnsiTheme="minorHAnsi" w:cstheme="minorHAnsi"/>
@@ -4015,21 +2992,7 @@
               <w:rPr>
                 <w:rFonts w:asciiTheme="minorHAnsi" w:hAnsiTheme="minorHAnsi" w:cstheme="minorHAnsi"/>
               </w:rPr>
-              <w:t xml:space="preserve">SP DIPA-054.01.2.428522/2022 </w:t>
-            </w:r>
-            <w:proofErr w:type="spellStart"/>
-            <w:r>
-              <w:rPr>
-                <w:rFonts w:asciiTheme="minorHAnsi" w:hAnsiTheme="minorHAnsi" w:cstheme="minorHAnsi"/>
-              </w:rPr>
-              <w:t>tanggal</w:t>
-            </w:r>
-            <w:proofErr w:type="spellEnd"/>
-            <w:r>
-              <w:rPr>
-                <w:rFonts w:asciiTheme="minorHAnsi" w:hAnsiTheme="minorHAnsi" w:cstheme="minorHAnsi"/>
-              </w:rPr>
-              <w:t xml:space="preserve"> 17 November 2021</w:t>
+              <w:t>SP DIPA-054.01.2.428522/2022 tanggal 17 November 2021</w:t>
             </w:r>
           </w:p>
         </w:tc>
@@ -4200,14 +3163,12 @@
                 <w:lang w:val="nl-NL"/>
               </w:rPr>
             </w:pPr>
-            <w:proofErr w:type="spellStart"/>
             <w:r>
               <w:rPr>
                 <w:rFonts w:asciiTheme="minorHAnsi" w:hAnsiTheme="minorHAnsi" w:cstheme="minorHAnsi"/>
               </w:rPr>
               <w:t>Kegiatan</w:t>
             </w:r>
-            <w:proofErr w:type="spellEnd"/>
           </w:p>
         </w:tc>
         <w:tc>
@@ -4260,21 +3221,7 @@
               <w:rPr>
                 <w:rFonts w:asciiTheme="minorHAnsi" w:hAnsiTheme="minorHAnsi" w:cstheme="minorHAnsi"/>
               </w:rPr>
-              <w:t>${</w:t>
-            </w:r>
-            <w:proofErr w:type="spellStart"/>
-            <w:r>
-              <w:rPr>
-                <w:rFonts w:asciiTheme="minorHAnsi" w:hAnsiTheme="minorHAnsi" w:cstheme="minorHAnsi"/>
-              </w:rPr>
-              <w:t>kegiatan</w:t>
-            </w:r>
-            <w:proofErr w:type="spellEnd"/>
-            <w:r>
-              <w:rPr>
-                <w:rFonts w:asciiTheme="minorHAnsi" w:hAnsiTheme="minorHAnsi" w:cstheme="minorHAnsi"/>
-              </w:rPr>
-              <w:t>}</w:t>
+              <w:t>${kegiatan}</w:t>
             </w:r>
           </w:p>
         </w:tc>
@@ -4330,33 +3277,11 @@
                 <w:lang w:val="nl-NL"/>
               </w:rPr>
             </w:pPr>
-            <w:proofErr w:type="spellStart"/>
-            <w:r>
-              <w:rPr>
-                <w:rFonts w:asciiTheme="minorHAnsi" w:hAnsiTheme="minorHAnsi" w:cstheme="minorHAnsi"/>
-              </w:rPr>
-              <w:t>Klasifikasi</w:t>
-            </w:r>
-            <w:proofErr w:type="spellEnd"/>
-            <w:r>
-              <w:rPr>
-                <w:rFonts w:asciiTheme="minorHAnsi" w:hAnsiTheme="minorHAnsi" w:cstheme="minorHAnsi"/>
-              </w:rPr>
-              <w:t xml:space="preserve"> </w:t>
-            </w:r>
-            <w:proofErr w:type="spellStart"/>
-            <w:r>
-              <w:rPr>
-                <w:rFonts w:asciiTheme="minorHAnsi" w:hAnsiTheme="minorHAnsi" w:cstheme="minorHAnsi"/>
-              </w:rPr>
-              <w:t>Rincian</w:t>
-            </w:r>
-            <w:proofErr w:type="spellEnd"/>
-            <w:r>
-              <w:rPr>
-                <w:rFonts w:asciiTheme="minorHAnsi" w:hAnsiTheme="minorHAnsi" w:cstheme="minorHAnsi"/>
-              </w:rPr>
-              <w:t xml:space="preserve"> Output</w:t>
+            <w:r>
+              <w:rPr>
+                <w:rFonts w:asciiTheme="minorHAnsi" w:hAnsiTheme="minorHAnsi" w:cstheme="minorHAnsi"/>
+              </w:rPr>
+              <w:t>Klasifikasi Rincian Output</w:t>
             </w:r>
           </w:p>
         </w:tc>
@@ -4411,21 +3336,7 @@
               <w:rPr>
                 <w:rFonts w:asciiTheme="minorHAnsi" w:hAnsiTheme="minorHAnsi" w:cstheme="minorHAnsi"/>
               </w:rPr>
-              <w:t>${</w:t>
-            </w:r>
-            <w:proofErr w:type="spellStart"/>
-            <w:r>
-              <w:rPr>
-                <w:rFonts w:asciiTheme="minorHAnsi" w:hAnsiTheme="minorHAnsi" w:cstheme="minorHAnsi"/>
-              </w:rPr>
-              <w:t>kro</w:t>
-            </w:r>
-            <w:proofErr w:type="spellEnd"/>
-            <w:r>
-              <w:rPr>
-                <w:rFonts w:asciiTheme="minorHAnsi" w:hAnsiTheme="minorHAnsi" w:cstheme="minorHAnsi"/>
-              </w:rPr>
-              <w:t>}</w:t>
+              <w:t>${kro}</w:t>
             </w:r>
           </w:p>
         </w:tc>
@@ -4481,19 +3392,11 @@
                 <w:lang w:val="nl-NL"/>
               </w:rPr>
             </w:pPr>
-            <w:proofErr w:type="spellStart"/>
-            <w:r>
-              <w:rPr>
-                <w:rFonts w:asciiTheme="minorHAnsi" w:hAnsiTheme="minorHAnsi" w:cstheme="minorHAnsi"/>
-              </w:rPr>
-              <w:t>Rincian</w:t>
-            </w:r>
-            <w:proofErr w:type="spellEnd"/>
-            <w:r>
-              <w:rPr>
-                <w:rFonts w:asciiTheme="minorHAnsi" w:hAnsiTheme="minorHAnsi" w:cstheme="minorHAnsi"/>
-              </w:rPr>
-              <w:t xml:space="preserve"> Output</w:t>
+            <w:r>
+              <w:rPr>
+                <w:rFonts w:asciiTheme="minorHAnsi" w:hAnsiTheme="minorHAnsi" w:cstheme="minorHAnsi"/>
+              </w:rPr>
+              <w:t>Rincian Output</w:t>
             </w:r>
           </w:p>
         </w:tc>
@@ -4547,21 +3450,7 @@
               <w:rPr>
                 <w:rFonts w:asciiTheme="minorHAnsi" w:hAnsiTheme="minorHAnsi" w:cstheme="minorHAnsi"/>
               </w:rPr>
-              <w:t>${</w:t>
-            </w:r>
-            <w:proofErr w:type="spellStart"/>
-            <w:r>
-              <w:rPr>
-                <w:rFonts w:asciiTheme="minorHAnsi" w:hAnsiTheme="minorHAnsi" w:cstheme="minorHAnsi"/>
-              </w:rPr>
-              <w:t>ro</w:t>
-            </w:r>
-            <w:proofErr w:type="spellEnd"/>
-            <w:r>
-              <w:rPr>
-                <w:rFonts w:asciiTheme="minorHAnsi" w:hAnsiTheme="minorHAnsi" w:cstheme="minorHAnsi"/>
-              </w:rPr>
-              <w:t>}</w:t>
+              <w:t>${ro}</w:t>
             </w:r>
           </w:p>
         </w:tc>
@@ -4616,14 +3505,12 @@
                 <w:rFonts w:asciiTheme="minorHAnsi" w:hAnsiTheme="minorHAnsi" w:cstheme="minorHAnsi"/>
               </w:rPr>
             </w:pPr>
-            <w:proofErr w:type="spellStart"/>
             <w:r>
               <w:rPr>
                 <w:rFonts w:asciiTheme="minorHAnsi" w:hAnsiTheme="minorHAnsi" w:cstheme="minorHAnsi"/>
               </w:rPr>
               <w:t>Komponen</w:t>
             </w:r>
-            <w:proofErr w:type="spellEnd"/>
           </w:p>
         </w:tc>
         <w:tc>
@@ -4676,21 +3563,7 @@
               <w:rPr>
                 <w:rFonts w:asciiTheme="minorHAnsi" w:hAnsiTheme="minorHAnsi" w:cstheme="minorHAnsi"/>
               </w:rPr>
-              <w:t>${</w:t>
-            </w:r>
-            <w:proofErr w:type="spellStart"/>
-            <w:r>
-              <w:rPr>
-                <w:rFonts w:asciiTheme="minorHAnsi" w:hAnsiTheme="minorHAnsi" w:cstheme="minorHAnsi"/>
-              </w:rPr>
-              <w:t>komponen</w:t>
-            </w:r>
-            <w:proofErr w:type="spellEnd"/>
-            <w:r>
-              <w:rPr>
-                <w:rFonts w:asciiTheme="minorHAnsi" w:hAnsiTheme="minorHAnsi" w:cstheme="minorHAnsi"/>
-              </w:rPr>
-              <w:t>}</w:t>
+              <w:t>${komponen}</w:t>
             </w:r>
           </w:p>
         </w:tc>
@@ -4750,16 +3623,8 @@
               <w:rPr>
                 <w:rFonts w:asciiTheme="minorHAnsi" w:hAnsiTheme="minorHAnsi" w:cstheme="minorHAnsi"/>
               </w:rPr>
-              <w:t xml:space="preserve">Sub </w:t>
-            </w:r>
-            <w:proofErr w:type="spellStart"/>
-            <w:r>
-              <w:rPr>
-                <w:rFonts w:asciiTheme="minorHAnsi" w:hAnsiTheme="minorHAnsi" w:cstheme="minorHAnsi"/>
-              </w:rPr>
-              <w:t>Komponen</w:t>
-            </w:r>
-            <w:proofErr w:type="spellEnd"/>
+              <w:t>Sub Komponen</w:t>
+            </w:r>
           </w:p>
         </w:tc>
         <w:tc>
@@ -4862,14 +3727,12 @@
                 <w:rFonts w:asciiTheme="minorHAnsi" w:hAnsiTheme="minorHAnsi" w:cstheme="minorHAnsi"/>
               </w:rPr>
             </w:pPr>
-            <w:proofErr w:type="spellStart"/>
             <w:r>
               <w:rPr>
                 <w:rFonts w:asciiTheme="minorHAnsi" w:hAnsiTheme="minorHAnsi" w:cstheme="minorHAnsi"/>
               </w:rPr>
               <w:t>Akun</w:t>
             </w:r>
-            <w:proofErr w:type="spellEnd"/>
           </w:p>
         </w:tc>
         <w:tc>
@@ -4923,21 +3786,7 @@
               <w:rPr>
                 <w:rFonts w:asciiTheme="minorHAnsi" w:hAnsiTheme="minorHAnsi" w:cstheme="minorHAnsi"/>
               </w:rPr>
-              <w:t>${</w:t>
-            </w:r>
-            <w:proofErr w:type="spellStart"/>
-            <w:r>
-              <w:rPr>
-                <w:rFonts w:asciiTheme="minorHAnsi" w:hAnsiTheme="minorHAnsi" w:cstheme="minorHAnsi"/>
-              </w:rPr>
-              <w:t>akun</w:t>
-            </w:r>
-            <w:proofErr w:type="spellEnd"/>
-            <w:r>
-              <w:rPr>
-                <w:rFonts w:asciiTheme="minorHAnsi" w:hAnsiTheme="minorHAnsi" w:cstheme="minorHAnsi"/>
-              </w:rPr>
-              <w:t>}</w:t>
+              <w:t>${akun}</w:t>
             </w:r>
           </w:p>
         </w:tc>
@@ -5209,181 +4058,12 @@
           <w:lang w:val="nl-NL"/>
         </w:rPr>
       </w:pPr>
-      <w:proofErr w:type="spellStart"/>
       <w:r>
         <w:rPr>
           <w:rFonts w:asciiTheme="minorHAnsi" w:hAnsiTheme="minorHAnsi" w:cstheme="minorHAnsi"/>
           <w:color w:val="000000"/>
         </w:rPr>
-        <w:t>Apabila</w:t>
-      </w:r>
-      <w:proofErr w:type="spellEnd"/>
-      <w:r>
-        <w:rPr>
-          <w:rFonts w:asciiTheme="minorHAnsi" w:hAnsiTheme="minorHAnsi" w:cstheme="minorHAnsi"/>
-          <w:color w:val="000000"/>
-        </w:rPr>
-        <w:t xml:space="preserve"> </w:t>
-      </w:r>
-      <w:proofErr w:type="spellStart"/>
-      <w:r>
-        <w:rPr>
-          <w:rFonts w:asciiTheme="minorHAnsi" w:hAnsiTheme="minorHAnsi" w:cstheme="minorHAnsi"/>
-          <w:color w:val="000000"/>
-        </w:rPr>
-        <w:t>batas</w:t>
-      </w:r>
-      <w:proofErr w:type="spellEnd"/>
-      <w:r>
-        <w:rPr>
-          <w:rFonts w:asciiTheme="minorHAnsi" w:hAnsiTheme="minorHAnsi" w:cstheme="minorHAnsi"/>
-          <w:color w:val="000000"/>
-        </w:rPr>
-        <w:t xml:space="preserve"> </w:t>
-      </w:r>
-      <w:proofErr w:type="spellStart"/>
-      <w:r>
-        <w:rPr>
-          <w:rFonts w:asciiTheme="minorHAnsi" w:hAnsiTheme="minorHAnsi" w:cstheme="minorHAnsi"/>
-          <w:color w:val="000000"/>
-        </w:rPr>
-        <w:t>waktu</w:t>
-      </w:r>
-      <w:proofErr w:type="spellEnd"/>
-      <w:r>
-        <w:rPr>
-          <w:rFonts w:asciiTheme="minorHAnsi" w:hAnsiTheme="minorHAnsi" w:cstheme="minorHAnsi"/>
-          <w:color w:val="000000"/>
-        </w:rPr>
-        <w:t xml:space="preserve"> yang </w:t>
-      </w:r>
-      <w:proofErr w:type="spellStart"/>
-      <w:r>
-        <w:rPr>
-          <w:rFonts w:asciiTheme="minorHAnsi" w:hAnsiTheme="minorHAnsi" w:cstheme="minorHAnsi"/>
-          <w:color w:val="000000"/>
-        </w:rPr>
-        <w:t>telah</w:t>
-      </w:r>
-      <w:proofErr w:type="spellEnd"/>
-      <w:r>
-        <w:rPr>
-          <w:rFonts w:asciiTheme="minorHAnsi" w:hAnsiTheme="minorHAnsi" w:cstheme="minorHAnsi"/>
-          <w:color w:val="000000"/>
-        </w:rPr>
-        <w:t xml:space="preserve"> </w:t>
-      </w:r>
-      <w:proofErr w:type="spellStart"/>
-      <w:r>
-        <w:rPr>
-          <w:rFonts w:asciiTheme="minorHAnsi" w:hAnsiTheme="minorHAnsi" w:cstheme="minorHAnsi"/>
-          <w:color w:val="000000"/>
-        </w:rPr>
-        <w:t>ditetapkan</w:t>
-      </w:r>
-      <w:proofErr w:type="spellEnd"/>
-      <w:r>
-        <w:rPr>
-          <w:rFonts w:asciiTheme="minorHAnsi" w:hAnsiTheme="minorHAnsi" w:cstheme="minorHAnsi"/>
-          <w:color w:val="000000"/>
-        </w:rPr>
-        <w:t xml:space="preserve"> </w:t>
-      </w:r>
-      <w:proofErr w:type="spellStart"/>
-      <w:r>
-        <w:rPr>
-          <w:rFonts w:asciiTheme="minorHAnsi" w:hAnsiTheme="minorHAnsi" w:cstheme="minorHAnsi"/>
-          <w:color w:val="000000"/>
-        </w:rPr>
-        <w:t>dilampaui</w:t>
-      </w:r>
-      <w:proofErr w:type="spellEnd"/>
-      <w:r>
-        <w:rPr>
-          <w:rFonts w:asciiTheme="minorHAnsi" w:hAnsiTheme="minorHAnsi" w:cstheme="minorHAnsi"/>
-          <w:color w:val="000000"/>
-        </w:rPr>
-        <w:t xml:space="preserve">, </w:t>
-      </w:r>
-      <w:proofErr w:type="spellStart"/>
-      <w:r>
-        <w:rPr>
-          <w:rFonts w:asciiTheme="minorHAnsi" w:hAnsiTheme="minorHAnsi" w:cstheme="minorHAnsi"/>
-          <w:color w:val="000000"/>
-        </w:rPr>
-        <w:t>maka</w:t>
-      </w:r>
-      <w:proofErr w:type="spellEnd"/>
-      <w:r>
-        <w:rPr>
-          <w:rFonts w:asciiTheme="minorHAnsi" w:hAnsiTheme="minorHAnsi" w:cstheme="minorHAnsi"/>
-          <w:color w:val="000000"/>
-        </w:rPr>
-        <w:t xml:space="preserve"> </w:t>
-      </w:r>
-      <w:proofErr w:type="spellStart"/>
-      <w:r>
-        <w:rPr>
-          <w:rFonts w:asciiTheme="minorHAnsi" w:hAnsiTheme="minorHAnsi" w:cstheme="minorHAnsi"/>
-          <w:color w:val="000000"/>
-        </w:rPr>
-        <w:t>Saudara</w:t>
-      </w:r>
-      <w:proofErr w:type="spellEnd"/>
-      <w:r>
-        <w:rPr>
-          <w:rFonts w:asciiTheme="minorHAnsi" w:hAnsiTheme="minorHAnsi" w:cstheme="minorHAnsi"/>
-          <w:color w:val="000000"/>
-        </w:rPr>
-        <w:t xml:space="preserve"> </w:t>
-      </w:r>
-      <w:proofErr w:type="spellStart"/>
-      <w:r>
-        <w:rPr>
-          <w:rFonts w:asciiTheme="minorHAnsi" w:hAnsiTheme="minorHAnsi" w:cstheme="minorHAnsi"/>
-          <w:color w:val="000000"/>
-        </w:rPr>
-        <w:t>dikenakan</w:t>
-      </w:r>
-      <w:proofErr w:type="spellEnd"/>
-      <w:r>
-        <w:rPr>
-          <w:rFonts w:asciiTheme="minorHAnsi" w:hAnsiTheme="minorHAnsi" w:cstheme="minorHAnsi"/>
-          <w:color w:val="000000"/>
-        </w:rPr>
-        <w:t xml:space="preserve"> </w:t>
-      </w:r>
-      <w:proofErr w:type="spellStart"/>
-      <w:r>
-        <w:rPr>
-          <w:rFonts w:asciiTheme="minorHAnsi" w:hAnsiTheme="minorHAnsi" w:cstheme="minorHAnsi"/>
-          <w:color w:val="000000"/>
-        </w:rPr>
-        <w:t>denda</w:t>
-      </w:r>
-      <w:proofErr w:type="spellEnd"/>
-      <w:r>
-        <w:rPr>
-          <w:rFonts w:asciiTheme="minorHAnsi" w:hAnsiTheme="minorHAnsi" w:cstheme="minorHAnsi"/>
-          <w:color w:val="000000"/>
-        </w:rPr>
-        <w:t xml:space="preserve"> </w:t>
-      </w:r>
-      <w:proofErr w:type="spellStart"/>
-      <w:r>
-        <w:rPr>
-          <w:rFonts w:asciiTheme="minorHAnsi" w:hAnsiTheme="minorHAnsi" w:cstheme="minorHAnsi"/>
-          <w:color w:val="000000"/>
-        </w:rPr>
-        <w:t>sebesar</w:t>
-      </w:r>
-      <w:proofErr w:type="spellEnd"/>
-      <w:r>
-        <w:rPr>
-          <w:rFonts w:asciiTheme="minorHAnsi" w:hAnsiTheme="minorHAnsi" w:cstheme="minorHAnsi"/>
-          <w:color w:val="000000"/>
-        </w:rPr>
-        <w:t xml:space="preserve"> 1 </w:t>
+        <w:t xml:space="preserve">Apabila batas waktu yang telah ditetapkan dilampaui, maka Saudara dikenakan denda sebesar 1 </w:t>
       </w:r>
       <w:r>
         <w:rPr>
@@ -5419,119 +4099,7 @@
         <w:rPr>
           <w:rFonts w:asciiTheme="minorHAnsi" w:hAnsiTheme="minorHAnsi" w:cstheme="minorHAnsi"/>
         </w:rPr>
-        <w:t xml:space="preserve"> </w:t>
-      </w:r>
-      <w:proofErr w:type="spellStart"/>
-      <w:r>
-        <w:rPr>
-          <w:rFonts w:asciiTheme="minorHAnsi" w:hAnsiTheme="minorHAnsi" w:cstheme="minorHAnsi"/>
-        </w:rPr>
-        <w:t>untuk</w:t>
-      </w:r>
-      <w:proofErr w:type="spellEnd"/>
-      <w:r>
-        <w:rPr>
-          <w:rFonts w:asciiTheme="minorHAnsi" w:hAnsiTheme="minorHAnsi" w:cstheme="minorHAnsi"/>
-        </w:rPr>
-        <w:t xml:space="preserve"> </w:t>
-      </w:r>
-      <w:proofErr w:type="spellStart"/>
-      <w:r>
-        <w:rPr>
-          <w:rFonts w:asciiTheme="minorHAnsi" w:hAnsiTheme="minorHAnsi" w:cstheme="minorHAnsi"/>
-        </w:rPr>
-        <w:t>setiap</w:t>
-      </w:r>
-      <w:proofErr w:type="spellEnd"/>
-      <w:r>
-        <w:rPr>
-          <w:rFonts w:asciiTheme="minorHAnsi" w:hAnsiTheme="minorHAnsi" w:cstheme="minorHAnsi"/>
-        </w:rPr>
-        <w:t xml:space="preserve"> </w:t>
-      </w:r>
-      <w:proofErr w:type="spellStart"/>
-      <w:r>
-        <w:rPr>
-          <w:rFonts w:asciiTheme="minorHAnsi" w:hAnsiTheme="minorHAnsi" w:cstheme="minorHAnsi"/>
-        </w:rPr>
-        <w:t>hari</w:t>
-      </w:r>
-      <w:proofErr w:type="spellEnd"/>
-      <w:r>
-        <w:rPr>
-          <w:rFonts w:asciiTheme="minorHAnsi" w:hAnsiTheme="minorHAnsi" w:cstheme="minorHAnsi"/>
-        </w:rPr>
-        <w:t xml:space="preserve"> </w:t>
-      </w:r>
-      <w:proofErr w:type="spellStart"/>
-      <w:r>
-        <w:rPr>
-          <w:rFonts w:asciiTheme="minorHAnsi" w:hAnsiTheme="minorHAnsi" w:cstheme="minorHAnsi"/>
-        </w:rPr>
-        <w:t>keterlambatan</w:t>
-      </w:r>
-      <w:proofErr w:type="spellEnd"/>
-      <w:r>
-        <w:rPr>
-          <w:rFonts w:asciiTheme="minorHAnsi" w:hAnsiTheme="minorHAnsi" w:cstheme="minorHAnsi"/>
-        </w:rPr>
-        <w:t xml:space="preserve"> </w:t>
-      </w:r>
-      <w:proofErr w:type="spellStart"/>
-      <w:r>
-        <w:rPr>
-          <w:rFonts w:asciiTheme="minorHAnsi" w:hAnsiTheme="minorHAnsi" w:cstheme="minorHAnsi"/>
-        </w:rPr>
-        <w:t>dari</w:t>
-      </w:r>
-      <w:proofErr w:type="spellEnd"/>
-      <w:r>
-        <w:rPr>
-          <w:rFonts w:asciiTheme="minorHAnsi" w:hAnsiTheme="minorHAnsi" w:cstheme="minorHAnsi"/>
-        </w:rPr>
-        <w:t xml:space="preserve"> </w:t>
-      </w:r>
-      <w:proofErr w:type="spellStart"/>
-      <w:r>
-        <w:rPr>
-          <w:rFonts w:asciiTheme="minorHAnsi" w:hAnsiTheme="minorHAnsi" w:cstheme="minorHAnsi"/>
-        </w:rPr>
-        <w:t>seluruh</w:t>
-      </w:r>
-      <w:proofErr w:type="spellEnd"/>
-      <w:r>
-        <w:rPr>
-          <w:rFonts w:asciiTheme="minorHAnsi" w:hAnsiTheme="minorHAnsi" w:cstheme="minorHAnsi"/>
-        </w:rPr>
-        <w:t xml:space="preserve"> </w:t>
-      </w:r>
-      <w:proofErr w:type="spellStart"/>
-      <w:r>
-        <w:rPr>
-          <w:rFonts w:asciiTheme="minorHAnsi" w:hAnsiTheme="minorHAnsi" w:cstheme="minorHAnsi"/>
-        </w:rPr>
-        <w:t>nilai</w:t>
-      </w:r>
-      <w:proofErr w:type="spellEnd"/>
-      <w:r>
-        <w:rPr>
-          <w:rFonts w:asciiTheme="minorHAnsi" w:hAnsiTheme="minorHAnsi" w:cstheme="minorHAnsi"/>
-        </w:rPr>
-        <w:t xml:space="preserve"> </w:t>
-      </w:r>
-      <w:proofErr w:type="spellStart"/>
-      <w:r>
-        <w:rPr>
-          <w:rFonts w:asciiTheme="minorHAnsi" w:hAnsiTheme="minorHAnsi" w:cstheme="minorHAnsi"/>
-        </w:rPr>
-        <w:t>pekerjaan</w:t>
-      </w:r>
-      <w:proofErr w:type="spellEnd"/>
-      <w:r>
-        <w:rPr>
-          <w:rFonts w:asciiTheme="minorHAnsi" w:hAnsiTheme="minorHAnsi" w:cstheme="minorHAnsi"/>
-        </w:rPr>
-        <w:t>.</w:t>
+        <w:t xml:space="preserve"> untuk setiap hari keterlambatan dari seluruh nilai pekerjaan.</w:t>
       </w:r>
     </w:p>
     <w:p>
@@ -5596,7 +4164,6 @@
                 <w:lang w:val="es-ES"/>
               </w:rPr>
             </w:pPr>
-            <w:proofErr w:type="spellStart"/>
             <w:r>
               <w:rPr>
                 <w:rFonts w:asciiTheme="minorHAnsi" w:hAnsiTheme="minorHAnsi" w:cstheme="minorHAnsi"/>
@@ -5605,62 +4172,23 @@
                 <w:color w:val="auto"/>
                 <w:lang w:val="es-ES"/>
               </w:rPr>
-              <w:t>Setuju</w:t>
-            </w:r>
-            <w:proofErr w:type="spellEnd"/>
-            <w:r>
-              <w:rPr>
-                <w:rFonts w:asciiTheme="minorHAnsi" w:hAnsiTheme="minorHAnsi" w:cstheme="minorHAnsi"/>
-                <w:i w:val="0"/>
-                <w:iCs w:val="0"/>
-                <w:color w:val="auto"/>
+              <w:t>Setuju Melaksanakan</w:t>
+            </w:r>
+          </w:p>
+          <w:p>
+            <w:pPr>
+              <w:jc w:val="center"/>
+              <w:rPr>
+                <w:rFonts w:asciiTheme="minorHAnsi" w:hAnsiTheme="minorHAnsi" w:cstheme="minorHAnsi"/>
                 <w:lang w:val="es-ES"/>
               </w:rPr>
-              <w:t xml:space="preserve"> </w:t>
-            </w:r>
-            <w:proofErr w:type="spellStart"/>
-            <w:r>
-              <w:rPr>
-                <w:rFonts w:asciiTheme="minorHAnsi" w:hAnsiTheme="minorHAnsi" w:cstheme="minorHAnsi"/>
-                <w:i w:val="0"/>
-                <w:iCs w:val="0"/>
-                <w:color w:val="auto"/>
+            </w:pPr>
+            <w:r>
+              <w:rPr>
+                <w:rFonts w:asciiTheme="minorHAnsi" w:hAnsiTheme="minorHAnsi" w:cstheme="minorHAnsi"/>
                 <w:lang w:val="es-ES"/>
               </w:rPr>
-              <w:t>Melaksanakan</w:t>
-            </w:r>
-            <w:proofErr w:type="spellEnd"/>
-          </w:p>
-          <w:p>
-            <w:pPr>
-              <w:jc w:val="center"/>
-              <w:rPr>
-                <w:rFonts w:asciiTheme="minorHAnsi" w:hAnsiTheme="minorHAnsi" w:cstheme="minorHAnsi"/>
-                <w:lang w:val="es-ES"/>
-              </w:rPr>
-            </w:pPr>
-            <w:r>
-              <w:rPr>
-                <w:rFonts w:asciiTheme="minorHAnsi" w:hAnsiTheme="minorHAnsi" w:cstheme="minorHAnsi"/>
-                <w:lang w:val="es-ES"/>
-              </w:rPr>
-              <w:t>${</w:t>
-            </w:r>
-            <w:proofErr w:type="spellStart"/>
-            <w:r>
-              <w:rPr>
-                <w:rFonts w:asciiTheme="minorHAnsi" w:hAnsiTheme="minorHAnsi" w:cstheme="minorHAnsi"/>
-                <w:lang w:val="es-ES"/>
-              </w:rPr>
-              <w:t>penyedia</w:t>
-            </w:r>
-            <w:proofErr w:type="spellEnd"/>
-            <w:r>
-              <w:rPr>
-                <w:rFonts w:asciiTheme="minorHAnsi" w:hAnsiTheme="minorHAnsi" w:cstheme="minorHAnsi"/>
-                <w:lang w:val="es-ES"/>
-              </w:rPr>
-              <w:t>}</w:t>
+              <w:t>${penyedia}</w:t>
             </w:r>
           </w:p>
           <w:p>
@@ -6177,14 +4705,12 @@
                 <w:rFonts w:asciiTheme="minorHAnsi" w:eastAsia="Times New Roman" w:hAnsiTheme="minorHAnsi" w:cstheme="minorHAnsi"/>
               </w:rPr>
             </w:pPr>
-            <w:proofErr w:type="spellStart"/>
             <w:r>
               <w:rPr>
                 <w:rFonts w:asciiTheme="minorHAnsi" w:eastAsia="Times New Roman" w:hAnsiTheme="minorHAnsi" w:cstheme="minorHAnsi"/>
               </w:rPr>
               <w:t>Nomor</w:t>
             </w:r>
-            <w:proofErr w:type="spellEnd"/>
           </w:p>
         </w:tc>
         <w:tc>
@@ -6225,21 +4751,7 @@
               <w:rPr>
                 <w:rFonts w:asciiTheme="minorHAnsi" w:eastAsia="Times New Roman" w:hAnsiTheme="minorHAnsi" w:cstheme="minorHAnsi"/>
               </w:rPr>
-              <w:t>${</w:t>
-            </w:r>
-            <w:proofErr w:type="spellStart"/>
-            <w:r>
-              <w:rPr>
-                <w:rFonts w:asciiTheme="minorHAnsi" w:eastAsia="Times New Roman" w:hAnsiTheme="minorHAnsi" w:cstheme="minorHAnsi"/>
-              </w:rPr>
-              <w:t>no_sp</w:t>
-            </w:r>
-            <w:proofErr w:type="spellEnd"/>
-            <w:r>
-              <w:rPr>
-                <w:rFonts w:asciiTheme="minorHAnsi" w:eastAsia="Times New Roman" w:hAnsiTheme="minorHAnsi" w:cstheme="minorHAnsi"/>
-              </w:rPr>
-              <w:t>}</w:t>
+              <w:t>${no_sp}</w:t>
             </w:r>
           </w:p>
         </w:tc>
@@ -6270,14 +4782,12 @@
                 <w:rFonts w:asciiTheme="minorHAnsi" w:eastAsia="Times New Roman" w:hAnsiTheme="minorHAnsi" w:cstheme="minorHAnsi"/>
               </w:rPr>
             </w:pPr>
-            <w:proofErr w:type="spellStart"/>
             <w:r>
               <w:rPr>
                 <w:rFonts w:asciiTheme="minorHAnsi" w:eastAsia="Times New Roman" w:hAnsiTheme="minorHAnsi" w:cstheme="minorHAnsi"/>
               </w:rPr>
               <w:t>Tanggal</w:t>
             </w:r>
-            <w:proofErr w:type="spellEnd"/>
           </w:p>
         </w:tc>
         <w:tc>
@@ -6312,21 +4822,7 @@
               <w:rPr>
                 <w:rFonts w:asciiTheme="minorHAnsi" w:eastAsia="Times New Roman" w:hAnsiTheme="minorHAnsi" w:cstheme="minorHAnsi"/>
               </w:rPr>
-              <w:t>${</w:t>
-            </w:r>
-            <w:proofErr w:type="spellStart"/>
-            <w:r>
-              <w:rPr>
-                <w:rFonts w:asciiTheme="minorHAnsi" w:eastAsia="Times New Roman" w:hAnsiTheme="minorHAnsi" w:cstheme="minorHAnsi"/>
-              </w:rPr>
-              <w:t>tgl_sp</w:t>
-            </w:r>
-            <w:proofErr w:type="spellEnd"/>
-            <w:r>
-              <w:rPr>
-                <w:rFonts w:asciiTheme="minorHAnsi" w:eastAsia="Times New Roman" w:hAnsiTheme="minorHAnsi" w:cstheme="minorHAnsi"/>
-              </w:rPr>
-              <w:t>}</w:t>
+              <w:t>${tgl_sp}</w:t>
             </w:r>
           </w:p>
         </w:tc>
@@ -6460,7 +4956,6 @@
                 <w:lang w:eastAsia="id-ID"/>
               </w:rPr>
             </w:pPr>
-            <w:proofErr w:type="spellStart"/>
             <w:r>
               <w:rPr>
                 <w:rFonts w:asciiTheme="minorHAnsi" w:eastAsia="Times New Roman" w:hAnsiTheme="minorHAnsi" w:cstheme="minorHAnsi"/>
@@ -6470,7 +4965,6 @@
               </w:rPr>
               <w:t>Uraian</w:t>
             </w:r>
-            <w:proofErr w:type="spellEnd"/>
           </w:p>
         </w:tc>
         <w:tc>
@@ -6494,7 +4988,6 @@
                 <w:lang w:eastAsia="id-ID"/>
               </w:rPr>
             </w:pPr>
-            <w:proofErr w:type="spellStart"/>
             <w:r>
               <w:rPr>
                 <w:rFonts w:asciiTheme="minorHAnsi" w:eastAsia="Times New Roman" w:hAnsiTheme="minorHAnsi" w:cstheme="minorHAnsi"/>
@@ -6504,7 +4997,6 @@
               </w:rPr>
               <w:t>Spesifikasi</w:t>
             </w:r>
-            <w:proofErr w:type="spellEnd"/>
           </w:p>
         </w:tc>
         <w:tc>
@@ -6572,27 +5064,7 @@
                 <w:bCs/>
                 <w:lang w:eastAsia="id-ID"/>
               </w:rPr>
-              <w:t xml:space="preserve">Harga </w:t>
-            </w:r>
-            <w:proofErr w:type="spellStart"/>
-            <w:r>
-              <w:rPr>
-                <w:rFonts w:asciiTheme="minorHAnsi" w:eastAsia="Times New Roman" w:hAnsiTheme="minorHAnsi" w:cstheme="minorHAnsi"/>
-                <w:b/>
-                <w:bCs/>
-                <w:lang w:eastAsia="id-ID"/>
-              </w:rPr>
-              <w:t>Satuan</w:t>
-            </w:r>
-            <w:proofErr w:type="spellEnd"/>
-            <w:r>
-              <w:rPr>
-                <w:rFonts w:asciiTheme="minorHAnsi" w:eastAsia="Times New Roman" w:hAnsiTheme="minorHAnsi" w:cstheme="minorHAnsi"/>
-                <w:b/>
-                <w:bCs/>
-                <w:lang w:eastAsia="id-ID"/>
-              </w:rPr>
-              <w:t xml:space="preserve"> (Rp)</w:t>
+              <w:t>Harga Satuan (Rp)</w:t>
             </w:r>
           </w:p>
         </w:tc>
@@ -6620,8 +5092,6 @@
                 <w:lang w:eastAsia="id-ID"/>
               </w:rPr>
             </w:pPr>
-            <w:proofErr w:type="spellStart"/>
-            <w:proofErr w:type="gramStart"/>
             <w:r>
               <w:rPr>
                 <w:rFonts w:asciiTheme="minorHAnsi" w:eastAsia="Times New Roman" w:hAnsiTheme="minorHAnsi" w:cstheme="minorHAnsi"/>
@@ -6629,27 +5099,7 @@
                 <w:bCs/>
                 <w:lang w:eastAsia="id-ID"/>
               </w:rPr>
-              <w:t>Jumlah</w:t>
-            </w:r>
-            <w:proofErr w:type="spellEnd"/>
-            <w:r>
-              <w:rPr>
-                <w:rFonts w:asciiTheme="minorHAnsi" w:eastAsia="Times New Roman" w:hAnsiTheme="minorHAnsi" w:cstheme="minorHAnsi"/>
-                <w:b/>
-                <w:bCs/>
-                <w:lang w:eastAsia="id-ID"/>
-              </w:rPr>
-              <w:t xml:space="preserve">  (</w:t>
-            </w:r>
-            <w:proofErr w:type="gramEnd"/>
-            <w:r>
-              <w:rPr>
-                <w:rFonts w:asciiTheme="minorHAnsi" w:eastAsia="Times New Roman" w:hAnsiTheme="minorHAnsi" w:cstheme="minorHAnsi"/>
-                <w:b/>
-                <w:bCs/>
-                <w:lang w:eastAsia="id-ID"/>
-              </w:rPr>
-              <w:t>Rp)</w:t>
+              <w:t>Jumlah  (Rp)</w:t>
             </w:r>
           </w:p>
         </w:tc>
@@ -6948,23 +5398,7 @@
                 <w:rFonts w:asciiTheme="minorHAnsi" w:eastAsia="Times New Roman" w:hAnsiTheme="minorHAnsi" w:cstheme="minorHAnsi"/>
                 <w:color w:val="000000"/>
               </w:rPr>
-              <w:t>${</w:t>
-            </w:r>
-            <w:proofErr w:type="spellStart"/>
-            <w:r>
-              <w:rPr>
-                <w:rFonts w:asciiTheme="minorHAnsi" w:eastAsia="Times New Roman" w:hAnsiTheme="minorHAnsi" w:cstheme="minorHAnsi"/>
-                <w:color w:val="000000"/>
-              </w:rPr>
-              <w:t>spek_spek</w:t>
-            </w:r>
-            <w:proofErr w:type="spellEnd"/>
-            <w:r>
-              <w:rPr>
-                <w:rFonts w:asciiTheme="minorHAnsi" w:eastAsia="Times New Roman" w:hAnsiTheme="minorHAnsi" w:cstheme="minorHAnsi"/>
-                <w:color w:val="000000"/>
-              </w:rPr>
-              <w:t>}</w:t>
+              <w:t>${spek_spek}</w:t>
             </w:r>
           </w:p>
         </w:tc>
@@ -7152,23 +5586,7 @@
                 <w:rFonts w:asciiTheme="minorHAnsi" w:hAnsiTheme="minorHAnsi" w:cstheme="minorHAnsi"/>
                 <w:color w:val="000000"/>
               </w:rPr>
-              <w:t>${</w:t>
-            </w:r>
-            <w:proofErr w:type="spellStart"/>
-            <w:r>
-              <w:rPr>
-                <w:rFonts w:asciiTheme="minorHAnsi" w:hAnsiTheme="minorHAnsi" w:cstheme="minorHAnsi"/>
-                <w:color w:val="000000"/>
-              </w:rPr>
-              <w:t>jumlah_bayar</w:t>
-            </w:r>
-            <w:proofErr w:type="spellEnd"/>
-            <w:r>
-              <w:rPr>
-                <w:rFonts w:asciiTheme="minorHAnsi" w:hAnsiTheme="minorHAnsi" w:cstheme="minorHAnsi"/>
-                <w:color w:val="000000"/>
-              </w:rPr>
-              <w:t>}</w:t>
+              <w:t>${jumlah_bayar}</w:t>
             </w:r>
           </w:p>
         </w:tc>
@@ -7204,25 +5622,7 @@
                 <w:b/>
                 <w:lang w:eastAsia="id-ID"/>
               </w:rPr>
-              <w:t>${</w:t>
-            </w:r>
-            <w:proofErr w:type="spellStart"/>
-            <w:r>
-              <w:rPr>
-                <w:rFonts w:asciiTheme="minorHAnsi" w:eastAsia="Times New Roman" w:hAnsiTheme="minorHAnsi" w:cstheme="minorHAnsi"/>
-                <w:b/>
-                <w:lang w:eastAsia="id-ID"/>
-              </w:rPr>
-              <w:t>terbilang_jumlah_bayar</w:t>
-            </w:r>
-            <w:proofErr w:type="spellEnd"/>
-            <w:r>
-              <w:rPr>
-                <w:rFonts w:asciiTheme="minorHAnsi" w:eastAsia="Times New Roman" w:hAnsiTheme="minorHAnsi" w:cstheme="minorHAnsi"/>
-                <w:b/>
-                <w:lang w:eastAsia="id-ID"/>
-              </w:rPr>
-              <w:t>}</w:t>
+              <w:t>${terbilang_jumlah_bayar}</w:t>
             </w:r>
           </w:p>
         </w:tc>
@@ -7312,7 +5712,6 @@
                 <w:lang w:val="es-ES"/>
               </w:rPr>
             </w:pPr>
-            <w:proofErr w:type="spellStart"/>
             <w:r>
               <w:rPr>
                 <w:rFonts w:asciiTheme="minorHAnsi" w:hAnsiTheme="minorHAnsi" w:cstheme="minorHAnsi"/>
@@ -7321,62 +5720,23 @@
                 <w:color w:val="auto"/>
                 <w:lang w:val="es-ES"/>
               </w:rPr>
-              <w:t>Setuju</w:t>
-            </w:r>
-            <w:proofErr w:type="spellEnd"/>
-            <w:r>
-              <w:rPr>
-                <w:rFonts w:asciiTheme="minorHAnsi" w:hAnsiTheme="minorHAnsi" w:cstheme="minorHAnsi"/>
-                <w:i w:val="0"/>
-                <w:iCs w:val="0"/>
-                <w:color w:val="auto"/>
+              <w:t>Setuju Melaksanakan</w:t>
+            </w:r>
+          </w:p>
+          <w:p>
+            <w:pPr>
+              <w:jc w:val="center"/>
+              <w:rPr>
+                <w:rFonts w:asciiTheme="minorHAnsi" w:hAnsiTheme="minorHAnsi" w:cstheme="minorHAnsi"/>
                 <w:lang w:val="es-ES"/>
               </w:rPr>
-              <w:t xml:space="preserve"> </w:t>
-            </w:r>
-            <w:proofErr w:type="spellStart"/>
-            <w:r>
-              <w:rPr>
-                <w:rFonts w:asciiTheme="minorHAnsi" w:hAnsiTheme="minorHAnsi" w:cstheme="minorHAnsi"/>
-                <w:i w:val="0"/>
-                <w:iCs w:val="0"/>
-                <w:color w:val="auto"/>
+            </w:pPr>
+            <w:r>
+              <w:rPr>
+                <w:rFonts w:asciiTheme="minorHAnsi" w:hAnsiTheme="minorHAnsi" w:cstheme="minorHAnsi"/>
                 <w:lang w:val="es-ES"/>
               </w:rPr>
-              <w:t>Melaksanakan</w:t>
-            </w:r>
-            <w:proofErr w:type="spellEnd"/>
-          </w:p>
-          <w:p>
-            <w:pPr>
-              <w:jc w:val="center"/>
-              <w:rPr>
-                <w:rFonts w:asciiTheme="minorHAnsi" w:hAnsiTheme="minorHAnsi" w:cstheme="minorHAnsi"/>
-                <w:lang w:val="es-ES"/>
-              </w:rPr>
-            </w:pPr>
-            <w:r>
-              <w:rPr>
-                <w:rFonts w:asciiTheme="minorHAnsi" w:hAnsiTheme="minorHAnsi" w:cstheme="minorHAnsi"/>
-                <w:lang w:val="es-ES"/>
-              </w:rPr>
-              <w:t>${</w:t>
-            </w:r>
-            <w:proofErr w:type="spellStart"/>
-            <w:r>
-              <w:rPr>
-                <w:rFonts w:asciiTheme="minorHAnsi" w:hAnsiTheme="minorHAnsi" w:cstheme="minorHAnsi"/>
-                <w:lang w:val="es-ES"/>
-              </w:rPr>
-              <w:t>penyedia</w:t>
-            </w:r>
-            <w:proofErr w:type="spellEnd"/>
-            <w:r>
-              <w:rPr>
-                <w:rFonts w:asciiTheme="minorHAnsi" w:hAnsiTheme="minorHAnsi" w:cstheme="minorHAnsi"/>
-                <w:lang w:val="es-ES"/>
-              </w:rPr>
-              <w:t>}</w:t>
+              <w:t>${penyedia}</w:t>
             </w:r>
           </w:p>
           <w:p>
@@ -7848,23 +6208,7 @@
           <w:rFonts w:asciiTheme="minorHAnsi" w:hAnsiTheme="minorHAnsi" w:cstheme="minorHAnsi"/>
           <w:b/>
         </w:rPr>
-        <w:t>${</w:t>
-      </w:r>
-      <w:proofErr w:type="spellStart"/>
-      <w:r>
-        <w:rPr>
-          <w:rFonts w:asciiTheme="minorHAnsi" w:hAnsiTheme="minorHAnsi" w:cstheme="minorHAnsi"/>
-          <w:b/>
-        </w:rPr>
-        <w:t>terbilang_tgl_bast</w:t>
-      </w:r>
-      <w:proofErr w:type="spellEnd"/>
-      <w:r>
-        <w:rPr>
-          <w:rFonts w:asciiTheme="minorHAnsi" w:hAnsiTheme="minorHAnsi" w:cstheme="minorHAnsi"/>
-          <w:b/>
-        </w:rPr>
-        <w:t xml:space="preserve">}, </w:t>
+        <w:t xml:space="preserve">${terbilang_tgl_bast}, </w:t>
       </w:r>
       <w:r>
         <w:rPr>
@@ -7930,79 +6274,7 @@
           <w:sz w:val="20"/>
           <w:szCs w:val="20"/>
         </w:rPr>
-        <w:t xml:space="preserve"> </w:t>
-      </w:r>
-      <w:proofErr w:type="spellStart"/>
-      <w:r>
-        <w:rPr>
-          <w:rFonts w:cstheme="minorHAnsi"/>
-          <w:sz w:val="20"/>
-          <w:szCs w:val="20"/>
-        </w:rPr>
-        <w:t>Pejabat</w:t>
-      </w:r>
-      <w:proofErr w:type="spellEnd"/>
-      <w:r>
-        <w:rPr>
-          <w:rFonts w:cstheme="minorHAnsi"/>
-          <w:sz w:val="20"/>
-          <w:szCs w:val="20"/>
-        </w:rPr>
-        <w:t xml:space="preserve"> </w:t>
-      </w:r>
-      <w:proofErr w:type="spellStart"/>
-      <w:r>
-        <w:rPr>
-          <w:rFonts w:cstheme="minorHAnsi"/>
-          <w:sz w:val="20"/>
-          <w:szCs w:val="20"/>
-        </w:rPr>
-        <w:t>Pembuat</w:t>
-      </w:r>
-      <w:proofErr w:type="spellEnd"/>
-      <w:r>
-        <w:rPr>
-          <w:rFonts w:cstheme="minorHAnsi"/>
-          <w:sz w:val="20"/>
-          <w:szCs w:val="20"/>
-        </w:rPr>
-        <w:t xml:space="preserve"> </w:t>
-      </w:r>
-      <w:proofErr w:type="spellStart"/>
-      <w:r>
-        <w:rPr>
-          <w:rFonts w:cstheme="minorHAnsi"/>
-          <w:sz w:val="20"/>
-          <w:szCs w:val="20"/>
-        </w:rPr>
-        <w:t>Komitmen</w:t>
-      </w:r>
-      <w:proofErr w:type="spellEnd"/>
-      <w:r>
-        <w:rPr>
-          <w:rFonts w:cstheme="minorHAnsi"/>
-          <w:sz w:val="20"/>
-          <w:szCs w:val="20"/>
-        </w:rPr>
-        <w:t xml:space="preserve"> BPS </w:t>
-      </w:r>
-      <w:proofErr w:type="spellStart"/>
-      <w:r>
-        <w:rPr>
-          <w:rFonts w:cstheme="minorHAnsi"/>
-          <w:sz w:val="20"/>
-          <w:szCs w:val="20"/>
-        </w:rPr>
-        <w:t>Kabupaten</w:t>
-      </w:r>
-      <w:proofErr w:type="spellEnd"/>
-      <w:r>
-        <w:rPr>
-          <w:rFonts w:cstheme="minorHAnsi"/>
-          <w:sz w:val="20"/>
-          <w:szCs w:val="20"/>
-        </w:rPr>
-        <w:t xml:space="preserve"> Hulu Sungai Tengah</w:t>
+        <w:t xml:space="preserve"> Pejabat Pembuat Komitmen BPS Kabupaten Hulu Sungai Tengah</w:t>
       </w:r>
       <w:r>
         <w:rPr>
@@ -8133,17 +6405,8 @@
           <w:rFonts w:asciiTheme="minorHAnsi" w:hAnsiTheme="minorHAnsi" w:cstheme="minorHAnsi"/>
           <w:b/>
         </w:rPr>
-        <w:t xml:space="preserve">MENYATAKAN </w:t>
+        <w:t>MENYATAKAN BAHWA :</w:t>
       </w:r>
-      <w:proofErr w:type="gramStart"/>
-      <w:r>
-        <w:rPr>
-          <w:rFonts w:asciiTheme="minorHAnsi" w:hAnsiTheme="minorHAnsi" w:cstheme="minorHAnsi"/>
-          <w:b/>
-        </w:rPr>
-        <w:t>BAHWA :</w:t>
-      </w:r>
-      <w:proofErr w:type="gramEnd"/>
     </w:p>
     <w:p>
       <w:pPr>
@@ -8173,232 +6436,53 @@
         <w:rPr>
           <w:rFonts w:asciiTheme="minorHAnsi" w:hAnsiTheme="minorHAnsi" w:cstheme="minorHAnsi"/>
         </w:rPr>
-        <w:t xml:space="preserve"> </w:t>
+        <w:t xml:space="preserve"> menyerahkan barang/hasil pekerjaan</w:t>
       </w:r>
-      <w:proofErr w:type="spellStart"/>
       <w:r>
         <w:rPr>
           <w:rFonts w:asciiTheme="minorHAnsi" w:hAnsiTheme="minorHAnsi" w:cstheme="minorHAnsi"/>
-        </w:rPr>
-        <w:t>menyerahkan</w:t>
-      </w:r>
-      <w:proofErr w:type="spellEnd"/>
-      <w:r>
-        <w:rPr>
-          <w:rFonts w:asciiTheme="minorHAnsi" w:hAnsiTheme="minorHAnsi" w:cstheme="minorHAnsi"/>
-        </w:rPr>
-        <w:t xml:space="preserve"> </w:t>
-      </w:r>
-      <w:proofErr w:type="spellStart"/>
-      <w:r>
-        <w:rPr>
-          <w:rFonts w:asciiTheme="minorHAnsi" w:hAnsiTheme="minorHAnsi" w:cstheme="minorHAnsi"/>
-        </w:rPr>
-        <w:t>barang</w:t>
-      </w:r>
-      <w:proofErr w:type="spellEnd"/>
-      <w:r>
-        <w:rPr>
-          <w:rFonts w:asciiTheme="minorHAnsi" w:hAnsiTheme="minorHAnsi" w:cstheme="minorHAnsi"/>
-        </w:rPr>
-        <w:t>/</w:t>
-      </w:r>
-      <w:proofErr w:type="spellStart"/>
-      <w:r>
-        <w:rPr>
-          <w:rFonts w:asciiTheme="minorHAnsi" w:hAnsiTheme="minorHAnsi" w:cstheme="minorHAnsi"/>
-        </w:rPr>
-        <w:t>hasil</w:t>
-      </w:r>
-      <w:proofErr w:type="spellEnd"/>
-      <w:r>
-        <w:rPr>
-          <w:rFonts w:asciiTheme="minorHAnsi" w:hAnsiTheme="minorHAnsi" w:cstheme="minorHAnsi"/>
-        </w:rPr>
-        <w:t xml:space="preserve"> </w:t>
-      </w:r>
-      <w:proofErr w:type="spellStart"/>
-      <w:r>
-        <w:rPr>
-          <w:rFonts w:asciiTheme="minorHAnsi" w:hAnsiTheme="minorHAnsi" w:cstheme="minorHAnsi"/>
-        </w:rPr>
-        <w:t>pekerjaan</w:t>
-      </w:r>
-      <w:proofErr w:type="spellEnd"/>
-      <w:r>
-        <w:rPr>
-          <w:rFonts w:asciiTheme="minorHAnsi" w:hAnsiTheme="minorHAnsi" w:cstheme="minorHAnsi"/>
           <w:lang w:val="fi-FI"/>
-        </w:rPr>
-        <w:t xml:space="preserve"> </w:t>
-      </w:r>
-      <w:proofErr w:type="spellStart"/>
-      <w:r>
-        <w:rPr>
-          <w:rFonts w:asciiTheme="minorHAnsi" w:hAnsiTheme="minorHAnsi" w:cstheme="minorHAnsi"/>
-        </w:rPr>
-        <w:t>sesuai</w:t>
-      </w:r>
-      <w:proofErr w:type="spellEnd"/>
-      <w:r>
-        <w:rPr>
-          <w:rFonts w:asciiTheme="minorHAnsi" w:hAnsiTheme="minorHAnsi" w:cstheme="minorHAnsi"/>
         </w:rPr>
         <w:t xml:space="preserve"> </w:t>
       </w:r>
       <w:r>
         <w:rPr>
           <w:rFonts w:asciiTheme="minorHAnsi" w:hAnsiTheme="minorHAnsi" w:cstheme="minorHAnsi"/>
-          <w:bCs/>
-        </w:rPr>
-        <w:t xml:space="preserve">Surat </w:t>
-      </w:r>
-      <w:proofErr w:type="spellStart"/>
-      <w:r>
-        <w:rPr>
-          <w:rFonts w:asciiTheme="minorHAnsi" w:hAnsiTheme="minorHAnsi" w:cstheme="minorHAnsi"/>
-          <w:bCs/>
-        </w:rPr>
-        <w:t>Permintaan</w:t>
-      </w:r>
-      <w:proofErr w:type="spellEnd"/>
-      <w:r>
-        <w:rPr>
-          <w:rFonts w:asciiTheme="minorHAnsi" w:hAnsiTheme="minorHAnsi" w:cstheme="minorHAnsi"/>
-          <w:bCs/>
-        </w:rPr>
-        <w:t xml:space="preserve"> </w:t>
-      </w:r>
-      <w:proofErr w:type="spellStart"/>
-      <w:r>
-        <w:rPr>
-          <w:rFonts w:asciiTheme="minorHAnsi" w:hAnsiTheme="minorHAnsi" w:cstheme="minorHAnsi"/>
-          <w:bCs/>
-        </w:rPr>
-        <w:t>Nomor</w:t>
-      </w:r>
-      <w:proofErr w:type="spellEnd"/>
-      <w:r>
-        <w:rPr>
-          <w:rFonts w:asciiTheme="minorHAnsi" w:hAnsiTheme="minorHAnsi" w:cstheme="minorHAnsi"/>
-          <w:bCs/>
-        </w:rPr>
-        <w:t xml:space="preserve">: </w:t>
+        </w:rPr>
+        <w:t xml:space="preserve">sesuai </w:t>
       </w:r>
       <w:r>
         <w:rPr>
           <w:rFonts w:asciiTheme="minorHAnsi" w:hAnsiTheme="minorHAnsi" w:cstheme="minorHAnsi"/>
-        </w:rPr>
-        <w:t>${</w:t>
-      </w:r>
-      <w:proofErr w:type="spellStart"/>
-      <w:r>
-        <w:rPr>
-          <w:rFonts w:asciiTheme="minorHAnsi" w:hAnsiTheme="minorHAnsi" w:cstheme="minorHAnsi"/>
-        </w:rPr>
-        <w:t>no_sp</w:t>
-      </w:r>
-      <w:proofErr w:type="spellEnd"/>
-      <w:r>
-        <w:rPr>
-          <w:rFonts w:asciiTheme="minorHAnsi" w:hAnsiTheme="minorHAnsi" w:cstheme="minorHAnsi"/>
-        </w:rPr>
-        <w:t xml:space="preserve">} </w:t>
-      </w:r>
-      <w:proofErr w:type="spellStart"/>
-      <w:r>
-        <w:rPr>
-          <w:rFonts w:asciiTheme="minorHAnsi" w:hAnsiTheme="minorHAnsi" w:cstheme="minorHAnsi"/>
-          <w:spacing w:val="-3"/>
-        </w:rPr>
-        <w:t>tanggal</w:t>
-      </w:r>
-      <w:proofErr w:type="spellEnd"/>
-      <w:r>
-        <w:rPr>
-          <w:rFonts w:asciiTheme="minorHAnsi" w:hAnsiTheme="minorHAnsi" w:cstheme="minorHAnsi"/>
-          <w:spacing w:val="-3"/>
-        </w:rPr>
-        <w:t xml:space="preserve"> </w:t>
+          <w:bCs/>
+        </w:rPr>
+        <w:t xml:space="preserve">Surat Permintaan Nomor: </w:t>
       </w:r>
       <w:r>
         <w:rPr>
           <w:rFonts w:asciiTheme="minorHAnsi" w:hAnsiTheme="minorHAnsi" w:cstheme="minorHAnsi"/>
+        </w:rPr>
+        <w:t xml:space="preserve">${no_sp} </w:t>
+      </w:r>
+      <w:r>
+        <w:rPr>
+          <w:rFonts w:asciiTheme="minorHAnsi" w:hAnsiTheme="minorHAnsi" w:cstheme="minorHAnsi"/>
           <w:spacing w:val="-3"/>
         </w:rPr>
-        <w:t>${</w:t>
+        <w:t xml:space="preserve">tanggal </w:t>
       </w:r>
-      <w:proofErr w:type="spellStart"/>
       <w:r>
         <w:rPr>
           <w:rFonts w:asciiTheme="minorHAnsi" w:hAnsiTheme="minorHAnsi" w:cstheme="minorHAnsi"/>
           <w:spacing w:val="-3"/>
         </w:rPr>
-        <w:t>tgl_sp</w:t>
+        <w:t xml:space="preserve">${tgl_sp} </w:t>
       </w:r>
-      <w:proofErr w:type="spellEnd"/>
       <w:r>
         <w:rPr>
           <w:rFonts w:asciiTheme="minorHAnsi" w:hAnsiTheme="minorHAnsi" w:cstheme="minorHAnsi"/>
-          <w:spacing w:val="-3"/>
-        </w:rPr>
-        <w:t xml:space="preserve">} </w:t>
-      </w:r>
-      <w:proofErr w:type="spellStart"/>
-      <w:r>
-        <w:rPr>
-          <w:rFonts w:asciiTheme="minorHAnsi" w:hAnsiTheme="minorHAnsi" w:cstheme="minorHAnsi"/>
-        </w:rPr>
-        <w:t>dengan</w:t>
-      </w:r>
-      <w:proofErr w:type="spellEnd"/>
-      <w:r>
-        <w:rPr>
-          <w:rFonts w:asciiTheme="minorHAnsi" w:hAnsiTheme="minorHAnsi" w:cstheme="minorHAnsi"/>
-        </w:rPr>
-        <w:t xml:space="preserve"> </w:t>
-      </w:r>
-      <w:proofErr w:type="spellStart"/>
-      <w:r>
-        <w:rPr>
-          <w:rFonts w:asciiTheme="minorHAnsi" w:hAnsiTheme="minorHAnsi" w:cstheme="minorHAnsi"/>
-        </w:rPr>
-        <w:t>rincian</w:t>
-      </w:r>
-      <w:proofErr w:type="spellEnd"/>
-      <w:r>
-        <w:rPr>
-          <w:rFonts w:asciiTheme="minorHAnsi" w:hAnsiTheme="minorHAnsi" w:cstheme="minorHAnsi"/>
-        </w:rPr>
-        <w:t xml:space="preserve"> </w:t>
-      </w:r>
-      <w:proofErr w:type="spellStart"/>
-      <w:r>
-        <w:rPr>
-          <w:rFonts w:asciiTheme="minorHAnsi" w:hAnsiTheme="minorHAnsi" w:cstheme="minorHAnsi"/>
-        </w:rPr>
-        <w:t>sebagaimana</w:t>
-      </w:r>
-      <w:proofErr w:type="spellEnd"/>
-      <w:r>
-        <w:rPr>
-          <w:rFonts w:asciiTheme="minorHAnsi" w:hAnsiTheme="minorHAnsi" w:cstheme="minorHAnsi"/>
-        </w:rPr>
-        <w:t xml:space="preserve"> </w:t>
-      </w:r>
-      <w:proofErr w:type="spellStart"/>
-      <w:r>
-        <w:rPr>
-          <w:rFonts w:asciiTheme="minorHAnsi" w:hAnsiTheme="minorHAnsi" w:cstheme="minorHAnsi"/>
-        </w:rPr>
-        <w:t>terlampir</w:t>
-      </w:r>
-      <w:proofErr w:type="spellEnd"/>
-      <w:r>
-        <w:rPr>
-          <w:rFonts w:asciiTheme="minorHAnsi" w:hAnsiTheme="minorHAnsi" w:cstheme="minorHAnsi"/>
-        </w:rPr>
-        <w:t xml:space="preserve">. </w:t>
+        </w:rPr>
+        <w:t xml:space="preserve">dengan rincian sebagaimana terlampir. </w:t>
       </w:r>
     </w:p>
     <w:p>
@@ -8422,128 +6506,8 @@
         <w:rPr>
           <w:rFonts w:asciiTheme="minorHAnsi" w:hAnsiTheme="minorHAnsi" w:cstheme="minorHAnsi"/>
         </w:rPr>
-        <w:t xml:space="preserve">PIHAK PERTAMA </w:t>
+        <w:t>PIHAK PERTAMA menyatakan telah menerima dengan baik dan lengkap barang/hasil pekerjaan</w:t>
       </w:r>
-      <w:proofErr w:type="spellStart"/>
-      <w:r>
-        <w:rPr>
-          <w:rFonts w:asciiTheme="minorHAnsi" w:hAnsiTheme="minorHAnsi" w:cstheme="minorHAnsi"/>
-        </w:rPr>
-        <w:t>menyatakan</w:t>
-      </w:r>
-      <w:proofErr w:type="spellEnd"/>
-      <w:r>
-        <w:rPr>
-          <w:rFonts w:asciiTheme="minorHAnsi" w:hAnsiTheme="minorHAnsi" w:cstheme="minorHAnsi"/>
-        </w:rPr>
-        <w:t xml:space="preserve"> </w:t>
-      </w:r>
-      <w:proofErr w:type="spellStart"/>
-      <w:r>
-        <w:rPr>
-          <w:rFonts w:asciiTheme="minorHAnsi" w:hAnsiTheme="minorHAnsi" w:cstheme="minorHAnsi"/>
-        </w:rPr>
-        <w:t>telah</w:t>
-      </w:r>
-      <w:proofErr w:type="spellEnd"/>
-      <w:r>
-        <w:rPr>
-          <w:rFonts w:asciiTheme="minorHAnsi" w:hAnsiTheme="minorHAnsi" w:cstheme="minorHAnsi"/>
-        </w:rPr>
-        <w:t xml:space="preserve"> </w:t>
-      </w:r>
-      <w:proofErr w:type="spellStart"/>
-      <w:r>
-        <w:rPr>
-          <w:rFonts w:asciiTheme="minorHAnsi" w:hAnsiTheme="minorHAnsi" w:cstheme="minorHAnsi"/>
-        </w:rPr>
-        <w:t>menerima</w:t>
-      </w:r>
-      <w:proofErr w:type="spellEnd"/>
-      <w:r>
-        <w:rPr>
-          <w:rFonts w:asciiTheme="minorHAnsi" w:hAnsiTheme="minorHAnsi" w:cstheme="minorHAnsi"/>
-        </w:rPr>
-        <w:t xml:space="preserve"> </w:t>
-      </w:r>
-      <w:proofErr w:type="spellStart"/>
-      <w:r>
-        <w:rPr>
-          <w:rFonts w:asciiTheme="minorHAnsi" w:hAnsiTheme="minorHAnsi" w:cstheme="minorHAnsi"/>
-        </w:rPr>
-        <w:t>dengan</w:t>
-      </w:r>
-      <w:proofErr w:type="spellEnd"/>
-      <w:r>
-        <w:rPr>
-          <w:rFonts w:asciiTheme="minorHAnsi" w:hAnsiTheme="minorHAnsi" w:cstheme="minorHAnsi"/>
-        </w:rPr>
-        <w:t xml:space="preserve"> </w:t>
-      </w:r>
-      <w:proofErr w:type="spellStart"/>
-      <w:r>
-        <w:rPr>
-          <w:rFonts w:asciiTheme="minorHAnsi" w:hAnsiTheme="minorHAnsi" w:cstheme="minorHAnsi"/>
-        </w:rPr>
-        <w:t>baik</w:t>
-      </w:r>
-      <w:proofErr w:type="spellEnd"/>
-      <w:r>
-        <w:rPr>
-          <w:rFonts w:asciiTheme="minorHAnsi" w:hAnsiTheme="minorHAnsi" w:cstheme="minorHAnsi"/>
-        </w:rPr>
-        <w:t xml:space="preserve"> dan </w:t>
-      </w:r>
-      <w:proofErr w:type="spellStart"/>
-      <w:r>
-        <w:rPr>
-          <w:rFonts w:asciiTheme="minorHAnsi" w:hAnsiTheme="minorHAnsi" w:cstheme="minorHAnsi"/>
-        </w:rPr>
-        <w:t>lengkap</w:t>
-      </w:r>
-      <w:proofErr w:type="spellEnd"/>
-      <w:r>
-        <w:rPr>
-          <w:rFonts w:asciiTheme="minorHAnsi" w:hAnsiTheme="minorHAnsi" w:cstheme="minorHAnsi"/>
-        </w:rPr>
-        <w:t xml:space="preserve"> </w:t>
-      </w:r>
-      <w:proofErr w:type="spellStart"/>
-      <w:r>
-        <w:rPr>
-          <w:rFonts w:asciiTheme="minorHAnsi" w:hAnsiTheme="minorHAnsi" w:cstheme="minorHAnsi"/>
-        </w:rPr>
-        <w:t>barang</w:t>
-      </w:r>
-      <w:proofErr w:type="spellEnd"/>
-      <w:r>
-        <w:rPr>
-          <w:rFonts w:asciiTheme="minorHAnsi" w:hAnsiTheme="minorHAnsi" w:cstheme="minorHAnsi"/>
-        </w:rPr>
-        <w:t>/</w:t>
-      </w:r>
-      <w:proofErr w:type="spellStart"/>
-      <w:r>
-        <w:rPr>
-          <w:rFonts w:asciiTheme="minorHAnsi" w:hAnsiTheme="minorHAnsi" w:cstheme="minorHAnsi"/>
-        </w:rPr>
-        <w:t>hasil</w:t>
-      </w:r>
-      <w:proofErr w:type="spellEnd"/>
-      <w:r>
-        <w:rPr>
-          <w:rFonts w:asciiTheme="minorHAnsi" w:hAnsiTheme="minorHAnsi" w:cstheme="minorHAnsi"/>
-        </w:rPr>
-        <w:t xml:space="preserve"> </w:t>
-      </w:r>
-      <w:proofErr w:type="spellStart"/>
-      <w:r>
-        <w:rPr>
-          <w:rFonts w:asciiTheme="minorHAnsi" w:hAnsiTheme="minorHAnsi" w:cstheme="minorHAnsi"/>
-        </w:rPr>
-        <w:t>pekerjaan</w:t>
-      </w:r>
-      <w:proofErr w:type="spellEnd"/>
       <w:r>
         <w:rPr>
           <w:rFonts w:asciiTheme="minorHAnsi" w:hAnsiTheme="minorHAnsi" w:cstheme="minorHAnsi"/>
@@ -8568,16 +6532,8 @@
         <w:rPr>
           <w:rFonts w:asciiTheme="minorHAnsi" w:hAnsiTheme="minorHAnsi" w:cstheme="minorHAnsi"/>
         </w:rPr>
-        <w:t xml:space="preserve"> </w:t>
+        <w:t xml:space="preserve"> dari</w:t>
       </w:r>
-      <w:proofErr w:type="spellStart"/>
-      <w:r>
-        <w:rPr>
-          <w:rFonts w:asciiTheme="minorHAnsi" w:hAnsiTheme="minorHAnsi" w:cstheme="minorHAnsi"/>
-        </w:rPr>
-        <w:t>dari</w:t>
-      </w:r>
-      <w:proofErr w:type="spellEnd"/>
       <w:r>
         <w:rPr>
           <w:rFonts w:asciiTheme="minorHAnsi" w:hAnsiTheme="minorHAnsi" w:cstheme="minorHAnsi"/>
@@ -8609,61 +6565,11 @@
           <w:rFonts w:asciiTheme="minorHAnsi" w:hAnsiTheme="minorHAnsi" w:cstheme="minorHAnsi"/>
         </w:rPr>
       </w:pPr>
-      <w:proofErr w:type="spellStart"/>
       <w:r>
         <w:rPr>
           <w:rFonts w:asciiTheme="minorHAnsi" w:hAnsiTheme="minorHAnsi" w:cstheme="minorHAnsi"/>
         </w:rPr>
-        <w:t>Demikian</w:t>
-      </w:r>
-      <w:proofErr w:type="spellEnd"/>
-      <w:r>
-        <w:rPr>
-          <w:rFonts w:asciiTheme="minorHAnsi" w:hAnsiTheme="minorHAnsi" w:cstheme="minorHAnsi"/>
-        </w:rPr>
-        <w:t xml:space="preserve"> </w:t>
-      </w:r>
-      <w:proofErr w:type="spellStart"/>
-      <w:r>
-        <w:rPr>
-          <w:rFonts w:asciiTheme="minorHAnsi" w:hAnsiTheme="minorHAnsi" w:cstheme="minorHAnsi"/>
-        </w:rPr>
-        <w:t>Berita</w:t>
-      </w:r>
-      <w:proofErr w:type="spellEnd"/>
-      <w:r>
-        <w:rPr>
-          <w:rFonts w:asciiTheme="minorHAnsi" w:hAnsiTheme="minorHAnsi" w:cstheme="minorHAnsi"/>
-        </w:rPr>
-        <w:t xml:space="preserve"> Acara </w:t>
-      </w:r>
-      <w:proofErr w:type="spellStart"/>
-      <w:r>
-        <w:rPr>
-          <w:rFonts w:asciiTheme="minorHAnsi" w:hAnsiTheme="minorHAnsi" w:cstheme="minorHAnsi"/>
-        </w:rPr>
-        <w:t>Serah</w:t>
-      </w:r>
-      <w:proofErr w:type="spellEnd"/>
-      <w:r>
-        <w:rPr>
-          <w:rFonts w:asciiTheme="minorHAnsi" w:hAnsiTheme="minorHAnsi" w:cstheme="minorHAnsi"/>
-        </w:rPr>
-        <w:t xml:space="preserve"> </w:t>
-      </w:r>
-      <w:proofErr w:type="spellStart"/>
-      <w:r>
-        <w:rPr>
-          <w:rFonts w:asciiTheme="minorHAnsi" w:hAnsiTheme="minorHAnsi" w:cstheme="minorHAnsi"/>
-        </w:rPr>
-        <w:t>Terima</w:t>
-      </w:r>
-      <w:proofErr w:type="spellEnd"/>
-      <w:r>
-        <w:rPr>
-          <w:rFonts w:asciiTheme="minorHAnsi" w:hAnsiTheme="minorHAnsi" w:cstheme="minorHAnsi"/>
-        </w:rPr>
-        <w:t xml:space="preserve"> </w:t>
+        <w:t xml:space="preserve">Demikian Berita Acara Serah Terima </w:t>
       </w:r>
       <w:r>
         <w:rPr>
@@ -8672,147 +6578,11 @@
         </w:rPr>
         <w:t xml:space="preserve">Hasil Pekerjaan </w:t>
       </w:r>
-      <w:proofErr w:type="spellStart"/>
       <w:r>
         <w:rPr>
           <w:rFonts w:asciiTheme="minorHAnsi" w:hAnsiTheme="minorHAnsi" w:cstheme="minorHAnsi"/>
         </w:rPr>
-        <w:t>ini</w:t>
-      </w:r>
-      <w:proofErr w:type="spellEnd"/>
-      <w:r>
-        <w:rPr>
-          <w:rFonts w:asciiTheme="minorHAnsi" w:hAnsiTheme="minorHAnsi" w:cstheme="minorHAnsi"/>
-        </w:rPr>
-        <w:t xml:space="preserve"> </w:t>
-      </w:r>
-      <w:proofErr w:type="spellStart"/>
-      <w:r>
-        <w:rPr>
-          <w:rFonts w:asciiTheme="minorHAnsi" w:hAnsiTheme="minorHAnsi" w:cstheme="minorHAnsi"/>
-        </w:rPr>
-        <w:t>dibuat</w:t>
-      </w:r>
-      <w:proofErr w:type="spellEnd"/>
-      <w:r>
-        <w:rPr>
-          <w:rFonts w:asciiTheme="minorHAnsi" w:hAnsiTheme="minorHAnsi" w:cstheme="minorHAnsi"/>
-        </w:rPr>
-        <w:t xml:space="preserve"> </w:t>
-      </w:r>
-      <w:proofErr w:type="spellStart"/>
-      <w:r>
-        <w:rPr>
-          <w:rFonts w:asciiTheme="minorHAnsi" w:hAnsiTheme="minorHAnsi" w:cstheme="minorHAnsi"/>
-        </w:rPr>
-        <w:t>dengan</w:t>
-      </w:r>
-      <w:proofErr w:type="spellEnd"/>
-      <w:r>
-        <w:rPr>
-          <w:rFonts w:asciiTheme="minorHAnsi" w:hAnsiTheme="minorHAnsi" w:cstheme="minorHAnsi"/>
-        </w:rPr>
-        <w:t xml:space="preserve"> </w:t>
-      </w:r>
-      <w:proofErr w:type="spellStart"/>
-      <w:r>
-        <w:rPr>
-          <w:rFonts w:asciiTheme="minorHAnsi" w:hAnsiTheme="minorHAnsi" w:cstheme="minorHAnsi"/>
-        </w:rPr>
-        <w:t>rangkap</w:t>
-      </w:r>
-      <w:proofErr w:type="spellEnd"/>
-      <w:r>
-        <w:rPr>
-          <w:rFonts w:asciiTheme="minorHAnsi" w:hAnsiTheme="minorHAnsi" w:cstheme="minorHAnsi"/>
-        </w:rPr>
-        <w:t xml:space="preserve"> yang </w:t>
-      </w:r>
-      <w:proofErr w:type="spellStart"/>
-      <w:r>
-        <w:rPr>
-          <w:rFonts w:asciiTheme="minorHAnsi" w:hAnsiTheme="minorHAnsi" w:cstheme="minorHAnsi"/>
-        </w:rPr>
-        <w:t>cukup</w:t>
-      </w:r>
-      <w:proofErr w:type="spellEnd"/>
-      <w:r>
-        <w:rPr>
-          <w:rFonts w:asciiTheme="minorHAnsi" w:hAnsiTheme="minorHAnsi" w:cstheme="minorHAnsi"/>
-        </w:rPr>
-        <w:t xml:space="preserve"> </w:t>
-      </w:r>
-      <w:proofErr w:type="spellStart"/>
-      <w:r>
-        <w:rPr>
-          <w:rFonts w:asciiTheme="minorHAnsi" w:hAnsiTheme="minorHAnsi" w:cstheme="minorHAnsi"/>
-        </w:rPr>
-        <w:t>untuk</w:t>
-      </w:r>
-      <w:proofErr w:type="spellEnd"/>
-      <w:r>
-        <w:rPr>
-          <w:rFonts w:asciiTheme="minorHAnsi" w:hAnsiTheme="minorHAnsi" w:cstheme="minorHAnsi"/>
-        </w:rPr>
-        <w:t xml:space="preserve"> </w:t>
-      </w:r>
-      <w:proofErr w:type="spellStart"/>
-      <w:proofErr w:type="gramStart"/>
-      <w:r>
-        <w:rPr>
-          <w:rFonts w:asciiTheme="minorHAnsi" w:hAnsiTheme="minorHAnsi" w:cstheme="minorHAnsi"/>
-        </w:rPr>
-        <w:t>dapat</w:t>
-      </w:r>
-      <w:proofErr w:type="spellEnd"/>
-      <w:r>
-        <w:rPr>
-          <w:rFonts w:asciiTheme="minorHAnsi" w:hAnsiTheme="minorHAnsi" w:cstheme="minorHAnsi"/>
-        </w:rPr>
-        <w:t xml:space="preserve">  </w:t>
-      </w:r>
-      <w:proofErr w:type="spellStart"/>
-      <w:r>
-        <w:rPr>
-          <w:rFonts w:asciiTheme="minorHAnsi" w:hAnsiTheme="minorHAnsi" w:cstheme="minorHAnsi"/>
-        </w:rPr>
-        <w:t>digunakan</w:t>
-      </w:r>
-      <w:proofErr w:type="spellEnd"/>
-      <w:proofErr w:type="gramEnd"/>
-      <w:r>
-        <w:rPr>
-          <w:rFonts w:asciiTheme="minorHAnsi" w:hAnsiTheme="minorHAnsi" w:cstheme="minorHAnsi"/>
-        </w:rPr>
-        <w:t xml:space="preserve"> </w:t>
-      </w:r>
-      <w:proofErr w:type="spellStart"/>
-      <w:r>
-        <w:rPr>
-          <w:rFonts w:asciiTheme="minorHAnsi" w:hAnsiTheme="minorHAnsi" w:cstheme="minorHAnsi"/>
-        </w:rPr>
-        <w:t>sebagaimana</w:t>
-      </w:r>
-      <w:proofErr w:type="spellEnd"/>
-      <w:r>
-        <w:rPr>
-          <w:rFonts w:asciiTheme="minorHAnsi" w:hAnsiTheme="minorHAnsi" w:cstheme="minorHAnsi"/>
-        </w:rPr>
-        <w:t xml:space="preserve"> </w:t>
-      </w:r>
-      <w:proofErr w:type="spellStart"/>
-      <w:r>
-        <w:rPr>
-          <w:rFonts w:asciiTheme="minorHAnsi" w:hAnsiTheme="minorHAnsi" w:cstheme="minorHAnsi"/>
-        </w:rPr>
-        <w:t>mestinya</w:t>
-      </w:r>
-      <w:proofErr w:type="spellEnd"/>
-      <w:r>
-        <w:rPr>
-          <w:rFonts w:asciiTheme="minorHAnsi" w:hAnsiTheme="minorHAnsi" w:cstheme="minorHAnsi"/>
-        </w:rPr>
-        <w:t>.</w:t>
+        <w:t>ini dibuat dengan rangkap yang cukup untuk dapat  digunakan sebagaimana mestinya.</w:t>
       </w:r>
     </w:p>
     <w:p>
@@ -8920,23 +6690,7 @@
                 <w:rFonts w:asciiTheme="minorHAnsi" w:hAnsiTheme="minorHAnsi" w:cstheme="minorHAnsi"/>
                 <w:bCs/>
               </w:rPr>
-              <w:t>${</w:t>
-            </w:r>
-            <w:proofErr w:type="spellStart"/>
-            <w:r>
-              <w:rPr>
-                <w:rFonts w:asciiTheme="minorHAnsi" w:hAnsiTheme="minorHAnsi" w:cstheme="minorHAnsi"/>
-                <w:bCs/>
-              </w:rPr>
-              <w:t>penyedia</w:t>
-            </w:r>
-            <w:proofErr w:type="spellEnd"/>
-            <w:r>
-              <w:rPr>
-                <w:rFonts w:asciiTheme="minorHAnsi" w:hAnsiTheme="minorHAnsi" w:cstheme="minorHAnsi"/>
-                <w:bCs/>
-              </w:rPr>
-              <w:t>}</w:t>
+              <w:t>${penyedia}</w:t>
             </w:r>
           </w:p>
           <w:p>
@@ -9318,14 +7072,12 @@
                 <w:rFonts w:asciiTheme="minorHAnsi" w:eastAsia="Times New Roman" w:hAnsiTheme="minorHAnsi" w:cstheme="minorHAnsi"/>
               </w:rPr>
             </w:pPr>
-            <w:proofErr w:type="spellStart"/>
             <w:r>
               <w:rPr>
                 <w:rFonts w:asciiTheme="minorHAnsi" w:eastAsia="Times New Roman" w:hAnsiTheme="minorHAnsi" w:cstheme="minorHAnsi"/>
               </w:rPr>
               <w:t>Nomor</w:t>
             </w:r>
-            <w:proofErr w:type="spellEnd"/>
           </w:p>
         </w:tc>
         <w:tc>
@@ -9393,14 +7145,12 @@
                 <w:rFonts w:asciiTheme="minorHAnsi" w:eastAsia="Times New Roman" w:hAnsiTheme="minorHAnsi" w:cstheme="minorHAnsi"/>
               </w:rPr>
             </w:pPr>
-            <w:proofErr w:type="spellStart"/>
             <w:r>
               <w:rPr>
                 <w:rFonts w:asciiTheme="minorHAnsi" w:eastAsia="Times New Roman" w:hAnsiTheme="minorHAnsi" w:cstheme="minorHAnsi"/>
               </w:rPr>
               <w:t>Tanggal</w:t>
             </w:r>
-            <w:proofErr w:type="spellEnd"/>
           </w:p>
         </w:tc>
         <w:tc>
@@ -9435,21 +7185,7 @@
               <w:rPr>
                 <w:rFonts w:asciiTheme="minorHAnsi" w:eastAsia="Times New Roman" w:hAnsiTheme="minorHAnsi" w:cstheme="minorHAnsi"/>
               </w:rPr>
-              <w:t>${</w:t>
-            </w:r>
-            <w:proofErr w:type="spellStart"/>
-            <w:r>
-              <w:rPr>
-                <w:rFonts w:asciiTheme="minorHAnsi" w:eastAsia="Times New Roman" w:hAnsiTheme="minorHAnsi" w:cstheme="minorHAnsi"/>
-              </w:rPr>
-              <w:t>akhir</w:t>
-            </w:r>
-            <w:proofErr w:type="spellEnd"/>
-            <w:r>
-              <w:rPr>
-                <w:rFonts w:asciiTheme="minorHAnsi" w:eastAsia="Times New Roman" w:hAnsiTheme="minorHAnsi" w:cstheme="minorHAnsi"/>
-              </w:rPr>
-              <w:t>}</w:t>
+              <w:t>${akhir}</w:t>
             </w:r>
           </w:p>
         </w:tc>
@@ -9583,7 +7319,6 @@
                 <w:lang w:eastAsia="id-ID"/>
               </w:rPr>
             </w:pPr>
-            <w:proofErr w:type="spellStart"/>
             <w:r>
               <w:rPr>
                 <w:rFonts w:asciiTheme="minorHAnsi" w:eastAsia="Times New Roman" w:hAnsiTheme="minorHAnsi" w:cstheme="minorHAnsi"/>
@@ -9593,7 +7328,6 @@
               </w:rPr>
               <w:t>Uraian</w:t>
             </w:r>
-            <w:proofErr w:type="spellEnd"/>
           </w:p>
         </w:tc>
         <w:tc>
@@ -9617,7 +7351,6 @@
                 <w:lang w:eastAsia="id-ID"/>
               </w:rPr>
             </w:pPr>
-            <w:proofErr w:type="spellStart"/>
             <w:r>
               <w:rPr>
                 <w:rFonts w:asciiTheme="minorHAnsi" w:eastAsia="Times New Roman" w:hAnsiTheme="minorHAnsi" w:cstheme="minorHAnsi"/>
@@ -9627,7 +7360,6 @@
               </w:rPr>
               <w:t>Spesifikasi</w:t>
             </w:r>
-            <w:proofErr w:type="spellEnd"/>
           </w:p>
         </w:tc>
         <w:tc>
@@ -9695,27 +7427,7 @@
                 <w:bCs/>
                 <w:lang w:eastAsia="id-ID"/>
               </w:rPr>
-              <w:t xml:space="preserve">Harga </w:t>
-            </w:r>
-            <w:proofErr w:type="spellStart"/>
-            <w:r>
-              <w:rPr>
-                <w:rFonts w:asciiTheme="minorHAnsi" w:eastAsia="Times New Roman" w:hAnsiTheme="minorHAnsi" w:cstheme="minorHAnsi"/>
-                <w:b/>
-                <w:bCs/>
-                <w:lang w:eastAsia="id-ID"/>
-              </w:rPr>
-              <w:t>Satuan</w:t>
-            </w:r>
-            <w:proofErr w:type="spellEnd"/>
-            <w:r>
-              <w:rPr>
-                <w:rFonts w:asciiTheme="minorHAnsi" w:eastAsia="Times New Roman" w:hAnsiTheme="minorHAnsi" w:cstheme="minorHAnsi"/>
-                <w:b/>
-                <w:bCs/>
-                <w:lang w:eastAsia="id-ID"/>
-              </w:rPr>
-              <w:t xml:space="preserve"> (Rp)</w:t>
+              <w:t>Harga Satuan (Rp)</w:t>
             </w:r>
           </w:p>
         </w:tc>
@@ -9743,8 +7455,6 @@
                 <w:lang w:eastAsia="id-ID"/>
               </w:rPr>
             </w:pPr>
-            <w:proofErr w:type="spellStart"/>
-            <w:proofErr w:type="gramStart"/>
             <w:r>
               <w:rPr>
                 <w:rFonts w:asciiTheme="minorHAnsi" w:eastAsia="Times New Roman" w:hAnsiTheme="minorHAnsi" w:cstheme="minorHAnsi"/>
@@ -9752,27 +7462,7 @@
                 <w:bCs/>
                 <w:lang w:eastAsia="id-ID"/>
               </w:rPr>
-              <w:t>Jumlah</w:t>
-            </w:r>
-            <w:proofErr w:type="spellEnd"/>
-            <w:r>
-              <w:rPr>
-                <w:rFonts w:asciiTheme="minorHAnsi" w:eastAsia="Times New Roman" w:hAnsiTheme="minorHAnsi" w:cstheme="minorHAnsi"/>
-                <w:b/>
-                <w:bCs/>
-                <w:lang w:eastAsia="id-ID"/>
-              </w:rPr>
-              <w:t xml:space="preserve">  (</w:t>
-            </w:r>
-            <w:proofErr w:type="gramEnd"/>
-            <w:r>
-              <w:rPr>
-                <w:rFonts w:asciiTheme="minorHAnsi" w:eastAsia="Times New Roman" w:hAnsiTheme="minorHAnsi" w:cstheme="minorHAnsi"/>
-                <w:b/>
-                <w:bCs/>
-                <w:lang w:eastAsia="id-ID"/>
-              </w:rPr>
-              <w:t>Rp)</w:t>
+              <w:t>Jumlah  (Rp)</w:t>
             </w:r>
           </w:p>
         </w:tc>
@@ -10071,23 +7761,7 @@
                 <w:rFonts w:asciiTheme="minorHAnsi" w:eastAsia="Times New Roman" w:hAnsiTheme="minorHAnsi" w:cstheme="minorHAnsi"/>
                 <w:color w:val="000000"/>
               </w:rPr>
-              <w:t>${</w:t>
-            </w:r>
-            <w:proofErr w:type="spellStart"/>
-            <w:r>
-              <w:rPr>
-                <w:rFonts w:asciiTheme="minorHAnsi" w:eastAsia="Times New Roman" w:hAnsiTheme="minorHAnsi" w:cstheme="minorHAnsi"/>
-                <w:color w:val="000000"/>
-              </w:rPr>
-              <w:t>spek_spek</w:t>
-            </w:r>
-            <w:proofErr w:type="spellEnd"/>
-            <w:r>
-              <w:rPr>
-                <w:rFonts w:asciiTheme="minorHAnsi" w:eastAsia="Times New Roman" w:hAnsiTheme="minorHAnsi" w:cstheme="minorHAnsi"/>
-                <w:color w:val="000000"/>
-              </w:rPr>
-              <w:t>}</w:t>
+              <w:t>${spek_spek}</w:t>
             </w:r>
           </w:p>
         </w:tc>
@@ -10275,23 +7949,7 @@
                 <w:rFonts w:asciiTheme="minorHAnsi" w:hAnsiTheme="minorHAnsi" w:cstheme="minorHAnsi"/>
                 <w:color w:val="000000"/>
               </w:rPr>
-              <w:t>${</w:t>
-            </w:r>
-            <w:proofErr w:type="spellStart"/>
-            <w:r>
-              <w:rPr>
-                <w:rFonts w:asciiTheme="minorHAnsi" w:hAnsiTheme="minorHAnsi" w:cstheme="minorHAnsi"/>
-                <w:color w:val="000000"/>
-              </w:rPr>
-              <w:t>jumlah_bayar</w:t>
-            </w:r>
-            <w:proofErr w:type="spellEnd"/>
-            <w:r>
-              <w:rPr>
-                <w:rFonts w:asciiTheme="minorHAnsi" w:hAnsiTheme="minorHAnsi" w:cstheme="minorHAnsi"/>
-                <w:color w:val="000000"/>
-              </w:rPr>
-              <w:t>}</w:t>
+              <w:t>${jumlah_bayar}</w:t>
             </w:r>
           </w:p>
         </w:tc>
@@ -10327,25 +7985,7 @@
                 <w:b/>
                 <w:lang w:eastAsia="id-ID"/>
               </w:rPr>
-              <w:t>${</w:t>
-            </w:r>
-            <w:proofErr w:type="spellStart"/>
-            <w:r>
-              <w:rPr>
-                <w:rFonts w:asciiTheme="minorHAnsi" w:eastAsia="Times New Roman" w:hAnsiTheme="minorHAnsi" w:cstheme="minorHAnsi"/>
-                <w:b/>
-                <w:lang w:eastAsia="id-ID"/>
-              </w:rPr>
-              <w:t>terbilang_jumlah_bayar</w:t>
-            </w:r>
-            <w:proofErr w:type="spellEnd"/>
-            <w:r>
-              <w:rPr>
-                <w:rFonts w:asciiTheme="minorHAnsi" w:eastAsia="Times New Roman" w:hAnsiTheme="minorHAnsi" w:cstheme="minorHAnsi"/>
-                <w:b/>
-                <w:lang w:eastAsia="id-ID"/>
-              </w:rPr>
-              <w:t>}</w:t>
+              <w:t>${terbilang_jumlah_bayar}</w:t>
             </w:r>
           </w:p>
         </w:tc>
@@ -10435,7 +8075,6 @@
                 <w:lang w:val="es-ES"/>
               </w:rPr>
             </w:pPr>
-            <w:proofErr w:type="spellStart"/>
             <w:r>
               <w:rPr>
                 <w:rFonts w:asciiTheme="minorHAnsi" w:hAnsiTheme="minorHAnsi" w:cstheme="minorHAnsi"/>
@@ -10443,7 +8082,6 @@
               </w:rPr>
               <w:t>Penyedia</w:t>
             </w:r>
-            <w:proofErr w:type="spellEnd"/>
           </w:p>
           <w:p>
             <w:pPr>
@@ -10464,23 +8102,7 @@
                 <w:rFonts w:asciiTheme="minorHAnsi" w:hAnsiTheme="minorHAnsi" w:cstheme="minorHAnsi"/>
                 <w:bCs/>
               </w:rPr>
-              <w:t>${</w:t>
-            </w:r>
-            <w:proofErr w:type="spellStart"/>
-            <w:r>
-              <w:rPr>
-                <w:rFonts w:asciiTheme="minorHAnsi" w:hAnsiTheme="minorHAnsi" w:cstheme="minorHAnsi"/>
-                <w:bCs/>
-              </w:rPr>
-              <w:t>penyedia</w:t>
-            </w:r>
-            <w:proofErr w:type="spellEnd"/>
-            <w:r>
-              <w:rPr>
-                <w:rFonts w:asciiTheme="minorHAnsi" w:hAnsiTheme="minorHAnsi" w:cstheme="minorHAnsi"/>
-                <w:bCs/>
-              </w:rPr>
-              <w:t>}</w:t>
+              <w:t>${penyedia}</w:t>
             </w:r>
           </w:p>
           <w:p>
@@ -10819,11 +8441,7 @@
                 <w:szCs w:val="36"/>
               </w:rPr>
             </w:pPr>
-          </w:p>
-          <w:p>
-            <w:pPr>
-              <w:spacing w:after="0" w:line="240" w:lineRule="auto"/>
-              <w:jc w:val="center"/>
+            <w:r>
               <w:rPr>
                 <w:rFonts w:asciiTheme="minorHAnsi" w:eastAsia="Times New Roman" w:hAnsiTheme="minorHAnsi" w:cstheme="minorHAnsi"/>
                 <w:b/>
@@ -10832,12 +8450,9 @@
                 <w:sz w:val="36"/>
                 <w:szCs w:val="36"/>
               </w:rPr>
-            </w:pPr>
-          </w:p>
-          <w:p>
-            <w:pPr>
-              <w:spacing w:after="0" w:line="240" w:lineRule="auto"/>
-              <w:jc w:val="center"/>
+              <w:t>K</w:t>
+            </w:r>
+            <w:r>
               <w:rPr>
                 <w:rFonts w:asciiTheme="minorHAnsi" w:eastAsia="Times New Roman" w:hAnsiTheme="minorHAnsi" w:cstheme="minorHAnsi"/>
                 <w:b/>
@@ -10847,7 +8462,8 @@
                 <w:szCs w:val="36"/>
                 <w:lang w:val="id-ID"/>
               </w:rPr>
-            </w:pPr>
+              <w:t xml:space="preserve"> </w:t>
+            </w:r>
             <w:r>
               <w:rPr>
                 <w:rFonts w:asciiTheme="minorHAnsi" w:eastAsia="Times New Roman" w:hAnsiTheme="minorHAnsi" w:cstheme="minorHAnsi"/>
@@ -10857,7 +8473,7 @@
                 <w:sz w:val="36"/>
                 <w:szCs w:val="36"/>
               </w:rPr>
-              <w:t>K</w:t>
+              <w:t>U</w:t>
             </w:r>
             <w:r>
               <w:rPr>
@@ -10880,7 +8496,7 @@
                 <w:sz w:val="36"/>
                 <w:szCs w:val="36"/>
               </w:rPr>
-              <w:t>U</w:t>
+              <w:t>I</w:t>
             </w:r>
             <w:r>
               <w:rPr>
@@ -10903,7 +8519,7 @@
                 <w:sz w:val="36"/>
                 <w:szCs w:val="36"/>
               </w:rPr>
-              <w:t>I</w:t>
+              <w:t>T</w:t>
             </w:r>
             <w:r>
               <w:rPr>
@@ -10926,7 +8542,7 @@
                 <w:sz w:val="36"/>
                 <w:szCs w:val="36"/>
               </w:rPr>
-              <w:t>T</w:t>
+              <w:t>A</w:t>
             </w:r>
             <w:r>
               <w:rPr>
@@ -10949,7 +8565,7 @@
                 <w:sz w:val="36"/>
                 <w:szCs w:val="36"/>
               </w:rPr>
-              <w:t>A</w:t>
+              <w:t>N</w:t>
             </w:r>
             <w:r>
               <w:rPr>
@@ -10972,7 +8588,7 @@
                 <w:sz w:val="36"/>
                 <w:szCs w:val="36"/>
               </w:rPr>
-              <w:t>N</w:t>
+              <w:t>S</w:t>
             </w:r>
             <w:r>
               <w:rPr>
@@ -10995,30 +8611,50 @@
                 <w:sz w:val="36"/>
                 <w:szCs w:val="36"/>
               </w:rPr>
-              <w:t>S</w:t>
-            </w:r>
-            <w:r>
-              <w:rPr>
-                <w:rFonts w:asciiTheme="minorHAnsi" w:eastAsia="Times New Roman" w:hAnsiTheme="minorHAnsi" w:cstheme="minorHAnsi"/>
-                <w:b/>
-                <w:bCs/>
-                <w:i/>
-                <w:sz w:val="36"/>
-                <w:szCs w:val="36"/>
+              <w:t>I</w:t>
+            </w:r>
+          </w:p>
+          <w:p>
+            <w:pPr>
+              <w:spacing w:after="0" w:line="240" w:lineRule="auto"/>
+              <w:jc w:val="center"/>
+              <w:rPr>
+                <w:rFonts w:asciiTheme="minorHAnsi" w:eastAsia="Times New Roman" w:hAnsiTheme="minorHAnsi" w:cstheme="minorHAnsi"/>
+                <w:iCs/>
+                <w:sz w:val="24"/>
+                <w:szCs w:val="24"/>
                 <w:lang w:val="id-ID"/>
               </w:rPr>
-              <w:t xml:space="preserve"> </w:t>
-            </w:r>
-            <w:r>
-              <w:rPr>
-                <w:rFonts w:asciiTheme="minorHAnsi" w:eastAsia="Times New Roman" w:hAnsiTheme="minorHAnsi" w:cstheme="minorHAnsi"/>
-                <w:b/>
-                <w:bCs/>
-                <w:i/>
-                <w:sz w:val="36"/>
-                <w:szCs w:val="36"/>
-              </w:rPr>
-              <w:t>I</w:t>
+            </w:pPr>
+            <w:r>
+              <w:rPr>
+                <w:rFonts w:asciiTheme="minorHAnsi" w:eastAsia="Times New Roman" w:hAnsiTheme="minorHAnsi" w:cstheme="minorHAnsi"/>
+                <w:iCs/>
+                <w:sz w:val="24"/>
+                <w:szCs w:val="24"/>
+                <w:lang w:val="id-ID"/>
+              </w:rPr>
+              <w:t>No</w:t>
+            </w:r>
+            <w:r>
+              <w:rPr>
+                <w:rFonts w:asciiTheme="minorHAnsi" w:eastAsia="Times New Roman" w:hAnsiTheme="minorHAnsi" w:cstheme="minorHAnsi"/>
+                <w:iCs/>
+                <w:sz w:val="24"/>
+                <w:szCs w:val="24"/>
+                <w:lang w:val="id-ID"/>
+              </w:rPr>
+              <w:t>.</w:t>
+            </w:r>
+            <w:r>
+              <w:rPr>
+                <w:rFonts w:asciiTheme="minorHAnsi" w:eastAsia="Times New Roman" w:hAnsiTheme="minorHAnsi" w:cstheme="minorHAnsi"/>
+                <w:iCs/>
+                <w:sz w:val="24"/>
+                <w:szCs w:val="24"/>
+                <w:lang w:val="id-ID"/>
+              </w:rPr>
+              <w:t xml:space="preserve"> {no_kuitansi}</w:t>
             </w:r>
           </w:p>
           <w:p>
@@ -12098,7 +9734,6 @@
                 <w:szCs w:val="22"/>
               </w:rPr>
             </w:pPr>
-            <w:proofErr w:type="spellStart"/>
             <w:r>
               <w:rPr>
                 <w:rFonts w:asciiTheme="minorHAnsi" w:eastAsia="Times New Roman" w:hAnsiTheme="minorHAnsi" w:cstheme="minorHAnsi"/>
@@ -12107,7 +9742,6 @@
               </w:rPr>
               <w:t>Barabai</w:t>
             </w:r>
-            <w:proofErr w:type="spellEnd"/>
             <w:r>
               <w:rPr>
                 <w:rFonts w:asciiTheme="minorHAnsi" w:eastAsia="Times New Roman" w:hAnsiTheme="minorHAnsi" w:cstheme="minorHAnsi"/>
@@ -12122,25 +9756,7 @@
                 <w:sz w:val="22"/>
                 <w:szCs w:val="22"/>
               </w:rPr>
-              <w:t>${</w:t>
-            </w:r>
-            <w:proofErr w:type="spellStart"/>
-            <w:r>
-              <w:rPr>
-                <w:rFonts w:asciiTheme="minorHAnsi" w:eastAsia="Times New Roman" w:hAnsiTheme="minorHAnsi" w:cstheme="minorHAnsi"/>
-                <w:sz w:val="22"/>
-                <w:szCs w:val="22"/>
-              </w:rPr>
-              <w:t>akhir</w:t>
-            </w:r>
-            <w:proofErr w:type="spellEnd"/>
-            <w:r>
-              <w:rPr>
-                <w:rFonts w:asciiTheme="minorHAnsi" w:eastAsia="Times New Roman" w:hAnsiTheme="minorHAnsi" w:cstheme="minorHAnsi"/>
-                <w:sz w:val="22"/>
-                <w:szCs w:val="22"/>
-              </w:rPr>
-              <w:t>}</w:t>
+              <w:t>${akhir}</w:t>
             </w:r>
           </w:p>
           <w:p>
@@ -12165,25 +9781,7 @@
                 <w:sz w:val="22"/>
                 <w:szCs w:val="22"/>
               </w:rPr>
-              <w:t>${</w:t>
-            </w:r>
-            <w:proofErr w:type="spellStart"/>
-            <w:r>
-              <w:rPr>
-                <w:rFonts w:asciiTheme="minorHAnsi" w:hAnsiTheme="minorHAnsi" w:cstheme="minorHAnsi"/>
-                <w:sz w:val="22"/>
-                <w:szCs w:val="22"/>
-              </w:rPr>
-              <w:t>penyedia</w:t>
-            </w:r>
-            <w:proofErr w:type="spellEnd"/>
-            <w:r>
-              <w:rPr>
-                <w:rFonts w:asciiTheme="minorHAnsi" w:hAnsiTheme="minorHAnsi" w:cstheme="minorHAnsi"/>
-                <w:sz w:val="22"/>
-                <w:szCs w:val="22"/>
-              </w:rPr>
-              <w:t>}</w:t>
+              <w:t>${penyedia}</w:t>
             </w:r>
           </w:p>
           <w:p>
@@ -12598,27 +10196,7 @@
                 <w:szCs w:val="22"/>
                 <w:u w:val="single"/>
               </w:rPr>
-              <w:t>${</w:t>
-            </w:r>
-            <w:proofErr w:type="spellStart"/>
-            <w:r>
-              <w:rPr>
-                <w:rFonts w:asciiTheme="minorHAnsi" w:hAnsiTheme="minorHAnsi" w:cstheme="minorHAnsi"/>
-                <w:sz w:val="22"/>
-                <w:szCs w:val="22"/>
-                <w:u w:val="single"/>
-              </w:rPr>
-              <w:t>penandatangan</w:t>
-            </w:r>
-            <w:proofErr w:type="spellEnd"/>
-            <w:r>
-              <w:rPr>
-                <w:rFonts w:asciiTheme="minorHAnsi" w:hAnsiTheme="minorHAnsi" w:cstheme="minorHAnsi"/>
-                <w:sz w:val="22"/>
-                <w:szCs w:val="22"/>
-                <w:u w:val="single"/>
-              </w:rPr>
-              <w:t>}</w:t>
+              <w:t>${penandatangan}</w:t>
             </w:r>
           </w:p>
           <w:p>
@@ -12682,97 +10260,15 @@
                 <w:szCs w:val="22"/>
               </w:rPr>
             </w:pPr>
-            <w:proofErr w:type="spellStart"/>
-            <w:r>
-              <w:rPr>
-                <w:rFonts w:asciiTheme="minorHAnsi" w:eastAsia="Times New Roman" w:hAnsiTheme="minorHAnsi" w:cstheme="minorHAnsi"/>
-                <w:color w:val="000000"/>
-                <w:sz w:val="22"/>
-                <w:szCs w:val="22"/>
-              </w:rPr>
-              <w:t>Setuju</w:t>
-            </w:r>
-            <w:proofErr w:type="spellEnd"/>
-            <w:r>
-              <w:rPr>
-                <w:rFonts w:asciiTheme="minorHAnsi" w:eastAsia="Times New Roman" w:hAnsiTheme="minorHAnsi" w:cstheme="minorHAnsi"/>
-                <w:color w:val="000000"/>
-                <w:sz w:val="22"/>
-                <w:szCs w:val="22"/>
-              </w:rPr>
-              <w:t xml:space="preserve"> </w:t>
-            </w:r>
-            <w:proofErr w:type="spellStart"/>
-            <w:r>
-              <w:rPr>
-                <w:rFonts w:asciiTheme="minorHAnsi" w:eastAsia="Times New Roman" w:hAnsiTheme="minorHAnsi" w:cstheme="minorHAnsi"/>
-                <w:color w:val="000000"/>
-                <w:sz w:val="22"/>
-                <w:szCs w:val="22"/>
-              </w:rPr>
-              <w:t>dibebankan</w:t>
-            </w:r>
-            <w:proofErr w:type="spellEnd"/>
-            <w:r>
-              <w:rPr>
-                <w:rFonts w:asciiTheme="minorHAnsi" w:eastAsia="Times New Roman" w:hAnsiTheme="minorHAnsi" w:cstheme="minorHAnsi"/>
-                <w:color w:val="000000"/>
-                <w:sz w:val="22"/>
-                <w:szCs w:val="22"/>
-              </w:rPr>
-              <w:t xml:space="preserve"> pada </w:t>
-            </w:r>
-            <w:proofErr w:type="spellStart"/>
-            <w:r>
-              <w:rPr>
-                <w:rFonts w:asciiTheme="minorHAnsi" w:eastAsia="Times New Roman" w:hAnsiTheme="minorHAnsi" w:cstheme="minorHAnsi"/>
-                <w:color w:val="000000"/>
-                <w:sz w:val="22"/>
-                <w:szCs w:val="22"/>
-              </w:rPr>
-              <w:t>mata</w:t>
-            </w:r>
-            <w:proofErr w:type="spellEnd"/>
-            <w:r>
-              <w:rPr>
-                <w:rFonts w:asciiTheme="minorHAnsi" w:eastAsia="Times New Roman" w:hAnsiTheme="minorHAnsi" w:cstheme="minorHAnsi"/>
-                <w:color w:val="000000"/>
-                <w:sz w:val="22"/>
-                <w:szCs w:val="22"/>
-              </w:rPr>
-              <w:t xml:space="preserve"> </w:t>
-            </w:r>
-            <w:proofErr w:type="spellStart"/>
-            <w:r>
-              <w:rPr>
-                <w:rFonts w:asciiTheme="minorHAnsi" w:eastAsia="Times New Roman" w:hAnsiTheme="minorHAnsi" w:cstheme="minorHAnsi"/>
-                <w:color w:val="000000"/>
-                <w:sz w:val="22"/>
-                <w:szCs w:val="22"/>
-              </w:rPr>
-              <w:t>anggaran</w:t>
-            </w:r>
-            <w:proofErr w:type="spellEnd"/>
-            <w:r>
-              <w:rPr>
-                <w:rFonts w:asciiTheme="minorHAnsi" w:eastAsia="Times New Roman" w:hAnsiTheme="minorHAnsi" w:cstheme="minorHAnsi"/>
-                <w:color w:val="000000"/>
-                <w:sz w:val="22"/>
-                <w:szCs w:val="22"/>
-              </w:rPr>
-              <w:t xml:space="preserve"> </w:t>
-            </w:r>
-            <w:proofErr w:type="spellStart"/>
-            <w:r>
-              <w:rPr>
-                <w:rFonts w:asciiTheme="minorHAnsi" w:eastAsia="Times New Roman" w:hAnsiTheme="minorHAnsi" w:cstheme="minorHAnsi"/>
-                <w:color w:val="000000"/>
-                <w:sz w:val="22"/>
-                <w:szCs w:val="22"/>
-              </w:rPr>
-              <w:t>berkenaan</w:t>
-            </w:r>
-            <w:proofErr w:type="spellEnd"/>
+            <w:r>
+              <w:rPr>
+                <w:rFonts w:asciiTheme="minorHAnsi" w:eastAsia="Times New Roman" w:hAnsiTheme="minorHAnsi" w:cstheme="minorHAnsi"/>
+                <w:color w:val="000000"/>
+                <w:sz w:val="22"/>
+                <w:szCs w:val="22"/>
+              </w:rPr>
+              <w:t>Setuju dibebankan pada mata anggaran berkenaan</w:t>
+            </w:r>
           </w:p>
         </w:tc>
         <w:tc>
@@ -12850,39 +10346,8 @@
                 <w:sz w:val="22"/>
                 <w:szCs w:val="22"/>
               </w:rPr>
-              <w:t xml:space="preserve">Lunas </w:t>
-            </w:r>
-            <w:proofErr w:type="spellStart"/>
-            <w:r>
-              <w:rPr>
-                <w:rFonts w:asciiTheme="minorHAnsi" w:eastAsia="Times New Roman" w:hAnsiTheme="minorHAnsi" w:cstheme="minorHAnsi"/>
-                <w:color w:val="000000"/>
-                <w:sz w:val="22"/>
-                <w:szCs w:val="22"/>
-              </w:rPr>
-              <w:t>dibayar</w:t>
-            </w:r>
-            <w:proofErr w:type="spellEnd"/>
-            <w:r>
-              <w:rPr>
-                <w:rFonts w:asciiTheme="minorHAnsi" w:eastAsia="Times New Roman" w:hAnsiTheme="minorHAnsi" w:cstheme="minorHAnsi"/>
-                <w:color w:val="000000"/>
-                <w:sz w:val="22"/>
-                <w:szCs w:val="22"/>
-              </w:rPr>
-              <w:t xml:space="preserve"> </w:t>
-            </w:r>
-            <w:proofErr w:type="spellStart"/>
-            <w:r>
-              <w:rPr>
-                <w:rFonts w:asciiTheme="minorHAnsi" w:eastAsia="Times New Roman" w:hAnsiTheme="minorHAnsi" w:cstheme="minorHAnsi"/>
-                <w:color w:val="000000"/>
-                <w:sz w:val="22"/>
-                <w:szCs w:val="22"/>
-              </w:rPr>
-              <w:t>tanggal</w:t>
-            </w:r>
-            <w:proofErr w:type="spellEnd"/>
+              <w:t>Lunas dibayar tanggal</w:t>
+            </w:r>
           </w:p>
         </w:tc>
       </w:tr>
@@ -12920,39 +10385,8 @@
                 <w:sz w:val="22"/>
                 <w:szCs w:val="22"/>
               </w:rPr>
-              <w:t xml:space="preserve">An. Kuasa </w:t>
-            </w:r>
-            <w:proofErr w:type="spellStart"/>
-            <w:r>
-              <w:rPr>
-                <w:rFonts w:asciiTheme="minorHAnsi" w:eastAsia="Times New Roman" w:hAnsiTheme="minorHAnsi" w:cstheme="minorHAnsi"/>
-                <w:color w:val="000000"/>
-                <w:sz w:val="22"/>
-                <w:szCs w:val="22"/>
-              </w:rPr>
-              <w:t>Pengguna</w:t>
-            </w:r>
-            <w:proofErr w:type="spellEnd"/>
-            <w:r>
-              <w:rPr>
-                <w:rFonts w:asciiTheme="minorHAnsi" w:eastAsia="Times New Roman" w:hAnsiTheme="minorHAnsi" w:cstheme="minorHAnsi"/>
-                <w:color w:val="000000"/>
-                <w:sz w:val="22"/>
-                <w:szCs w:val="22"/>
-              </w:rPr>
-              <w:t xml:space="preserve"> </w:t>
-            </w:r>
-            <w:proofErr w:type="spellStart"/>
-            <w:r>
-              <w:rPr>
-                <w:rFonts w:asciiTheme="minorHAnsi" w:eastAsia="Times New Roman" w:hAnsiTheme="minorHAnsi" w:cstheme="minorHAnsi"/>
-                <w:color w:val="000000"/>
-                <w:sz w:val="22"/>
-                <w:szCs w:val="22"/>
-              </w:rPr>
-              <w:t>Anggaran</w:t>
-            </w:r>
-            <w:proofErr w:type="spellEnd"/>
+              <w:t>An. Kuasa Pengguna Anggaran</w:t>
+            </w:r>
           </w:p>
         </w:tc>
         <w:tc>
@@ -13015,37 +10449,15 @@
                 <w:szCs w:val="22"/>
               </w:rPr>
             </w:pPr>
-            <w:proofErr w:type="spellStart"/>
-            <w:r>
-              <w:rPr>
-                <w:rFonts w:asciiTheme="minorHAnsi" w:eastAsia="Times New Roman" w:hAnsiTheme="minorHAnsi" w:cstheme="minorHAnsi"/>
-                <w:color w:val="000000"/>
-                <w:sz w:val="22"/>
-                <w:szCs w:val="22"/>
-              </w:rPr>
-              <w:t>Bendahara</w:t>
-            </w:r>
-            <w:proofErr w:type="spellEnd"/>
-            <w:r>
-              <w:rPr>
-                <w:rFonts w:asciiTheme="minorHAnsi" w:eastAsia="Times New Roman" w:hAnsiTheme="minorHAnsi" w:cstheme="minorHAnsi"/>
-                <w:color w:val="000000"/>
-                <w:sz w:val="22"/>
-                <w:szCs w:val="22"/>
-              </w:rPr>
-              <w:t xml:space="preserve"> </w:t>
-            </w:r>
-            <w:proofErr w:type="spellStart"/>
-            <w:r>
-              <w:rPr>
-                <w:rFonts w:asciiTheme="minorHAnsi" w:eastAsia="Times New Roman" w:hAnsiTheme="minorHAnsi" w:cstheme="minorHAnsi"/>
-                <w:color w:val="000000"/>
-                <w:sz w:val="22"/>
-                <w:szCs w:val="22"/>
-              </w:rPr>
-              <w:t>Pengeluaran</w:t>
-            </w:r>
-            <w:proofErr w:type="spellEnd"/>
+            <w:r>
+              <w:rPr>
+                <w:rFonts w:asciiTheme="minorHAnsi" w:eastAsia="Times New Roman" w:hAnsiTheme="minorHAnsi" w:cstheme="minorHAnsi"/>
+                <w:color w:val="000000"/>
+                <w:sz w:val="22"/>
+                <w:szCs w:val="22"/>
+              </w:rPr>
+              <w:t>Bendahara Pengeluaran</w:t>
+            </w:r>
           </w:p>
         </w:tc>
       </w:tr>
@@ -13810,29 +11222,7 @@
                 <w:szCs w:val="22"/>
                 <w:u w:val="single"/>
               </w:rPr>
-              <w:t>${</w:t>
-            </w:r>
-            <w:proofErr w:type="spellStart"/>
-            <w:r>
-              <w:rPr>
-                <w:rFonts w:asciiTheme="minorHAnsi" w:eastAsia="Times New Roman" w:hAnsiTheme="minorHAnsi" w:cstheme="minorHAnsi"/>
-                <w:color w:val="000000"/>
-                <w:sz w:val="22"/>
-                <w:szCs w:val="22"/>
-                <w:u w:val="single"/>
-              </w:rPr>
-              <w:t>bendahara</w:t>
-            </w:r>
-            <w:proofErr w:type="spellEnd"/>
-            <w:r>
-              <w:rPr>
-                <w:rFonts w:asciiTheme="minorHAnsi" w:eastAsia="Times New Roman" w:hAnsiTheme="minorHAnsi" w:cstheme="minorHAnsi"/>
-                <w:color w:val="000000"/>
-                <w:sz w:val="22"/>
-                <w:szCs w:val="22"/>
-                <w:u w:val="single"/>
-              </w:rPr>
-              <w:t>}</w:t>
+              <w:t>${bendahara}</w:t>
             </w:r>
           </w:p>
         </w:tc>
@@ -13950,27 +11340,7 @@
                 <w:sz w:val="22"/>
                 <w:szCs w:val="22"/>
               </w:rPr>
-              <w:t>${</w:t>
-            </w:r>
-            <w:proofErr w:type="spellStart"/>
-            <w:r>
-              <w:rPr>
-                <w:rFonts w:asciiTheme="minorHAnsi" w:eastAsia="Times New Roman" w:hAnsiTheme="minorHAnsi" w:cstheme="minorHAnsi"/>
-                <w:color w:val="000000"/>
-                <w:sz w:val="22"/>
-                <w:szCs w:val="22"/>
-              </w:rPr>
-              <w:t>nipbendahara</w:t>
-            </w:r>
-            <w:proofErr w:type="spellEnd"/>
-            <w:r>
-              <w:rPr>
-                <w:rFonts w:asciiTheme="minorHAnsi" w:eastAsia="Times New Roman" w:hAnsiTheme="minorHAnsi" w:cstheme="minorHAnsi"/>
-                <w:color w:val="000000"/>
-                <w:sz w:val="22"/>
-                <w:szCs w:val="22"/>
-              </w:rPr>
-              <w:t>}</w:t>
+              <w:t>${nipbendahara}</w:t>
             </w:r>
           </w:p>
         </w:tc>
@@ -14381,177 +11751,15 @@
                 <w:szCs w:val="22"/>
               </w:rPr>
             </w:pPr>
-            <w:proofErr w:type="spellStart"/>
-            <w:r>
-              <w:rPr>
-                <w:rFonts w:asciiTheme="minorHAnsi" w:eastAsia="Times New Roman" w:hAnsiTheme="minorHAnsi" w:cstheme="minorHAnsi"/>
-                <w:color w:val="000000"/>
-                <w:sz w:val="22"/>
-                <w:szCs w:val="22"/>
-              </w:rPr>
-              <w:t>Barang</w:t>
-            </w:r>
-            <w:proofErr w:type="spellEnd"/>
-            <w:r>
-              <w:rPr>
-                <w:rFonts w:asciiTheme="minorHAnsi" w:eastAsia="Times New Roman" w:hAnsiTheme="minorHAnsi" w:cstheme="minorHAnsi"/>
-                <w:color w:val="000000"/>
-                <w:sz w:val="22"/>
-                <w:szCs w:val="22"/>
-              </w:rPr>
-              <w:t>/</w:t>
-            </w:r>
-            <w:proofErr w:type="spellStart"/>
-            <w:r>
-              <w:rPr>
-                <w:rFonts w:asciiTheme="minorHAnsi" w:eastAsia="Times New Roman" w:hAnsiTheme="minorHAnsi" w:cstheme="minorHAnsi"/>
-                <w:color w:val="000000"/>
-                <w:sz w:val="22"/>
-                <w:szCs w:val="22"/>
-              </w:rPr>
-              <w:t>pekerjaan</w:t>
-            </w:r>
-            <w:proofErr w:type="spellEnd"/>
-            <w:r>
-              <w:rPr>
-                <w:rFonts w:asciiTheme="minorHAnsi" w:eastAsia="Times New Roman" w:hAnsiTheme="minorHAnsi" w:cstheme="minorHAnsi"/>
-                <w:color w:val="000000"/>
-                <w:sz w:val="22"/>
-                <w:szCs w:val="22"/>
-              </w:rPr>
-              <w:t xml:space="preserve"> </w:t>
-            </w:r>
-            <w:proofErr w:type="spellStart"/>
-            <w:r>
-              <w:rPr>
-                <w:rFonts w:asciiTheme="minorHAnsi" w:eastAsia="Times New Roman" w:hAnsiTheme="minorHAnsi" w:cstheme="minorHAnsi"/>
-                <w:color w:val="000000"/>
-                <w:sz w:val="22"/>
-                <w:szCs w:val="22"/>
-              </w:rPr>
-              <w:t>tersebut</w:t>
-            </w:r>
-            <w:proofErr w:type="spellEnd"/>
-            <w:r>
-              <w:rPr>
-                <w:rFonts w:asciiTheme="minorHAnsi" w:eastAsia="Times New Roman" w:hAnsiTheme="minorHAnsi" w:cstheme="minorHAnsi"/>
-                <w:color w:val="000000"/>
-                <w:sz w:val="22"/>
-                <w:szCs w:val="22"/>
-              </w:rPr>
-              <w:t xml:space="preserve"> </w:t>
-            </w:r>
-            <w:proofErr w:type="spellStart"/>
-            <w:r>
-              <w:rPr>
-                <w:rFonts w:asciiTheme="minorHAnsi" w:eastAsia="Times New Roman" w:hAnsiTheme="minorHAnsi" w:cstheme="minorHAnsi"/>
-                <w:color w:val="000000"/>
-                <w:sz w:val="22"/>
-                <w:szCs w:val="22"/>
-              </w:rPr>
-              <w:t>telah</w:t>
-            </w:r>
-            <w:proofErr w:type="spellEnd"/>
-            <w:r>
-              <w:rPr>
-                <w:rFonts w:asciiTheme="minorHAnsi" w:eastAsia="Times New Roman" w:hAnsiTheme="minorHAnsi" w:cstheme="minorHAnsi"/>
-                <w:color w:val="000000"/>
-                <w:sz w:val="22"/>
-                <w:szCs w:val="22"/>
-              </w:rPr>
-              <w:t xml:space="preserve"> </w:t>
-            </w:r>
-            <w:proofErr w:type="spellStart"/>
-            <w:r>
-              <w:rPr>
-                <w:rFonts w:asciiTheme="minorHAnsi" w:eastAsia="Times New Roman" w:hAnsiTheme="minorHAnsi" w:cstheme="minorHAnsi"/>
-                <w:color w:val="000000"/>
-                <w:sz w:val="22"/>
-                <w:szCs w:val="22"/>
-              </w:rPr>
-              <w:t>diterima</w:t>
-            </w:r>
-            <w:proofErr w:type="spellEnd"/>
-            <w:r>
-              <w:rPr>
-                <w:rFonts w:asciiTheme="minorHAnsi" w:eastAsia="Times New Roman" w:hAnsiTheme="minorHAnsi" w:cstheme="minorHAnsi"/>
-                <w:color w:val="000000"/>
-                <w:sz w:val="22"/>
-                <w:szCs w:val="22"/>
-              </w:rPr>
-              <w:t xml:space="preserve">/ </w:t>
-            </w:r>
-            <w:proofErr w:type="spellStart"/>
-            <w:r>
-              <w:rPr>
-                <w:rFonts w:asciiTheme="minorHAnsi" w:eastAsia="Times New Roman" w:hAnsiTheme="minorHAnsi" w:cstheme="minorHAnsi"/>
-                <w:color w:val="000000"/>
-                <w:sz w:val="22"/>
-                <w:szCs w:val="22"/>
-              </w:rPr>
-              <w:t>diselesaikan</w:t>
-            </w:r>
-            <w:proofErr w:type="spellEnd"/>
-            <w:r>
-              <w:rPr>
-                <w:rFonts w:asciiTheme="minorHAnsi" w:eastAsia="Times New Roman" w:hAnsiTheme="minorHAnsi" w:cstheme="minorHAnsi"/>
-                <w:color w:val="000000"/>
-                <w:sz w:val="22"/>
-                <w:szCs w:val="22"/>
-              </w:rPr>
-              <w:t xml:space="preserve"> </w:t>
-            </w:r>
-            <w:proofErr w:type="spellStart"/>
-            <w:r>
-              <w:rPr>
-                <w:rFonts w:asciiTheme="minorHAnsi" w:eastAsia="Times New Roman" w:hAnsiTheme="minorHAnsi" w:cstheme="minorHAnsi"/>
-                <w:color w:val="000000"/>
-                <w:sz w:val="22"/>
-                <w:szCs w:val="22"/>
-              </w:rPr>
-              <w:t>dengan</w:t>
-            </w:r>
-            <w:proofErr w:type="spellEnd"/>
-            <w:r>
-              <w:rPr>
-                <w:rFonts w:asciiTheme="minorHAnsi" w:eastAsia="Times New Roman" w:hAnsiTheme="minorHAnsi" w:cstheme="minorHAnsi"/>
-                <w:color w:val="000000"/>
-                <w:sz w:val="22"/>
-                <w:szCs w:val="22"/>
-              </w:rPr>
-              <w:t xml:space="preserve"> </w:t>
-            </w:r>
-            <w:proofErr w:type="spellStart"/>
-            <w:r>
-              <w:rPr>
-                <w:rFonts w:asciiTheme="minorHAnsi" w:eastAsia="Times New Roman" w:hAnsiTheme="minorHAnsi" w:cstheme="minorHAnsi"/>
-                <w:color w:val="000000"/>
-                <w:sz w:val="22"/>
-                <w:szCs w:val="22"/>
-              </w:rPr>
-              <w:t>lengkap</w:t>
-            </w:r>
-            <w:proofErr w:type="spellEnd"/>
-            <w:r>
-              <w:rPr>
-                <w:rFonts w:asciiTheme="minorHAnsi" w:eastAsia="Times New Roman" w:hAnsiTheme="minorHAnsi" w:cstheme="minorHAnsi"/>
-                <w:color w:val="000000"/>
-                <w:sz w:val="22"/>
-                <w:szCs w:val="22"/>
-              </w:rPr>
-              <w:t xml:space="preserve"> dan </w:t>
-            </w:r>
-            <w:proofErr w:type="spellStart"/>
-            <w:r>
-              <w:rPr>
-                <w:rFonts w:asciiTheme="minorHAnsi" w:eastAsia="Times New Roman" w:hAnsiTheme="minorHAnsi" w:cstheme="minorHAnsi"/>
-                <w:color w:val="000000"/>
-                <w:sz w:val="22"/>
-                <w:szCs w:val="22"/>
-              </w:rPr>
-              <w:t>baik</w:t>
-            </w:r>
-            <w:proofErr w:type="spellEnd"/>
+            <w:r>
+              <w:rPr>
+                <w:rFonts w:asciiTheme="minorHAnsi" w:eastAsia="Times New Roman" w:hAnsiTheme="minorHAnsi" w:cstheme="minorHAnsi"/>
+                <w:color w:val="000000"/>
+                <w:sz w:val="22"/>
+                <w:szCs w:val="22"/>
+              </w:rPr>
+              <w:t>Barang/pekerjaan tersebut telah diterima/ diselesaikan dengan lengkap dan baik</w:t>
+            </w:r>
             <w:r>
               <w:rPr>
                 <w:rFonts w:asciiTheme="minorHAnsi" w:eastAsia="Times New Roman" w:hAnsiTheme="minorHAnsi" w:cstheme="minorHAnsi"/>
@@ -14582,57 +11790,15 @@
                 <w:szCs w:val="22"/>
               </w:rPr>
             </w:pPr>
-            <w:proofErr w:type="spellStart"/>
-            <w:r>
-              <w:rPr>
-                <w:rFonts w:asciiTheme="minorHAnsi" w:eastAsia="Times New Roman" w:hAnsiTheme="minorHAnsi" w:cstheme="minorHAnsi"/>
-                <w:color w:val="000000"/>
-                <w:sz w:val="22"/>
-                <w:szCs w:val="22"/>
-              </w:rPr>
-              <w:t>Pejabat</w:t>
-            </w:r>
-            <w:proofErr w:type="spellEnd"/>
-            <w:r>
-              <w:rPr>
-                <w:rFonts w:asciiTheme="minorHAnsi" w:eastAsia="Times New Roman" w:hAnsiTheme="minorHAnsi" w:cstheme="minorHAnsi"/>
-                <w:color w:val="000000"/>
-                <w:sz w:val="22"/>
-                <w:szCs w:val="22"/>
-              </w:rPr>
-              <w:t xml:space="preserve"> yang </w:t>
-            </w:r>
-            <w:proofErr w:type="spellStart"/>
-            <w:r>
-              <w:rPr>
-                <w:rFonts w:asciiTheme="minorHAnsi" w:eastAsia="Times New Roman" w:hAnsiTheme="minorHAnsi" w:cstheme="minorHAnsi"/>
-                <w:color w:val="000000"/>
-                <w:sz w:val="22"/>
-                <w:szCs w:val="22"/>
-              </w:rPr>
-              <w:t>bertanggung</w:t>
-            </w:r>
-            <w:proofErr w:type="spellEnd"/>
-            <w:r>
-              <w:rPr>
-                <w:rFonts w:asciiTheme="minorHAnsi" w:eastAsia="Times New Roman" w:hAnsiTheme="minorHAnsi" w:cstheme="minorHAnsi"/>
-                <w:color w:val="000000"/>
-                <w:sz w:val="22"/>
-                <w:szCs w:val="22"/>
-              </w:rPr>
-              <w:t xml:space="preserve"> </w:t>
-            </w:r>
-            <w:proofErr w:type="spellStart"/>
-            <w:r>
-              <w:rPr>
-                <w:rFonts w:asciiTheme="minorHAnsi" w:eastAsia="Times New Roman" w:hAnsiTheme="minorHAnsi" w:cstheme="minorHAnsi"/>
-                <w:color w:val="000000"/>
-                <w:sz w:val="22"/>
-                <w:szCs w:val="22"/>
-              </w:rPr>
-              <w:t>jawab</w:t>
-            </w:r>
-            <w:proofErr w:type="spellEnd"/>
+            <w:r>
+              <w:rPr>
+                <w:rFonts w:asciiTheme="minorHAnsi" w:eastAsia="Times New Roman" w:hAnsiTheme="minorHAnsi" w:cstheme="minorHAnsi"/>
+                <w:color w:val="000000"/>
+                <w:sz w:val="22"/>
+                <w:szCs w:val="22"/>
+              </w:rPr>
+              <w:t>Pejabat yang bertanggung jawab</w:t>
+            </w:r>
             <w:r>
               <w:rPr>
                 <w:rFonts w:asciiTheme="minorHAnsi" w:eastAsia="Times New Roman" w:hAnsiTheme="minorHAnsi" w:cstheme="minorHAnsi"/>
@@ -15127,29 +12293,7 @@
                 <w:szCs w:val="22"/>
                 <w:u w:val="single"/>
               </w:rPr>
-              <w:t>${</w:t>
-            </w:r>
-            <w:proofErr w:type="spellStart"/>
-            <w:r>
-              <w:rPr>
-                <w:rFonts w:asciiTheme="minorHAnsi" w:eastAsia="Times New Roman" w:hAnsiTheme="minorHAnsi" w:cstheme="minorHAnsi"/>
-                <w:color w:val="000000"/>
-                <w:sz w:val="22"/>
-                <w:szCs w:val="22"/>
-                <w:u w:val="single"/>
-              </w:rPr>
-              <w:t>ppk</w:t>
-            </w:r>
-            <w:proofErr w:type="spellEnd"/>
-            <w:r>
-              <w:rPr>
-                <w:rFonts w:asciiTheme="minorHAnsi" w:eastAsia="Times New Roman" w:hAnsiTheme="minorHAnsi" w:cstheme="minorHAnsi"/>
-                <w:color w:val="000000"/>
-                <w:sz w:val="22"/>
-                <w:szCs w:val="22"/>
-                <w:u w:val="single"/>
-              </w:rPr>
-              <w:t>}</w:t>
+              <w:t>${ppk}</w:t>
             </w:r>
           </w:p>
           <w:p>
@@ -15180,27 +12324,7 @@
                 <w:sz w:val="22"/>
                 <w:szCs w:val="22"/>
               </w:rPr>
-              <w:t>${</w:t>
-            </w:r>
-            <w:proofErr w:type="spellStart"/>
-            <w:r>
-              <w:rPr>
-                <w:rFonts w:asciiTheme="minorHAnsi" w:eastAsia="Times New Roman" w:hAnsiTheme="minorHAnsi" w:cstheme="minorHAnsi"/>
-                <w:color w:val="000000"/>
-                <w:sz w:val="22"/>
-                <w:szCs w:val="22"/>
-              </w:rPr>
-              <w:t>nipppk</w:t>
-            </w:r>
-            <w:proofErr w:type="spellEnd"/>
-            <w:r>
-              <w:rPr>
-                <w:rFonts w:asciiTheme="minorHAnsi" w:eastAsia="Times New Roman" w:hAnsiTheme="minorHAnsi" w:cstheme="minorHAnsi"/>
-                <w:color w:val="000000"/>
-                <w:sz w:val="22"/>
-                <w:szCs w:val="22"/>
-              </w:rPr>
-              <w:t>}</w:t>
+              <w:t>${nipppk}</w:t>
             </w:r>
           </w:p>
         </w:tc>
@@ -15267,55 +12391,7 @@
         <w:rFonts w:ascii="Times New Roman" w:hAnsi="Times New Roman"/>
         <w:color w:val="404040" w:themeColor="text1" w:themeTint="BF"/>
       </w:rPr>
-      <w:t xml:space="preserve">Jl. </w:t>
-    </w:r>
-    <w:proofErr w:type="spellStart"/>
-    <w:r>
-      <w:rPr>
-        <w:rFonts w:ascii="Times New Roman" w:hAnsi="Times New Roman"/>
-        <w:color w:val="404040" w:themeColor="text1" w:themeTint="BF"/>
-      </w:rPr>
-      <w:t>Keramat</w:t>
-    </w:r>
-    <w:proofErr w:type="spellEnd"/>
-    <w:r>
-      <w:rPr>
-        <w:rFonts w:ascii="Times New Roman" w:hAnsi="Times New Roman"/>
-        <w:color w:val="404040" w:themeColor="text1" w:themeTint="BF"/>
-      </w:rPr>
-      <w:t xml:space="preserve"> </w:t>
-    </w:r>
-    <w:proofErr w:type="spellStart"/>
-    <w:r>
-      <w:rPr>
-        <w:rFonts w:ascii="Times New Roman" w:hAnsi="Times New Roman"/>
-        <w:color w:val="404040" w:themeColor="text1" w:themeTint="BF"/>
-      </w:rPr>
-      <w:t>Manjang</w:t>
-    </w:r>
-    <w:proofErr w:type="spellEnd"/>
-    <w:r>
-      <w:rPr>
-        <w:rFonts w:ascii="Times New Roman" w:hAnsi="Times New Roman"/>
-        <w:color w:val="404040" w:themeColor="text1" w:themeTint="BF"/>
-      </w:rPr>
-      <w:t xml:space="preserve"> No 10, </w:t>
-    </w:r>
-    <w:proofErr w:type="spellStart"/>
-    <w:r>
-      <w:rPr>
-        <w:rFonts w:ascii="Times New Roman" w:hAnsi="Times New Roman"/>
-        <w:color w:val="404040" w:themeColor="text1" w:themeTint="BF"/>
-      </w:rPr>
-      <w:t>Barabai</w:t>
-    </w:r>
-    <w:proofErr w:type="spellEnd"/>
-    <w:r>
-      <w:rPr>
-        <w:rFonts w:ascii="Times New Roman" w:hAnsi="Times New Roman"/>
-        <w:color w:val="404040" w:themeColor="text1" w:themeTint="BF"/>
-      </w:rPr>
-      <w:t xml:space="preserve"> 71313</w:t>
+      <w:t>Jl. Keramat Manjang No 10, Barabai 71313</w:t>
     </w:r>
     <w:r>
       <w:rPr>

</xml_diff>